<commit_message>
hopefully final editation of code plus completed test description in documentation
</commit_message>
<xml_diff>
--- a/dsa 6 dokumentacia.docx
+++ b/dsa 6 dokumentacia.docx
@@ -586,13 +586,14 @@
       <w:tblPr>
         <w:tblW w:w="9026" w:type="dxa"/>
         <w:tblBorders>
-          <w:top w:val="single" w:sz="4" w:space="0" w:color="auto"/>
-          <w:left w:val="single" w:sz="4" w:space="0" w:color="auto"/>
-          <w:bottom w:val="single" w:sz="4" w:space="0" w:color="auto"/>
-          <w:right w:val="single" w:sz="4" w:space="0" w:color="auto"/>
-          <w:insideH w:val="single" w:sz="4" w:space="0" w:color="auto"/>
-          <w:insideV w:val="single" w:sz="4" w:space="0" w:color="auto"/>
+          <w:top w:val="single" w:sz="6" w:space="0" w:color="BFBFBF" w:themeColor="background1" w:themeShade="BF"/>
+          <w:left w:val="single" w:sz="6" w:space="0" w:color="BFBFBF" w:themeColor="background1" w:themeShade="BF"/>
+          <w:bottom w:val="single" w:sz="6" w:space="0" w:color="BFBFBF" w:themeColor="background1" w:themeShade="BF"/>
+          <w:right w:val="single" w:sz="6" w:space="0" w:color="BFBFBF" w:themeColor="background1" w:themeShade="BF"/>
+          <w:insideH w:val="single" w:sz="6" w:space="0" w:color="BFBFBF" w:themeColor="background1" w:themeShade="BF"/>
+          <w:insideV w:val="single" w:sz="6" w:space="0" w:color="BFBFBF" w:themeColor="background1" w:themeShade="BF"/>
         </w:tblBorders>
+        <w:shd w:val="clear" w:color="auto" w:fill="F4F4F4"/>
         <w:tblCellMar>
           <w:left w:w="10" w:type="dxa"/>
           <w:right w:w="10" w:type="dxa"/>
@@ -606,12 +607,6 @@
         <w:tc>
           <w:tcPr>
             <w:tcW w:w="9026" w:type="dxa"/>
-            <w:tcBorders>
-              <w:top w:val="single" w:sz="1" w:space="0" w:color="AAAAAA"/>
-              <w:left w:val="single" w:sz="1" w:space="0" w:color="AAAAAA"/>
-              <w:bottom w:val="single" w:sz="1" w:space="0" w:color="AAAAAA"/>
-              <w:right w:val="single" w:sz="1" w:space="0" w:color="AAAAAA"/>
-            </w:tcBorders>
             <w:shd w:val="clear" w:color="auto" w:fill="F4F4F4"/>
             <w:tcMar>
               <w:top w:w="120" w:type="dxa"/>
@@ -1337,13 +1332,14 @@
       <w:tblPr>
         <w:tblW w:w="9026" w:type="dxa"/>
         <w:tblBorders>
-          <w:top w:val="single" w:sz="4" w:space="0" w:color="auto"/>
-          <w:left w:val="single" w:sz="4" w:space="0" w:color="auto"/>
-          <w:bottom w:val="single" w:sz="4" w:space="0" w:color="auto"/>
-          <w:right w:val="single" w:sz="4" w:space="0" w:color="auto"/>
-          <w:insideH w:val="single" w:sz="4" w:space="0" w:color="auto"/>
-          <w:insideV w:val="single" w:sz="4" w:space="0" w:color="auto"/>
+          <w:top w:val="single" w:sz="6" w:space="0" w:color="BFBFBF" w:themeColor="background1" w:themeShade="BF"/>
+          <w:left w:val="single" w:sz="6" w:space="0" w:color="BFBFBF" w:themeColor="background1" w:themeShade="BF"/>
+          <w:bottom w:val="single" w:sz="6" w:space="0" w:color="BFBFBF" w:themeColor="background1" w:themeShade="BF"/>
+          <w:right w:val="single" w:sz="6" w:space="0" w:color="BFBFBF" w:themeColor="background1" w:themeShade="BF"/>
+          <w:insideH w:val="single" w:sz="6" w:space="0" w:color="BFBFBF" w:themeColor="background1" w:themeShade="BF"/>
+          <w:insideV w:val="single" w:sz="6" w:space="0" w:color="BFBFBF" w:themeColor="background1" w:themeShade="BF"/>
         </w:tblBorders>
+        <w:shd w:val="clear" w:color="auto" w:fill="F4F4F4"/>
         <w:tblCellMar>
           <w:left w:w="10" w:type="dxa"/>
           <w:right w:w="10" w:type="dxa"/>
@@ -1357,12 +1353,6 @@
         <w:tc>
           <w:tcPr>
             <w:tcW w:w="9026" w:type="dxa"/>
-            <w:tcBorders>
-              <w:top w:val="single" w:sz="1" w:space="0" w:color="AAAAAA"/>
-              <w:left w:val="single" w:sz="1" w:space="0" w:color="AAAAAA"/>
-              <w:bottom w:val="single" w:sz="1" w:space="0" w:color="AAAAAA"/>
-              <w:right w:val="single" w:sz="1" w:space="0" w:color="AAAAAA"/>
-            </w:tcBorders>
             <w:shd w:val="clear" w:color="auto" w:fill="F4F4F4"/>
             <w:tcMar>
               <w:top w:w="120" w:type="dxa"/>
@@ -2243,13 +2233,14 @@
       <w:tblPr>
         <w:tblW w:w="9026" w:type="dxa"/>
         <w:tblBorders>
-          <w:top w:val="single" w:sz="4" w:space="0" w:color="auto"/>
-          <w:left w:val="single" w:sz="4" w:space="0" w:color="auto"/>
-          <w:bottom w:val="single" w:sz="4" w:space="0" w:color="auto"/>
-          <w:right w:val="single" w:sz="4" w:space="0" w:color="auto"/>
-          <w:insideH w:val="single" w:sz="4" w:space="0" w:color="auto"/>
-          <w:insideV w:val="single" w:sz="4" w:space="0" w:color="auto"/>
+          <w:top w:val="single" w:sz="6" w:space="0" w:color="BFBFBF" w:themeColor="background1" w:themeShade="BF"/>
+          <w:left w:val="single" w:sz="6" w:space="0" w:color="BFBFBF" w:themeColor="background1" w:themeShade="BF"/>
+          <w:bottom w:val="single" w:sz="6" w:space="0" w:color="BFBFBF" w:themeColor="background1" w:themeShade="BF"/>
+          <w:right w:val="single" w:sz="6" w:space="0" w:color="BFBFBF" w:themeColor="background1" w:themeShade="BF"/>
+          <w:insideH w:val="single" w:sz="6" w:space="0" w:color="BFBFBF" w:themeColor="background1" w:themeShade="BF"/>
+          <w:insideV w:val="single" w:sz="6" w:space="0" w:color="BFBFBF" w:themeColor="background1" w:themeShade="BF"/>
         </w:tblBorders>
+        <w:shd w:val="clear" w:color="auto" w:fill="F4F4F4"/>
         <w:tblCellMar>
           <w:left w:w="10" w:type="dxa"/>
           <w:right w:w="10" w:type="dxa"/>
@@ -2263,12 +2254,6 @@
         <w:tc>
           <w:tcPr>
             <w:tcW w:w="9026" w:type="dxa"/>
-            <w:tcBorders>
-              <w:top w:val="single" w:sz="1" w:space="0" w:color="AAAAAA"/>
-              <w:left w:val="single" w:sz="1" w:space="0" w:color="AAAAAA"/>
-              <w:bottom w:val="single" w:sz="1" w:space="0" w:color="AAAAAA"/>
-              <w:right w:val="single" w:sz="1" w:space="0" w:color="AAAAAA"/>
-            </w:tcBorders>
             <w:shd w:val="clear" w:color="auto" w:fill="F4F4F4"/>
             <w:tcMar>
               <w:top w:w="120" w:type="dxa"/>
@@ -2923,13 +2908,14 @@
       <w:tblPr>
         <w:tblW w:w="9026" w:type="dxa"/>
         <w:tblBorders>
-          <w:top w:val="single" w:sz="4" w:space="0" w:color="auto"/>
-          <w:left w:val="single" w:sz="4" w:space="0" w:color="auto"/>
-          <w:bottom w:val="single" w:sz="4" w:space="0" w:color="auto"/>
-          <w:right w:val="single" w:sz="4" w:space="0" w:color="auto"/>
-          <w:insideH w:val="single" w:sz="4" w:space="0" w:color="auto"/>
-          <w:insideV w:val="single" w:sz="4" w:space="0" w:color="auto"/>
+          <w:top w:val="single" w:sz="6" w:space="0" w:color="BFBFBF" w:themeColor="background1" w:themeShade="BF"/>
+          <w:left w:val="single" w:sz="6" w:space="0" w:color="BFBFBF" w:themeColor="background1" w:themeShade="BF"/>
+          <w:bottom w:val="single" w:sz="6" w:space="0" w:color="BFBFBF" w:themeColor="background1" w:themeShade="BF"/>
+          <w:right w:val="single" w:sz="6" w:space="0" w:color="BFBFBF" w:themeColor="background1" w:themeShade="BF"/>
+          <w:insideH w:val="single" w:sz="6" w:space="0" w:color="BFBFBF" w:themeColor="background1" w:themeShade="BF"/>
+          <w:insideV w:val="single" w:sz="6" w:space="0" w:color="BFBFBF" w:themeColor="background1" w:themeShade="BF"/>
         </w:tblBorders>
+        <w:shd w:val="clear" w:color="auto" w:fill="F4F4F4"/>
         <w:tblCellMar>
           <w:left w:w="10" w:type="dxa"/>
           <w:right w:w="10" w:type="dxa"/>
@@ -2943,12 +2929,6 @@
         <w:tc>
           <w:tcPr>
             <w:tcW w:w="9026" w:type="dxa"/>
-            <w:tcBorders>
-              <w:top w:val="single" w:sz="1" w:space="0" w:color="AAAAAA"/>
-              <w:left w:val="single" w:sz="1" w:space="0" w:color="AAAAAA"/>
-              <w:bottom w:val="single" w:sz="1" w:space="0" w:color="AAAAAA"/>
-              <w:right w:val="single" w:sz="1" w:space="0" w:color="AAAAAA"/>
-            </w:tcBorders>
             <w:shd w:val="clear" w:color="auto" w:fill="F4F4F4"/>
             <w:tcMar>
               <w:top w:w="120" w:type="dxa"/>
@@ -4773,13 +4753,14 @@
       <w:tblPr>
         <w:tblW w:w="9026" w:type="dxa"/>
         <w:tblBorders>
-          <w:top w:val="single" w:sz="4" w:space="0" w:color="auto"/>
-          <w:left w:val="single" w:sz="4" w:space="0" w:color="auto"/>
-          <w:bottom w:val="single" w:sz="4" w:space="0" w:color="auto"/>
-          <w:right w:val="single" w:sz="4" w:space="0" w:color="auto"/>
-          <w:insideH w:val="single" w:sz="4" w:space="0" w:color="auto"/>
-          <w:insideV w:val="single" w:sz="4" w:space="0" w:color="auto"/>
+          <w:top w:val="single" w:sz="6" w:space="0" w:color="BFBFBF" w:themeColor="background1" w:themeShade="BF"/>
+          <w:left w:val="single" w:sz="6" w:space="0" w:color="BFBFBF" w:themeColor="background1" w:themeShade="BF"/>
+          <w:bottom w:val="single" w:sz="6" w:space="0" w:color="BFBFBF" w:themeColor="background1" w:themeShade="BF"/>
+          <w:right w:val="single" w:sz="6" w:space="0" w:color="BFBFBF" w:themeColor="background1" w:themeShade="BF"/>
+          <w:insideH w:val="single" w:sz="6" w:space="0" w:color="BFBFBF" w:themeColor="background1" w:themeShade="BF"/>
+          <w:insideV w:val="single" w:sz="6" w:space="0" w:color="BFBFBF" w:themeColor="background1" w:themeShade="BF"/>
         </w:tblBorders>
+        <w:shd w:val="clear" w:color="auto" w:fill="F4F4F4"/>
         <w:tblCellMar>
           <w:left w:w="10" w:type="dxa"/>
           <w:right w:w="10" w:type="dxa"/>
@@ -4793,12 +4774,6 @@
         <w:tc>
           <w:tcPr>
             <w:tcW w:w="9026" w:type="dxa"/>
-            <w:tcBorders>
-              <w:top w:val="single" w:sz="1" w:space="0" w:color="AAAAAA"/>
-              <w:left w:val="single" w:sz="1" w:space="0" w:color="AAAAAA"/>
-              <w:bottom w:val="single" w:sz="1" w:space="0" w:color="AAAAAA"/>
-              <w:right w:val="single" w:sz="1" w:space="0" w:color="AAAAAA"/>
-            </w:tcBorders>
             <w:shd w:val="clear" w:color="auto" w:fill="F4F4F4"/>
             <w:tcMar>
               <w:top w:w="120" w:type="dxa"/>
@@ -5178,13 +5153,14 @@
       <w:tblPr>
         <w:tblW w:w="9026" w:type="dxa"/>
         <w:tblBorders>
-          <w:top w:val="single" w:sz="4" w:space="0" w:color="auto"/>
-          <w:left w:val="single" w:sz="4" w:space="0" w:color="auto"/>
-          <w:bottom w:val="single" w:sz="4" w:space="0" w:color="auto"/>
-          <w:right w:val="single" w:sz="4" w:space="0" w:color="auto"/>
-          <w:insideH w:val="single" w:sz="4" w:space="0" w:color="auto"/>
-          <w:insideV w:val="single" w:sz="4" w:space="0" w:color="auto"/>
+          <w:top w:val="single" w:sz="6" w:space="0" w:color="BFBFBF" w:themeColor="background1" w:themeShade="BF"/>
+          <w:left w:val="single" w:sz="6" w:space="0" w:color="BFBFBF" w:themeColor="background1" w:themeShade="BF"/>
+          <w:bottom w:val="single" w:sz="6" w:space="0" w:color="BFBFBF" w:themeColor="background1" w:themeShade="BF"/>
+          <w:right w:val="single" w:sz="6" w:space="0" w:color="BFBFBF" w:themeColor="background1" w:themeShade="BF"/>
+          <w:insideH w:val="single" w:sz="6" w:space="0" w:color="BFBFBF" w:themeColor="background1" w:themeShade="BF"/>
+          <w:insideV w:val="single" w:sz="6" w:space="0" w:color="BFBFBF" w:themeColor="background1" w:themeShade="BF"/>
         </w:tblBorders>
+        <w:shd w:val="clear" w:color="auto" w:fill="F4F4F4"/>
         <w:tblCellMar>
           <w:left w:w="10" w:type="dxa"/>
           <w:right w:w="10" w:type="dxa"/>
@@ -5198,12 +5174,6 @@
         <w:tc>
           <w:tcPr>
             <w:tcW w:w="9026" w:type="dxa"/>
-            <w:tcBorders>
-              <w:top w:val="single" w:sz="1" w:space="0" w:color="AAAAAA"/>
-              <w:left w:val="single" w:sz="1" w:space="0" w:color="AAAAAA"/>
-              <w:bottom w:val="single" w:sz="1" w:space="0" w:color="AAAAAA"/>
-              <w:right w:val="single" w:sz="1" w:space="0" w:color="AAAAAA"/>
-            </w:tcBorders>
             <w:shd w:val="clear" w:color="auto" w:fill="F4F4F4"/>
             <w:tcMar>
               <w:top w:w="120" w:type="dxa"/>
@@ -6571,12 +6541,12 @@
       <w:tblPr>
         <w:tblW w:w="9026" w:type="dxa"/>
         <w:tblBorders>
-          <w:top w:val="single" w:sz="4" w:space="0" w:color="auto"/>
-          <w:left w:val="single" w:sz="4" w:space="0" w:color="auto"/>
-          <w:bottom w:val="single" w:sz="4" w:space="0" w:color="auto"/>
-          <w:right w:val="single" w:sz="4" w:space="0" w:color="auto"/>
-          <w:insideH w:val="single" w:sz="4" w:space="0" w:color="auto"/>
-          <w:insideV w:val="single" w:sz="4" w:space="0" w:color="auto"/>
+          <w:top w:val="single" w:sz="6" w:space="0" w:color="BFBFBF" w:themeColor="background1" w:themeShade="BF"/>
+          <w:left w:val="single" w:sz="6" w:space="0" w:color="BFBFBF" w:themeColor="background1" w:themeShade="BF"/>
+          <w:bottom w:val="single" w:sz="6" w:space="0" w:color="BFBFBF" w:themeColor="background1" w:themeShade="BF"/>
+          <w:right w:val="single" w:sz="6" w:space="0" w:color="BFBFBF" w:themeColor="background1" w:themeShade="BF"/>
+          <w:insideH w:val="single" w:sz="12" w:space="0" w:color="BFBFBF" w:themeColor="background1" w:themeShade="BF"/>
+          <w:insideV w:val="single" w:sz="12" w:space="0" w:color="BFBFBF" w:themeColor="background1" w:themeShade="BF"/>
         </w:tblBorders>
         <w:tblCellMar>
           <w:left w:w="10" w:type="dxa"/>
@@ -6592,12 +6562,6 @@
         <w:tc>
           <w:tcPr>
             <w:tcW w:w="2500" w:type="dxa"/>
-            <w:tcBorders>
-              <w:top w:val="single" w:sz="1" w:space="0" w:color="2E75B6"/>
-              <w:left w:val="single" w:sz="1" w:space="0" w:color="2E75B6"/>
-              <w:bottom w:val="single" w:sz="1" w:space="0" w:color="2E75B6"/>
-              <w:right w:val="single" w:sz="1" w:space="0" w:color="2E75B6"/>
-            </w:tcBorders>
             <w:shd w:val="clear" w:color="auto" w:fill="2E75B6"/>
             <w:tcMar>
               <w:top w:w="80" w:type="dxa"/>
@@ -6627,12 +6591,6 @@
         <w:tc>
           <w:tcPr>
             <w:tcW w:w="6526" w:type="dxa"/>
-            <w:tcBorders>
-              <w:top w:val="single" w:sz="1" w:space="0" w:color="2E75B6"/>
-              <w:left w:val="single" w:sz="1" w:space="0" w:color="2E75B6"/>
-              <w:bottom w:val="single" w:sz="1" w:space="0" w:color="2E75B6"/>
-              <w:right w:val="single" w:sz="1" w:space="0" w:color="2E75B6"/>
-            </w:tcBorders>
             <w:shd w:val="clear" w:color="auto" w:fill="2E75B6"/>
             <w:tcMar>
               <w:top w:w="80" w:type="dxa"/>
@@ -6663,12 +6621,6 @@
         <w:tc>
           <w:tcPr>
             <w:tcW w:w="2500" w:type="dxa"/>
-            <w:tcBorders>
-              <w:top w:val="single" w:sz="1" w:space="0" w:color="CCCCCC"/>
-              <w:left w:val="single" w:sz="1" w:space="0" w:color="CCCCCC"/>
-              <w:bottom w:val="single" w:sz="1" w:space="0" w:color="CCCCCC"/>
-              <w:right w:val="single" w:sz="1" w:space="0" w:color="CCCCCC"/>
-            </w:tcBorders>
             <w:shd w:val="clear" w:color="auto" w:fill="FFFFFF"/>
             <w:tcMar>
               <w:top w:w="80" w:type="dxa"/>
@@ -6693,12 +6645,6 @@
         <w:tc>
           <w:tcPr>
             <w:tcW w:w="6526" w:type="dxa"/>
-            <w:tcBorders>
-              <w:top w:val="single" w:sz="1" w:space="0" w:color="CCCCCC"/>
-              <w:left w:val="single" w:sz="1" w:space="0" w:color="CCCCCC"/>
-              <w:bottom w:val="single" w:sz="1" w:space="0" w:color="CCCCCC"/>
-              <w:right w:val="single" w:sz="1" w:space="0" w:color="CCCCCC"/>
-            </w:tcBorders>
             <w:shd w:val="clear" w:color="auto" w:fill="FFFFFF"/>
             <w:tcMar>
               <w:top w:w="80" w:type="dxa"/>
@@ -6791,12 +6737,6 @@
         <w:tc>
           <w:tcPr>
             <w:tcW w:w="2500" w:type="dxa"/>
-            <w:tcBorders>
-              <w:top w:val="single" w:sz="1" w:space="0" w:color="CCCCCC"/>
-              <w:left w:val="single" w:sz="1" w:space="0" w:color="CCCCCC"/>
-              <w:bottom w:val="single" w:sz="1" w:space="0" w:color="CCCCCC"/>
-              <w:right w:val="single" w:sz="1" w:space="0" w:color="CCCCCC"/>
-            </w:tcBorders>
             <w:shd w:val="clear" w:color="auto" w:fill="FFFFFF"/>
             <w:tcMar>
               <w:top w:w="80" w:type="dxa"/>
@@ -6823,12 +6763,6 @@
         <w:tc>
           <w:tcPr>
             <w:tcW w:w="6526" w:type="dxa"/>
-            <w:tcBorders>
-              <w:top w:val="single" w:sz="1" w:space="0" w:color="CCCCCC"/>
-              <w:left w:val="single" w:sz="1" w:space="0" w:color="CCCCCC"/>
-              <w:bottom w:val="single" w:sz="1" w:space="0" w:color="CCCCCC"/>
-              <w:right w:val="single" w:sz="1" w:space="0" w:color="CCCCCC"/>
-            </w:tcBorders>
             <w:shd w:val="clear" w:color="auto" w:fill="FFFFFF"/>
             <w:tcMar>
               <w:top w:w="80" w:type="dxa"/>
@@ -7353,20 +7287,63 @@
       <w:proofErr w:type="spellEnd"/>
     </w:p>
     <w:p>
-      <w:r>
-        <w:rPr>
-          <w:rFonts w:ascii="Arial" w:eastAsia="Arial" w:hAnsi="Arial" w:cs="Arial"/>
-          <w:sz w:val="22"/>
-          <w:szCs w:val="22"/>
-        </w:rPr>
-        <w:t xml:space="preserve">Vyhodnotí BDD pre konkrétny vstupný vektor. Postupuje od koreňa smerom k listu: v každom uzle určí index aktuálnej premennej v </w:t>
-      </w:r>
-      <w:proofErr w:type="spellStart"/>
-      <w:r>
-        <w:rPr>
-          <w:rFonts w:ascii="Courier New" w:eastAsia="Courier New" w:hAnsi="Courier New" w:cs="Courier New"/>
-          <w:sz w:val="18"/>
-          <w:szCs w:val="18"/>
+      <w:pPr>
+        <w:rPr>
+          <w:rFonts w:ascii="Arial" w:eastAsia="Arial" w:hAnsi="Arial" w:cs="Arial"/>
+          <w:sz w:val="22"/>
+          <w:szCs w:val="22"/>
+        </w:rPr>
+      </w:pPr>
+      <w:r>
+        <w:rPr>
+          <w:rFonts w:ascii="Arial" w:eastAsia="Arial" w:hAnsi="Arial" w:cs="Arial"/>
+          <w:sz w:val="22"/>
+          <w:szCs w:val="22"/>
+        </w:rPr>
+        <w:t xml:space="preserve">Vyhodnotí BDD pre konkrétny vstupný vektor. Parameter </w:t>
+      </w:r>
+      <w:proofErr w:type="spellStart"/>
+      <w:r>
+        <w:rPr>
+          <w:rFonts w:ascii="Arial" w:eastAsia="Arial" w:hAnsi="Arial" w:cs="Arial"/>
+          <w:sz w:val="22"/>
+          <w:szCs w:val="22"/>
+        </w:rPr>
+        <w:t>inputs</w:t>
+      </w:r>
+      <w:proofErr w:type="spellEnd"/>
+      <w:r>
+        <w:rPr>
+          <w:rFonts w:ascii="Arial" w:eastAsia="Arial" w:hAnsi="Arial" w:cs="Arial"/>
+          <w:sz w:val="22"/>
+          <w:szCs w:val="22"/>
+        </w:rPr>
+        <w:t xml:space="preserve"> musí obsahovať hodnoty premenných v poradí zhodnom s </w:t>
+      </w:r>
+      <w:proofErr w:type="spellStart"/>
+      <w:r>
+        <w:rPr>
+          <w:rFonts w:ascii="Arial" w:eastAsia="Arial" w:hAnsi="Arial" w:cs="Arial"/>
+          <w:sz w:val="22"/>
+          <w:szCs w:val="22"/>
+        </w:rPr>
+        <w:t>bdd</w:t>
+      </w:r>
+      <w:proofErr w:type="spellEnd"/>
+      <w:r>
+        <w:rPr>
+          <w:rFonts w:ascii="Arial" w:eastAsia="Arial" w:hAnsi="Arial" w:cs="Arial"/>
+          <w:sz w:val="22"/>
+          <w:szCs w:val="22"/>
+        </w:rPr>
+        <w:t>-&gt;</w:t>
+      </w:r>
+      <w:proofErr w:type="spellStart"/>
+      <w:r>
+        <w:rPr>
+          <w:rFonts w:ascii="Arial" w:eastAsia="Arial" w:hAnsi="Arial" w:cs="Arial"/>
+          <w:sz w:val="22"/>
+          <w:szCs w:val="22"/>
         </w:rPr>
         <w:t>varOrder</w:t>
       </w:r>
@@ -7377,14 +7354,122 @@
           <w:sz w:val="22"/>
           <w:szCs w:val="22"/>
         </w:rPr>
+        <w:t xml:space="preserve">, nie nevyhnutne v abecednom poradí. Napríklad ak </w:t>
+      </w:r>
+      <w:proofErr w:type="spellStart"/>
+      <w:r>
+        <w:rPr>
+          <w:rFonts w:ascii="Arial" w:eastAsia="Arial" w:hAnsi="Arial" w:cs="Arial"/>
+          <w:sz w:val="22"/>
+          <w:szCs w:val="22"/>
+        </w:rPr>
+        <w:t>varOrder</w:t>
+      </w:r>
+      <w:proofErr w:type="spellEnd"/>
+      <w:r>
+        <w:rPr>
+          <w:rFonts w:ascii="Arial" w:eastAsia="Arial" w:hAnsi="Arial" w:cs="Arial"/>
+          <w:sz w:val="22"/>
+          <w:szCs w:val="22"/>
+        </w:rPr>
+        <w:t xml:space="preserve"> = “CAB”, potom </w:t>
+      </w:r>
+      <w:proofErr w:type="spellStart"/>
+      <w:r>
+        <w:rPr>
+          <w:rFonts w:ascii="Arial" w:eastAsia="Arial" w:hAnsi="Arial" w:cs="Arial"/>
+          <w:sz w:val="22"/>
+          <w:szCs w:val="22"/>
+        </w:rPr>
+        <w:t>inputs</w:t>
+      </w:r>
+      <w:proofErr w:type="spellEnd"/>
+      <w:r>
+        <w:rPr>
+          <w:rFonts w:ascii="Arial" w:eastAsia="Arial" w:hAnsi="Arial" w:cs="Arial"/>
+          <w:sz w:val="22"/>
+          <w:szCs w:val="22"/>
+        </w:rPr>
+        <w:t xml:space="preserve">[0] je hodnota C, </w:t>
+      </w:r>
+      <w:proofErr w:type="spellStart"/>
+      <w:r>
+        <w:rPr>
+          <w:rFonts w:ascii="Arial" w:eastAsia="Arial" w:hAnsi="Arial" w:cs="Arial"/>
+          <w:sz w:val="22"/>
+          <w:szCs w:val="22"/>
+        </w:rPr>
+        <w:t>inputs</w:t>
+      </w:r>
+      <w:proofErr w:type="spellEnd"/>
+      <w:r>
+        <w:rPr>
+          <w:rFonts w:ascii="Arial" w:eastAsia="Arial" w:hAnsi="Arial" w:cs="Arial"/>
+          <w:sz w:val="22"/>
+          <w:szCs w:val="22"/>
+        </w:rPr>
+        <w:t xml:space="preserve">[1] je hodnota A </w:t>
+      </w:r>
+      <w:proofErr w:type="spellStart"/>
+      <w:r>
+        <w:rPr>
+          <w:rFonts w:ascii="Arial" w:eastAsia="Arial" w:hAnsi="Arial" w:cs="Arial"/>
+          <w:sz w:val="22"/>
+          <w:szCs w:val="22"/>
+        </w:rPr>
+        <w:t>a</w:t>
+      </w:r>
+      <w:proofErr w:type="spellEnd"/>
+      <w:r>
+        <w:rPr>
+          <w:rFonts w:ascii="Arial" w:eastAsia="Arial" w:hAnsi="Arial" w:cs="Arial"/>
+          <w:sz w:val="22"/>
+          <w:szCs w:val="22"/>
+        </w:rPr>
+        <w:t xml:space="preserve"> </w:t>
+      </w:r>
+      <w:proofErr w:type="spellStart"/>
+      <w:r>
+        <w:rPr>
+          <w:rFonts w:ascii="Arial" w:eastAsia="Arial" w:hAnsi="Arial" w:cs="Arial"/>
+          <w:sz w:val="22"/>
+          <w:szCs w:val="22"/>
+        </w:rPr>
+        <w:t>inputs</w:t>
+      </w:r>
+      <w:proofErr w:type="spellEnd"/>
+      <w:r>
+        <w:rPr>
+          <w:rFonts w:ascii="Arial" w:eastAsia="Arial" w:hAnsi="Arial" w:cs="Arial"/>
+          <w:sz w:val="22"/>
+          <w:szCs w:val="22"/>
+        </w:rPr>
+        <w:t xml:space="preserve">[2] je hodnota B. Funkcia postupuje od koreňa smerom k listu: v každom uzle našla index aktuálnej premennej v </w:t>
+      </w:r>
+      <w:proofErr w:type="spellStart"/>
+      <w:r>
+        <w:rPr>
+          <w:rFonts w:ascii="Arial" w:eastAsia="Arial" w:hAnsi="Arial" w:cs="Arial"/>
+          <w:sz w:val="22"/>
+          <w:szCs w:val="22"/>
+        </w:rPr>
+        <w:t>varOrder</w:t>
+      </w:r>
+      <w:proofErr w:type="spellEnd"/>
+      <w:r>
+        <w:rPr>
+          <w:rFonts w:ascii="Arial" w:eastAsia="Arial" w:hAnsi="Arial" w:cs="Arial"/>
+          <w:sz w:val="22"/>
+          <w:szCs w:val="22"/>
+        </w:rPr>
         <w:t xml:space="preserve"> a podľa zodpovedajúceho bitu vstupu sa pohne na vetvu </w:t>
       </w:r>
       <w:proofErr w:type="spellStart"/>
       <w:r>
         <w:rPr>
-          <w:rFonts w:ascii="Courier New" w:eastAsia="Courier New" w:hAnsi="Courier New" w:cs="Courier New"/>
-          <w:sz w:val="18"/>
-          <w:szCs w:val="18"/>
+          <w:rFonts w:ascii="Arial" w:eastAsia="Arial" w:hAnsi="Arial" w:cs="Arial"/>
+          <w:sz w:val="22"/>
+          <w:szCs w:val="22"/>
         </w:rPr>
         <w:t>high</w:t>
       </w:r>
@@ -7400,9 +7485,9 @@
       <w:proofErr w:type="spellStart"/>
       <w:r>
         <w:rPr>
-          <w:rFonts w:ascii="Courier New" w:eastAsia="Courier New" w:hAnsi="Courier New" w:cs="Courier New"/>
-          <w:sz w:val="18"/>
-          <w:szCs w:val="18"/>
+          <w:rFonts w:ascii="Arial" w:eastAsia="Arial" w:hAnsi="Arial" w:cs="Arial"/>
+          <w:sz w:val="22"/>
+          <w:szCs w:val="22"/>
         </w:rPr>
         <w:t>low</w:t>
       </w:r>
@@ -7418,28 +7503,20 @@
       <w:proofErr w:type="spellStart"/>
       <w:r>
         <w:rPr>
-          <w:rFonts w:ascii="Courier New" w:eastAsia="Courier New" w:hAnsi="Courier New" w:cs="Courier New"/>
-          <w:sz w:val="18"/>
-          <w:szCs w:val="18"/>
+          <w:rFonts w:ascii="Arial" w:eastAsia="Arial" w:hAnsi="Arial" w:cs="Arial"/>
+          <w:sz w:val="22"/>
+          <w:szCs w:val="22"/>
         </w:rPr>
         <w:t>variable</w:t>
       </w:r>
       <w:proofErr w:type="spellEnd"/>
       <w:r>
         <w:rPr>
-          <w:rFonts w:ascii="Courier New" w:eastAsia="Courier New" w:hAnsi="Courier New" w:cs="Courier New"/>
-          <w:sz w:val="18"/>
-          <w:szCs w:val="18"/>
-        </w:rPr>
-        <w:t xml:space="preserve"> == '\0'</w:t>
-      </w:r>
-      <w:r>
-        <w:rPr>
-          <w:rFonts w:ascii="Arial" w:eastAsia="Arial" w:hAnsi="Arial" w:cs="Arial"/>
-          <w:sz w:val="22"/>
-          <w:szCs w:val="22"/>
-        </w:rPr>
-        <w:t>), vráti jeho hodnotu ako znak '0' alebo '1'. Funkcia má lineárnu zložitosť vzhľadom na počet premenných, resp. hĺbku BDD.</w:t>
+          <w:rFonts w:ascii="Arial" w:eastAsia="Arial" w:hAnsi="Arial" w:cs="Arial"/>
+          <w:sz w:val="22"/>
+          <w:szCs w:val="22"/>
+        </w:rPr>
+        <w:t xml:space="preserve"> == '\0'), vráti jeho hodnotu ako znak '0' alebo '1'. Funkcia má lineárnu zložitosť vzhľadom na počet premenných, resp. hĺbku BDD.</w:t>
       </w:r>
     </w:p>
     <w:p>
@@ -7564,7 +7641,16 @@
           <w:sz w:val="22"/>
           <w:szCs w:val="22"/>
         </w:rPr>
-        <w:t xml:space="preserve">. Terminálne uzly musia byť uvoľnené až po </w:t>
+        <w:t xml:space="preserve">. Terminálne </w:t>
+      </w:r>
+      <w:r>
+        <w:rPr>
+          <w:rFonts w:ascii="Arial" w:eastAsia="Arial" w:hAnsi="Arial" w:cs="Arial"/>
+          <w:sz w:val="22"/>
+          <w:szCs w:val="22"/>
+        </w:rPr>
+        <w:lastRenderedPageBreak/>
+        <w:t xml:space="preserve">uzly musia byť uvoľnené až po </w:t>
       </w:r>
       <w:proofErr w:type="spellStart"/>
       <w:r>
@@ -8102,6 +8188,12 @@
     </w:p>
     <w:p>
       <w:pPr>
+        <w:pBdr>
+          <w:top w:val="single" w:sz="8" w:space="1" w:color="BFBFBF" w:themeColor="background1" w:themeShade="BF" w:shadow="1"/>
+          <w:left w:val="single" w:sz="8" w:space="4" w:color="BFBFBF" w:themeColor="background1" w:themeShade="BF" w:shadow="1"/>
+          <w:bottom w:val="single" w:sz="8" w:space="1" w:color="BFBFBF" w:themeColor="background1" w:themeShade="BF" w:shadow="1"/>
+          <w:right w:val="single" w:sz="8" w:space="4" w:color="BFBFBF" w:themeColor="background1" w:themeShade="BF" w:shadow="1"/>
+        </w:pBdr>
         <w:shd w:val="clear" w:color="auto" w:fill="F4F4F4"/>
         <w:spacing w:before="100"/>
         <w:ind w:left="360" w:right="360"/>
@@ -8169,6 +8261,12 @@
     </w:p>
     <w:p>
       <w:pPr>
+        <w:pBdr>
+          <w:top w:val="single" w:sz="8" w:space="1" w:color="BFBFBF" w:themeColor="background1" w:themeShade="BF" w:shadow="1"/>
+          <w:left w:val="single" w:sz="8" w:space="4" w:color="BFBFBF" w:themeColor="background1" w:themeShade="BF" w:shadow="1"/>
+          <w:bottom w:val="single" w:sz="8" w:space="1" w:color="BFBFBF" w:themeColor="background1" w:themeShade="BF" w:shadow="1"/>
+          <w:right w:val="single" w:sz="8" w:space="4" w:color="BFBFBF" w:themeColor="background1" w:themeShade="BF" w:shadow="1"/>
+        </w:pBdr>
         <w:shd w:val="clear" w:color="auto" w:fill="F4F4F4"/>
         <w:spacing w:after="100"/>
         <w:ind w:left="360" w:right="360"/>
@@ -8223,13 +8321,12 @@
       <w:tblPr>
         <w:tblW w:w="9360" w:type="dxa"/>
         <w:tblBorders>
-          <w:top w:val="single" w:sz="4" w:space="0" w:color="auto"/>
-          <w:left w:val="single" w:sz="4" w:space="0" w:color="auto"/>
-          <w:bottom w:val="single" w:sz="4" w:space="0" w:color="auto"/>
-          <w:right w:val="single" w:sz="4" w:space="0" w:color="auto"/>
-          <w:insideH w:val="single" w:sz="4" w:space="0" w:color="auto"/>
-          <w:insideV w:val="single" w:sz="4" w:space="0" w:color="auto"/>
+          <w:top w:val="single" w:sz="6" w:space="0" w:color="BFBFBF" w:themeColor="background1" w:themeShade="BF"/>
+          <w:left w:val="single" w:sz="6" w:space="0" w:color="BFBFBF" w:themeColor="background1" w:themeShade="BF"/>
+          <w:bottom w:val="single" w:sz="6" w:space="0" w:color="BFBFBF" w:themeColor="background1" w:themeShade="BF"/>
+          <w:right w:val="single" w:sz="6" w:space="0" w:color="BFBFBF" w:themeColor="background1" w:themeShade="BF"/>
         </w:tblBorders>
+        <w:shd w:val="clear" w:color="auto" w:fill="F2F7FB"/>
         <w:tblCellMar>
           <w:left w:w="10" w:type="dxa"/>
           <w:right w:w="10" w:type="dxa"/>
@@ -8243,12 +8340,6 @@
         <w:tc>
           <w:tcPr>
             <w:tcW w:w="9360" w:type="dxa"/>
-            <w:tcBorders>
-              <w:top w:val="single" w:sz="1" w:space="0" w:color="ADB9CA"/>
-              <w:left w:val="single" w:sz="1" w:space="0" w:color="ADB9CA"/>
-              <w:bottom w:val="single" w:sz="1" w:space="0" w:color="ADB9CA"/>
-              <w:right w:val="single" w:sz="1" w:space="0" w:color="ADB9CA"/>
-            </w:tcBorders>
             <w:shd w:val="clear" w:color="auto" w:fill="F2F7FB"/>
             <w:tcMar>
               <w:top w:w="160" w:type="dxa"/>
@@ -8367,7 +8458,17 @@
                 <w:sz w:val="22"/>
                 <w:szCs w:val="22"/>
               </w:rPr>
-              <w:t xml:space="preserve"> zaradí s pravdepodobnosťou 50 % (s náhodnou negáciou). Ak by term zostal prázdny, doplní sa aspoň jeden náhodný </w:t>
+              <w:t xml:space="preserve"> zaradí s </w:t>
+            </w:r>
+            <w:r>
+              <w:rPr>
+                <w:rFonts w:ascii="Arial" w:eastAsia="Arial" w:hAnsi="Arial" w:cs="Arial"/>
+                <w:color w:val="1A1A2E"/>
+                <w:sz w:val="22"/>
+                <w:szCs w:val="22"/>
+              </w:rPr>
+              <w:lastRenderedPageBreak/>
+              <w:t xml:space="preserve">pravdepodobnosťou 50 % (s náhodnou negáciou). Ak by term zostal prázdny, doplní sa aspoň jeden náhodný </w:t>
             </w:r>
             <w:proofErr w:type="spellStart"/>
             <w:r>
@@ -8403,7 +8504,6 @@
                 <w:sz w:val="22"/>
                 <w:szCs w:val="22"/>
               </w:rPr>
-              <w:lastRenderedPageBreak/>
               <w:t>Fáza 2 – Overenie korektnosti</w:t>
             </w:r>
           </w:p>
@@ -8644,6 +8744,12 @@
     </w:p>
     <w:p>
       <w:pPr>
+        <w:pBdr>
+          <w:top w:val="single" w:sz="8" w:space="1" w:color="BFBFBF" w:themeColor="background1" w:themeShade="BF" w:shadow="1"/>
+          <w:left w:val="single" w:sz="8" w:space="4" w:color="BFBFBF" w:themeColor="background1" w:themeShade="BF" w:shadow="1"/>
+          <w:bottom w:val="single" w:sz="8" w:space="1" w:color="BFBFBF" w:themeColor="background1" w:themeShade="BF" w:shadow="1"/>
+          <w:right w:val="single" w:sz="8" w:space="4" w:color="BFBFBF" w:themeColor="background1" w:themeShade="BF" w:shadow="1"/>
+        </w:pBdr>
         <w:shd w:val="clear" w:color="auto" w:fill="F4F4F4"/>
         <w:spacing w:before="100" w:after="0"/>
         <w:ind w:left="360" w:right="360"/>
@@ -8660,6 +8766,12 @@
     </w:p>
     <w:p>
       <w:pPr>
+        <w:pBdr>
+          <w:top w:val="single" w:sz="8" w:space="1" w:color="BFBFBF" w:themeColor="background1" w:themeShade="BF" w:shadow="1"/>
+          <w:left w:val="single" w:sz="8" w:space="4" w:color="BFBFBF" w:themeColor="background1" w:themeShade="BF" w:shadow="1"/>
+          <w:bottom w:val="single" w:sz="8" w:space="1" w:color="BFBFBF" w:themeColor="background1" w:themeShade="BF" w:shadow="1"/>
+          <w:right w:val="single" w:sz="8" w:space="4" w:color="BFBFBF" w:themeColor="background1" w:themeShade="BF" w:shadow="1"/>
+        </w:pBdr>
         <w:shd w:val="clear" w:color="auto" w:fill="F4F4F4"/>
         <w:spacing w:after="0"/>
         <w:ind w:left="360" w:right="360"/>
@@ -8676,6 +8788,12 @@
     </w:p>
     <w:p>
       <w:pPr>
+        <w:pBdr>
+          <w:top w:val="single" w:sz="8" w:space="1" w:color="BFBFBF" w:themeColor="background1" w:themeShade="BF" w:shadow="1"/>
+          <w:left w:val="single" w:sz="8" w:space="4" w:color="BFBFBF" w:themeColor="background1" w:themeShade="BF" w:shadow="1"/>
+          <w:bottom w:val="single" w:sz="8" w:space="1" w:color="BFBFBF" w:themeColor="background1" w:themeShade="BF" w:shadow="1"/>
+          <w:right w:val="single" w:sz="8" w:space="4" w:color="BFBFBF" w:themeColor="background1" w:themeShade="BF" w:shadow="1"/>
+        </w:pBdr>
         <w:shd w:val="clear" w:color="auto" w:fill="F4F4F4"/>
         <w:spacing w:after="0"/>
         <w:ind w:left="360" w:right="360"/>
@@ -8692,6 +8810,12 @@
     </w:p>
     <w:p>
       <w:pPr>
+        <w:pBdr>
+          <w:top w:val="single" w:sz="8" w:space="1" w:color="BFBFBF" w:themeColor="background1" w:themeShade="BF" w:shadow="1"/>
+          <w:left w:val="single" w:sz="8" w:space="4" w:color="BFBFBF" w:themeColor="background1" w:themeShade="BF" w:shadow="1"/>
+          <w:bottom w:val="single" w:sz="8" w:space="1" w:color="BFBFBF" w:themeColor="background1" w:themeShade="BF" w:shadow="1"/>
+          <w:right w:val="single" w:sz="8" w:space="4" w:color="BFBFBF" w:themeColor="background1" w:themeShade="BF" w:shadow="1"/>
+        </w:pBdr>
         <w:shd w:val="clear" w:color="auto" w:fill="F4F4F4"/>
         <w:spacing w:after="0"/>
         <w:ind w:left="360" w:right="360"/>
@@ -8739,6 +8863,12 @@
     </w:p>
     <w:p>
       <w:pPr>
+        <w:pBdr>
+          <w:top w:val="single" w:sz="8" w:space="1" w:color="BFBFBF" w:themeColor="background1" w:themeShade="BF" w:shadow="1"/>
+          <w:left w:val="single" w:sz="8" w:space="4" w:color="BFBFBF" w:themeColor="background1" w:themeShade="BF" w:shadow="1"/>
+          <w:bottom w:val="single" w:sz="8" w:space="1" w:color="BFBFBF" w:themeColor="background1" w:themeShade="BF" w:shadow="1"/>
+          <w:right w:val="single" w:sz="8" w:space="4" w:color="BFBFBF" w:themeColor="background1" w:themeShade="BF" w:shadow="1"/>
+        </w:pBdr>
         <w:shd w:val="clear" w:color="auto" w:fill="F4F4F4"/>
         <w:spacing w:after="0"/>
         <w:ind w:left="360" w:right="360"/>
@@ -8866,6 +8996,12 @@
     </w:p>
     <w:p>
       <w:pPr>
+        <w:pBdr>
+          <w:top w:val="single" w:sz="8" w:space="1" w:color="BFBFBF" w:themeColor="background1" w:themeShade="BF" w:shadow="1"/>
+          <w:left w:val="single" w:sz="8" w:space="4" w:color="BFBFBF" w:themeColor="background1" w:themeShade="BF" w:shadow="1"/>
+          <w:bottom w:val="single" w:sz="8" w:space="1" w:color="BFBFBF" w:themeColor="background1" w:themeShade="BF" w:shadow="1"/>
+          <w:right w:val="single" w:sz="8" w:space="4" w:color="BFBFBF" w:themeColor="background1" w:themeShade="BF" w:shadow="1"/>
+        </w:pBdr>
         <w:shd w:val="clear" w:color="auto" w:fill="F4F4F4"/>
         <w:spacing w:after="0"/>
         <w:ind w:left="360" w:right="360"/>
@@ -8913,6 +9049,12 @@
     </w:p>
     <w:p>
       <w:pPr>
+        <w:pBdr>
+          <w:top w:val="single" w:sz="8" w:space="1" w:color="BFBFBF" w:themeColor="background1" w:themeShade="BF" w:shadow="1"/>
+          <w:left w:val="single" w:sz="8" w:space="4" w:color="BFBFBF" w:themeColor="background1" w:themeShade="BF" w:shadow="1"/>
+          <w:bottom w:val="single" w:sz="8" w:space="1" w:color="BFBFBF" w:themeColor="background1" w:themeShade="BF" w:shadow="1"/>
+          <w:right w:val="single" w:sz="8" w:space="4" w:color="BFBFBF" w:themeColor="background1" w:themeShade="BF" w:shadow="1"/>
+        </w:pBdr>
         <w:shd w:val="clear" w:color="auto" w:fill="F4F4F4"/>
         <w:spacing w:after="0"/>
         <w:ind w:left="360" w:right="360"/>
@@ -8929,6 +9071,12 @@
     </w:p>
     <w:p>
       <w:pPr>
+        <w:pBdr>
+          <w:top w:val="single" w:sz="8" w:space="1" w:color="BFBFBF" w:themeColor="background1" w:themeShade="BF" w:shadow="1"/>
+          <w:left w:val="single" w:sz="8" w:space="4" w:color="BFBFBF" w:themeColor="background1" w:themeShade="BF" w:shadow="1"/>
+          <w:bottom w:val="single" w:sz="8" w:space="1" w:color="BFBFBF" w:themeColor="background1" w:themeShade="BF" w:shadow="1"/>
+          <w:right w:val="single" w:sz="8" w:space="4" w:color="BFBFBF" w:themeColor="background1" w:themeShade="BF" w:shadow="1"/>
+        </w:pBdr>
         <w:shd w:val="clear" w:color="auto" w:fill="F4F4F4"/>
         <w:spacing w:after="0"/>
         <w:ind w:left="360" w:right="360"/>
@@ -8996,6 +9144,12 @@
     </w:p>
     <w:p>
       <w:pPr>
+        <w:pBdr>
+          <w:top w:val="single" w:sz="8" w:space="1" w:color="BFBFBF" w:themeColor="background1" w:themeShade="BF" w:shadow="1"/>
+          <w:left w:val="single" w:sz="8" w:space="4" w:color="BFBFBF" w:themeColor="background1" w:themeShade="BF" w:shadow="1"/>
+          <w:bottom w:val="single" w:sz="8" w:space="1" w:color="BFBFBF" w:themeColor="background1" w:themeShade="BF" w:shadow="1"/>
+          <w:right w:val="single" w:sz="8" w:space="4" w:color="BFBFBF" w:themeColor="background1" w:themeShade="BF" w:shadow="1"/>
+        </w:pBdr>
         <w:shd w:val="clear" w:color="auto" w:fill="F4F4F4"/>
         <w:spacing w:after="0"/>
         <w:ind w:left="360" w:right="360"/>
@@ -9052,6 +9206,12 @@
     </w:p>
     <w:p>
       <w:pPr>
+        <w:pBdr>
+          <w:top w:val="single" w:sz="8" w:space="1" w:color="BFBFBF" w:themeColor="background1" w:themeShade="BF" w:shadow="1"/>
+          <w:left w:val="single" w:sz="8" w:space="4" w:color="BFBFBF" w:themeColor="background1" w:themeShade="BF" w:shadow="1"/>
+          <w:bottom w:val="single" w:sz="8" w:space="1" w:color="BFBFBF" w:themeColor="background1" w:themeShade="BF" w:shadow="1"/>
+          <w:right w:val="single" w:sz="8" w:space="4" w:color="BFBFBF" w:themeColor="background1" w:themeShade="BF" w:shadow="1"/>
+        </w:pBdr>
         <w:shd w:val="clear" w:color="auto" w:fill="F4F4F4"/>
         <w:spacing w:after="0"/>
         <w:ind w:left="360" w:right="360"/>
@@ -9148,6 +9308,12 @@
     </w:p>
     <w:p>
       <w:pPr>
+        <w:pBdr>
+          <w:top w:val="single" w:sz="8" w:space="1" w:color="BFBFBF" w:themeColor="background1" w:themeShade="BF" w:shadow="1"/>
+          <w:left w:val="single" w:sz="8" w:space="4" w:color="BFBFBF" w:themeColor="background1" w:themeShade="BF" w:shadow="1"/>
+          <w:bottom w:val="single" w:sz="8" w:space="1" w:color="BFBFBF" w:themeColor="background1" w:themeShade="BF" w:shadow="1"/>
+          <w:right w:val="single" w:sz="8" w:space="4" w:color="BFBFBF" w:themeColor="background1" w:themeShade="BF" w:shadow="1"/>
+        </w:pBdr>
         <w:shd w:val="clear" w:color="auto" w:fill="F4F4F4"/>
         <w:spacing w:after="0"/>
         <w:ind w:left="360" w:right="360"/>
@@ -9244,6 +9410,12 @@
     </w:p>
     <w:p>
       <w:pPr>
+        <w:pBdr>
+          <w:top w:val="single" w:sz="8" w:space="1" w:color="BFBFBF" w:themeColor="background1" w:themeShade="BF" w:shadow="1"/>
+          <w:left w:val="single" w:sz="8" w:space="4" w:color="BFBFBF" w:themeColor="background1" w:themeShade="BF" w:shadow="1"/>
+          <w:bottom w:val="single" w:sz="8" w:space="1" w:color="BFBFBF" w:themeColor="background1" w:themeShade="BF" w:shadow="1"/>
+          <w:right w:val="single" w:sz="8" w:space="4" w:color="BFBFBF" w:themeColor="background1" w:themeShade="BF" w:shadow="1"/>
+        </w:pBdr>
         <w:shd w:val="clear" w:color="auto" w:fill="F4F4F4"/>
         <w:spacing w:after="0"/>
         <w:ind w:left="360" w:right="360"/>
@@ -9255,6 +9427,7 @@
           <w:sz w:val="20"/>
           <w:szCs w:val="20"/>
         </w:rPr>
+        <w:lastRenderedPageBreak/>
         <w:t xml:space="preserve">        </w:t>
       </w:r>
       <w:proofErr w:type="spellStart"/>
@@ -9300,6 +9473,12 @@
     </w:p>
     <w:p>
       <w:pPr>
+        <w:pBdr>
+          <w:top w:val="single" w:sz="8" w:space="1" w:color="BFBFBF" w:themeColor="background1" w:themeShade="BF" w:shadow="1"/>
+          <w:left w:val="single" w:sz="8" w:space="4" w:color="BFBFBF" w:themeColor="background1" w:themeShade="BF" w:shadow="1"/>
+          <w:bottom w:val="single" w:sz="8" w:space="1" w:color="BFBFBF" w:themeColor="background1" w:themeShade="BF" w:shadow="1"/>
+          <w:right w:val="single" w:sz="8" w:space="4" w:color="BFBFBF" w:themeColor="background1" w:themeShade="BF" w:shadow="1"/>
+        </w:pBdr>
         <w:shd w:val="clear" w:color="auto" w:fill="F4F4F4"/>
         <w:spacing w:after="0"/>
         <w:ind w:left="360" w:right="360"/>
@@ -9336,6 +9515,12 @@
     </w:p>
     <w:p>
       <w:pPr>
+        <w:pBdr>
+          <w:top w:val="single" w:sz="8" w:space="1" w:color="BFBFBF" w:themeColor="background1" w:themeShade="BF" w:shadow="1"/>
+          <w:left w:val="single" w:sz="8" w:space="4" w:color="BFBFBF" w:themeColor="background1" w:themeShade="BF" w:shadow="1"/>
+          <w:bottom w:val="single" w:sz="8" w:space="1" w:color="BFBFBF" w:themeColor="background1" w:themeShade="BF" w:shadow="1"/>
+          <w:right w:val="single" w:sz="8" w:space="4" w:color="BFBFBF" w:themeColor="background1" w:themeShade="BF" w:shadow="1"/>
+        </w:pBdr>
         <w:shd w:val="clear" w:color="auto" w:fill="F4F4F4"/>
         <w:spacing w:after="0"/>
         <w:ind w:left="360" w:right="360"/>
@@ -9352,6 +9537,12 @@
     </w:p>
     <w:p>
       <w:pPr>
+        <w:pBdr>
+          <w:top w:val="single" w:sz="8" w:space="1" w:color="BFBFBF" w:themeColor="background1" w:themeShade="BF" w:shadow="1"/>
+          <w:left w:val="single" w:sz="8" w:space="4" w:color="BFBFBF" w:themeColor="background1" w:themeShade="BF" w:shadow="1"/>
+          <w:bottom w:val="single" w:sz="8" w:space="1" w:color="BFBFBF" w:themeColor="background1" w:themeShade="BF" w:shadow="1"/>
+          <w:right w:val="single" w:sz="8" w:space="4" w:color="BFBFBF" w:themeColor="background1" w:themeShade="BF" w:shadow="1"/>
+        </w:pBdr>
         <w:shd w:val="clear" w:color="auto" w:fill="F4F4F4"/>
         <w:spacing w:after="0"/>
         <w:ind w:left="360" w:right="360"/>
@@ -9368,6 +9559,12 @@
     </w:p>
     <w:p>
       <w:pPr>
+        <w:pBdr>
+          <w:top w:val="single" w:sz="8" w:space="1" w:color="BFBFBF" w:themeColor="background1" w:themeShade="BF" w:shadow="1"/>
+          <w:left w:val="single" w:sz="8" w:space="4" w:color="BFBFBF" w:themeColor="background1" w:themeShade="BF" w:shadow="1"/>
+          <w:bottom w:val="single" w:sz="8" w:space="1" w:color="BFBFBF" w:themeColor="background1" w:themeShade="BF" w:shadow="1"/>
+          <w:right w:val="single" w:sz="8" w:space="4" w:color="BFBFBF" w:themeColor="background1" w:themeShade="BF" w:shadow="1"/>
+        </w:pBdr>
         <w:shd w:val="clear" w:color="auto" w:fill="F4F4F4"/>
         <w:spacing w:after="0"/>
         <w:ind w:left="360" w:right="360"/>
@@ -9484,6 +9681,12 @@
     </w:p>
     <w:p>
       <w:pPr>
+        <w:pBdr>
+          <w:top w:val="single" w:sz="8" w:space="1" w:color="BFBFBF" w:themeColor="background1" w:themeShade="BF" w:shadow="1"/>
+          <w:left w:val="single" w:sz="8" w:space="4" w:color="BFBFBF" w:themeColor="background1" w:themeShade="BF" w:shadow="1"/>
+          <w:bottom w:val="single" w:sz="8" w:space="1" w:color="BFBFBF" w:themeColor="background1" w:themeShade="BF" w:shadow="1"/>
+          <w:right w:val="single" w:sz="8" w:space="4" w:color="BFBFBF" w:themeColor="background1" w:themeShade="BF" w:shadow="1"/>
+        </w:pBdr>
         <w:shd w:val="clear" w:color="auto" w:fill="F4F4F4"/>
         <w:spacing w:after="0"/>
         <w:ind w:left="360" w:right="360"/>
@@ -9496,7 +9699,6 @@
           <w:sz w:val="20"/>
           <w:szCs w:val="20"/>
         </w:rPr>
-        <w:lastRenderedPageBreak/>
         <w:t>for</w:t>
       </w:r>
       <w:proofErr w:type="spellEnd"/>
@@ -9532,6 +9734,12 @@
     </w:p>
     <w:p>
       <w:pPr>
+        <w:pBdr>
+          <w:top w:val="single" w:sz="8" w:space="1" w:color="BFBFBF" w:themeColor="background1" w:themeShade="BF" w:shadow="1"/>
+          <w:left w:val="single" w:sz="8" w:space="4" w:color="BFBFBF" w:themeColor="background1" w:themeShade="BF" w:shadow="1"/>
+          <w:bottom w:val="single" w:sz="8" w:space="1" w:color="BFBFBF" w:themeColor="background1" w:themeShade="BF" w:shadow="1"/>
+          <w:right w:val="single" w:sz="8" w:space="4" w:color="BFBFBF" w:themeColor="background1" w:themeShade="BF" w:shadow="1"/>
+        </w:pBdr>
         <w:shd w:val="clear" w:color="auto" w:fill="F4F4F4"/>
         <w:spacing w:after="0"/>
         <w:ind w:left="360" w:right="360"/>
@@ -9668,6 +9876,12 @@
     </w:p>
     <w:p>
       <w:pPr>
+        <w:pBdr>
+          <w:top w:val="single" w:sz="8" w:space="1" w:color="BFBFBF" w:themeColor="background1" w:themeShade="BF" w:shadow="1"/>
+          <w:left w:val="single" w:sz="8" w:space="4" w:color="BFBFBF" w:themeColor="background1" w:themeShade="BF" w:shadow="1"/>
+          <w:bottom w:val="single" w:sz="8" w:space="1" w:color="BFBFBF" w:themeColor="background1" w:themeShade="BF" w:shadow="1"/>
+          <w:right w:val="single" w:sz="8" w:space="4" w:color="BFBFBF" w:themeColor="background1" w:themeShade="BF" w:shadow="1"/>
+        </w:pBdr>
         <w:shd w:val="clear" w:color="auto" w:fill="F4F4F4"/>
         <w:spacing w:after="0"/>
         <w:ind w:left="360" w:right="360"/>
@@ -9928,6 +10142,12 @@
     </w:p>
     <w:p>
       <w:pPr>
+        <w:pBdr>
+          <w:top w:val="single" w:sz="6" w:space="1" w:color="BFBFBF" w:themeColor="background1" w:themeShade="BF" w:shadow="1"/>
+          <w:left w:val="single" w:sz="6" w:space="4" w:color="BFBFBF" w:themeColor="background1" w:themeShade="BF" w:shadow="1"/>
+          <w:bottom w:val="single" w:sz="6" w:space="1" w:color="BFBFBF" w:themeColor="background1" w:themeShade="BF" w:shadow="1"/>
+          <w:right w:val="single" w:sz="6" w:space="4" w:color="BFBFBF" w:themeColor="background1" w:themeShade="BF" w:shadow="1"/>
+        </w:pBdr>
         <w:shd w:val="clear" w:color="auto" w:fill="F4F4F4"/>
         <w:spacing w:before="100" w:after="0"/>
         <w:ind w:left="360" w:right="360"/>
@@ -9944,6 +10164,12 @@
     </w:p>
     <w:p>
       <w:pPr>
+        <w:pBdr>
+          <w:top w:val="single" w:sz="6" w:space="1" w:color="BFBFBF" w:themeColor="background1" w:themeShade="BF" w:shadow="1"/>
+          <w:left w:val="single" w:sz="6" w:space="4" w:color="BFBFBF" w:themeColor="background1" w:themeShade="BF" w:shadow="1"/>
+          <w:bottom w:val="single" w:sz="6" w:space="1" w:color="BFBFBF" w:themeColor="background1" w:themeShade="BF" w:shadow="1"/>
+          <w:right w:val="single" w:sz="6" w:space="4" w:color="BFBFBF" w:themeColor="background1" w:themeShade="BF" w:shadow="1"/>
+        </w:pBdr>
         <w:shd w:val="clear" w:color="auto" w:fill="F4F4F4"/>
         <w:spacing w:after="0"/>
         <w:ind w:left="360" w:right="360"/>
@@ -10071,6 +10297,12 @@
     </w:p>
     <w:p>
       <w:pPr>
+        <w:pBdr>
+          <w:top w:val="single" w:sz="6" w:space="1" w:color="BFBFBF" w:themeColor="background1" w:themeShade="BF" w:shadow="1"/>
+          <w:left w:val="single" w:sz="6" w:space="4" w:color="BFBFBF" w:themeColor="background1" w:themeShade="BF" w:shadow="1"/>
+          <w:bottom w:val="single" w:sz="6" w:space="1" w:color="BFBFBF" w:themeColor="background1" w:themeShade="BF" w:shadow="1"/>
+          <w:right w:val="single" w:sz="6" w:space="4" w:color="BFBFBF" w:themeColor="background1" w:themeShade="BF" w:shadow="1"/>
+        </w:pBdr>
         <w:shd w:val="clear" w:color="auto" w:fill="F4F4F4"/>
         <w:spacing w:after="0"/>
         <w:ind w:left="360" w:right="360"/>
@@ -10087,6 +10319,12 @@
     </w:p>
     <w:p>
       <w:pPr>
+        <w:pBdr>
+          <w:top w:val="single" w:sz="6" w:space="1" w:color="BFBFBF" w:themeColor="background1" w:themeShade="BF" w:shadow="1"/>
+          <w:left w:val="single" w:sz="6" w:space="4" w:color="BFBFBF" w:themeColor="background1" w:themeShade="BF" w:shadow="1"/>
+          <w:bottom w:val="single" w:sz="6" w:space="1" w:color="BFBFBF" w:themeColor="background1" w:themeShade="BF" w:shadow="1"/>
+          <w:right w:val="single" w:sz="6" w:space="4" w:color="BFBFBF" w:themeColor="background1" w:themeShade="BF" w:shadow="1"/>
+        </w:pBdr>
         <w:shd w:val="clear" w:color="auto" w:fill="F4F4F4"/>
         <w:spacing w:after="0"/>
         <w:ind w:left="360" w:right="360"/>
@@ -10103,6 +10341,12 @@
     </w:p>
     <w:p>
       <w:pPr>
+        <w:pBdr>
+          <w:top w:val="single" w:sz="6" w:space="1" w:color="BFBFBF" w:themeColor="background1" w:themeShade="BF" w:shadow="1"/>
+          <w:left w:val="single" w:sz="6" w:space="4" w:color="BFBFBF" w:themeColor="background1" w:themeShade="BF" w:shadow="1"/>
+          <w:bottom w:val="single" w:sz="6" w:space="1" w:color="BFBFBF" w:themeColor="background1" w:themeShade="BF" w:shadow="1"/>
+          <w:right w:val="single" w:sz="6" w:space="4" w:color="BFBFBF" w:themeColor="background1" w:themeShade="BF" w:shadow="1"/>
+        </w:pBdr>
         <w:shd w:val="clear" w:color="auto" w:fill="F4F4F4"/>
         <w:spacing w:after="0"/>
         <w:ind w:left="360" w:right="360"/>
@@ -10210,6 +10454,12 @@
     </w:p>
     <w:p>
       <w:pPr>
+        <w:pBdr>
+          <w:top w:val="single" w:sz="6" w:space="1" w:color="BFBFBF" w:themeColor="background1" w:themeShade="BF" w:shadow="1"/>
+          <w:left w:val="single" w:sz="6" w:space="4" w:color="BFBFBF" w:themeColor="background1" w:themeShade="BF" w:shadow="1"/>
+          <w:bottom w:val="single" w:sz="6" w:space="1" w:color="BFBFBF" w:themeColor="background1" w:themeShade="BF" w:shadow="1"/>
+          <w:right w:val="single" w:sz="6" w:space="4" w:color="BFBFBF" w:themeColor="background1" w:themeShade="BF" w:shadow="1"/>
+        </w:pBdr>
         <w:shd w:val="clear" w:color="auto" w:fill="F4F4F4"/>
         <w:spacing w:after="0"/>
         <w:ind w:left="360" w:right="360"/>
@@ -10226,6 +10476,12 @@
     </w:p>
     <w:p>
       <w:pPr>
+        <w:pBdr>
+          <w:top w:val="single" w:sz="6" w:space="1" w:color="BFBFBF" w:themeColor="background1" w:themeShade="BF" w:shadow="1"/>
+          <w:left w:val="single" w:sz="6" w:space="4" w:color="BFBFBF" w:themeColor="background1" w:themeShade="BF" w:shadow="1"/>
+          <w:bottom w:val="single" w:sz="6" w:space="1" w:color="BFBFBF" w:themeColor="background1" w:themeShade="BF" w:shadow="1"/>
+          <w:right w:val="single" w:sz="6" w:space="4" w:color="BFBFBF" w:themeColor="background1" w:themeShade="BF" w:shadow="1"/>
+        </w:pBdr>
         <w:shd w:val="clear" w:color="auto" w:fill="F4F4F4"/>
         <w:spacing w:after="0"/>
         <w:ind w:left="360" w:right="360"/>
@@ -10242,6 +10498,12 @@
     </w:p>
     <w:p>
       <w:pPr>
+        <w:pBdr>
+          <w:top w:val="single" w:sz="6" w:space="1" w:color="BFBFBF" w:themeColor="background1" w:themeShade="BF" w:shadow="1"/>
+          <w:left w:val="single" w:sz="6" w:space="4" w:color="BFBFBF" w:themeColor="background1" w:themeShade="BF" w:shadow="1"/>
+          <w:bottom w:val="single" w:sz="6" w:space="1" w:color="BFBFBF" w:themeColor="background1" w:themeShade="BF" w:shadow="1"/>
+          <w:right w:val="single" w:sz="6" w:space="4" w:color="BFBFBF" w:themeColor="background1" w:themeShade="BF" w:shadow="1"/>
+        </w:pBdr>
         <w:shd w:val="clear" w:color="auto" w:fill="F4F4F4"/>
         <w:spacing w:after="0"/>
         <w:ind w:left="360" w:right="360"/>
@@ -10376,7 +10638,7 @@
           <w:szCs w:val="20"/>
           <w:shd w:val="clear" w:color="auto" w:fill="F4F4F4"/>
         </w:rPr>
-        <w:t xml:space="preserve">() </w:t>
+        <w:t>()</w:t>
       </w:r>
       <w:r>
         <w:rPr>
@@ -10446,6 +10708,12 @@
       <w:pPr>
         <w:spacing w:before="80" w:after="140"/>
         <w:jc w:val="both"/>
+        <w:rPr>
+          <w:rFonts w:ascii="Arial" w:eastAsia="Arial" w:hAnsi="Arial" w:cs="Arial"/>
+          <w:color w:val="1A1A2E"/>
+          <w:sz w:val="22"/>
+          <w:szCs w:val="22"/>
+        </w:rPr>
       </w:pPr>
       <w:r>
         <w:rPr>
@@ -10454,8 +10722,18 @@
           <w:sz w:val="22"/>
           <w:szCs w:val="22"/>
         </w:rPr>
-        <w:t xml:space="preserve">Pre funkciu </w:t>
-      </w:r>
+        <w:t>Funkcia</w:t>
+      </w:r>
+      <w:r>
+        <w:rPr>
+          <w:rFonts w:ascii="Arial" w:eastAsia="Arial" w:hAnsi="Arial" w:cs="Arial"/>
+          <w:color w:val="1A1A2E"/>
+          <w:sz w:val="22"/>
+          <w:szCs w:val="22"/>
+        </w:rPr>
+        <w:t xml:space="preserve"> </w:t>
+      </w:r>
+      <w:proofErr w:type="spellStart"/>
       <w:r>
         <w:rPr>
           <w:rFonts w:ascii="Courier New" w:eastAsia="Courier New" w:hAnsi="Courier New" w:cs="Courier New"/>
@@ -10464,8 +10742,194 @@
           <w:szCs w:val="20"/>
           <w:shd w:val="clear" w:color="auto" w:fill="F4F4F4"/>
         </w:rPr>
+        <w:t>BDD_create_with_best_order</w:t>
+      </w:r>
+      <w:proofErr w:type="spellEnd"/>
+      <w:r>
+        <w:rPr>
+          <w:rFonts w:ascii="Arial" w:eastAsia="Arial" w:hAnsi="Arial" w:cs="Arial"/>
+          <w:color w:val="1A1A2E"/>
+          <w:sz w:val="22"/>
+          <w:szCs w:val="22"/>
+        </w:rPr>
+        <w:t xml:space="preserve"> sa overuje rovnakým spôsobom ako </w:t>
+      </w:r>
+      <w:proofErr w:type="spellStart"/>
+      <w:r>
+        <w:rPr>
+          <w:rFonts w:ascii="Courier New" w:eastAsia="Courier New" w:hAnsi="Courier New" w:cs="Courier New"/>
+          <w:color w:val="1F2D3D"/>
+          <w:sz w:val="20"/>
+          <w:szCs w:val="20"/>
+          <w:shd w:val="clear" w:color="auto" w:fill="F4F4F4"/>
+        </w:rPr>
+        <w:t>BDD_create</w:t>
+      </w:r>
+      <w:proofErr w:type="spellEnd"/>
+      <w:r>
+        <w:rPr>
+          <w:rFonts w:ascii="Arial" w:eastAsia="Arial" w:hAnsi="Arial" w:cs="Arial"/>
+          <w:color w:val="1A1A2E"/>
+          <w:sz w:val="22"/>
+          <w:szCs w:val="22"/>
+        </w:rPr>
+        <w:t xml:space="preserve">. Funkcia </w:t>
+      </w:r>
+      <w:proofErr w:type="spellStart"/>
+      <w:r>
+        <w:rPr>
+          <w:rFonts w:ascii="Courier New" w:eastAsia="Courier New" w:hAnsi="Courier New" w:cs="Courier New"/>
+          <w:color w:val="1F2D3D"/>
+          <w:sz w:val="20"/>
+          <w:szCs w:val="20"/>
+          <w:shd w:val="clear" w:color="auto" w:fill="F4F4F4"/>
+        </w:rPr>
+        <w:t>verify_bdd</w:t>
+      </w:r>
+      <w:proofErr w:type="spellEnd"/>
+      <w:r>
+        <w:rPr>
+          <w:rFonts w:ascii="Courier New" w:eastAsia="Courier New" w:hAnsi="Courier New" w:cs="Courier New"/>
+          <w:color w:val="1F2D3D"/>
+          <w:sz w:val="20"/>
+          <w:szCs w:val="20"/>
+          <w:shd w:val="clear" w:color="auto" w:fill="F4F4F4"/>
+        </w:rPr>
+        <w:t>()</w:t>
+      </w:r>
+      <w:r>
+        <w:rPr>
+          <w:rFonts w:ascii="Arial" w:eastAsia="Arial" w:hAnsi="Arial" w:cs="Arial"/>
+          <w:color w:val="1A1A2E"/>
+          <w:sz w:val="22"/>
+          <w:szCs w:val="22"/>
+        </w:rPr>
+        <w:t xml:space="preserve"> vždy </w:t>
+      </w:r>
+      <w:proofErr w:type="spellStart"/>
+      <w:r>
+        <w:rPr>
+          <w:rFonts w:ascii="Arial" w:eastAsia="Arial" w:hAnsi="Arial" w:cs="Arial"/>
+          <w:color w:val="1A1A2E"/>
+          <w:sz w:val="22"/>
+          <w:szCs w:val="22"/>
+        </w:rPr>
+        <w:t>premapuje</w:t>
+      </w:r>
+      <w:proofErr w:type="spellEnd"/>
+      <w:r>
+        <w:rPr>
+          <w:rFonts w:ascii="Arial" w:eastAsia="Arial" w:hAnsi="Arial" w:cs="Arial"/>
+          <w:color w:val="1A1A2E"/>
+          <w:sz w:val="22"/>
+          <w:szCs w:val="22"/>
+        </w:rPr>
+        <w:t xml:space="preserve"> vstupný vektor z abecedného poradia do poradia </w:t>
+      </w:r>
+      <w:proofErr w:type="spellStart"/>
+      <w:r>
+        <w:rPr>
+          <w:rFonts w:ascii="Courier New" w:eastAsia="Courier New" w:hAnsi="Courier New" w:cs="Courier New"/>
+          <w:color w:val="1F2D3D"/>
+          <w:sz w:val="20"/>
+          <w:szCs w:val="20"/>
+          <w:shd w:val="clear" w:color="auto" w:fill="F4F4F4"/>
+        </w:rPr>
+        <w:t>bdd</w:t>
+      </w:r>
+      <w:proofErr w:type="spellEnd"/>
+      <w:r>
+        <w:rPr>
+          <w:rFonts w:ascii="Courier New" w:eastAsia="Courier New" w:hAnsi="Courier New" w:cs="Courier New"/>
+          <w:color w:val="1F2D3D"/>
+          <w:sz w:val="20"/>
+          <w:szCs w:val="20"/>
+          <w:shd w:val="clear" w:color="auto" w:fill="F4F4F4"/>
+        </w:rPr>
+        <w:t>-&gt;</w:t>
+      </w:r>
+      <w:proofErr w:type="spellStart"/>
+      <w:r>
+        <w:rPr>
+          <w:rFonts w:ascii="Courier New" w:eastAsia="Courier New" w:hAnsi="Courier New" w:cs="Courier New"/>
+          <w:color w:val="1F2D3D"/>
+          <w:sz w:val="20"/>
+          <w:szCs w:val="20"/>
+          <w:shd w:val="clear" w:color="auto" w:fill="F4F4F4"/>
+        </w:rPr>
+        <w:t>varOrder</w:t>
+      </w:r>
+      <w:proofErr w:type="spellEnd"/>
+      <w:r>
+        <w:rPr>
+          <w:rFonts w:ascii="Arial" w:eastAsia="Arial" w:hAnsi="Arial" w:cs="Arial"/>
+          <w:color w:val="1A1A2E"/>
+          <w:sz w:val="22"/>
+          <w:szCs w:val="22"/>
+        </w:rPr>
+        <w:t xml:space="preserve">, pretože </w:t>
+      </w:r>
+      <w:proofErr w:type="spellStart"/>
+      <w:r>
+        <w:rPr>
+          <w:rFonts w:ascii="Courier New" w:eastAsia="Courier New" w:hAnsi="Courier New" w:cs="Courier New"/>
+          <w:color w:val="1F2D3D"/>
+          <w:sz w:val="20"/>
+          <w:szCs w:val="20"/>
+          <w:shd w:val="clear" w:color="auto" w:fill="F4F4F4"/>
+        </w:rPr>
+        <w:t>BDD_use</w:t>
+      </w:r>
+      <w:proofErr w:type="spellEnd"/>
+      <w:r>
+        <w:rPr>
+          <w:rFonts w:ascii="Courier New" w:eastAsia="Courier New" w:hAnsi="Courier New" w:cs="Courier New"/>
+          <w:color w:val="1F2D3D"/>
+          <w:sz w:val="20"/>
+          <w:szCs w:val="20"/>
+          <w:shd w:val="clear" w:color="auto" w:fill="F4F4F4"/>
+        </w:rPr>
+        <w:t>()</w:t>
+      </w:r>
+      <w:r>
+        <w:rPr>
+          <w:rFonts w:ascii="Arial" w:eastAsia="Arial" w:hAnsi="Arial" w:cs="Arial"/>
+          <w:color w:val="1A1A2E"/>
+          <w:sz w:val="22"/>
+          <w:szCs w:val="22"/>
+        </w:rPr>
+        <w:t xml:space="preserve"> očakáva vstupy práve v tomto poradí. </w:t>
+      </w:r>
+      <w:proofErr w:type="spellStart"/>
+      <w:r>
+        <w:rPr>
+          <w:rFonts w:ascii="Arial" w:eastAsia="Arial" w:hAnsi="Arial" w:cs="Arial"/>
+          <w:color w:val="1A1A2E"/>
+          <w:sz w:val="22"/>
+          <w:szCs w:val="22"/>
+        </w:rPr>
+        <w:t>Premapovanie</w:t>
+      </w:r>
+      <w:proofErr w:type="spellEnd"/>
+      <w:r>
+        <w:rPr>
+          <w:rFonts w:ascii="Arial" w:eastAsia="Arial" w:hAnsi="Arial" w:cs="Arial"/>
+          <w:color w:val="1A1A2E"/>
+          <w:sz w:val="22"/>
+          <w:szCs w:val="22"/>
+        </w:rPr>
         <w:t xml:space="preserve"> </w:t>
       </w:r>
+      <w:r>
+        <w:rPr>
+          <w:rFonts w:ascii="Arial" w:eastAsia="Arial" w:hAnsi="Arial" w:cs="Arial"/>
+          <w:color w:val="1A1A2E"/>
+          <w:sz w:val="22"/>
+          <w:szCs w:val="22"/>
+        </w:rPr>
+        <w:lastRenderedPageBreak/>
+        <w:t xml:space="preserve">funguje tak, že pre každú pozíciu v </w:t>
+      </w:r>
       <w:proofErr w:type="spellStart"/>
       <w:r>
         <w:rPr>
@@ -10475,59 +10939,201 @@
           <w:szCs w:val="20"/>
           <w:shd w:val="clear" w:color="auto" w:fill="F4F4F4"/>
         </w:rPr>
+        <w:t>varOrder</w:t>
+      </w:r>
+      <w:proofErr w:type="spellEnd"/>
+      <w:r>
+        <w:rPr>
+          <w:rFonts w:ascii="Arial" w:eastAsia="Arial" w:hAnsi="Arial" w:cs="Arial"/>
+          <w:color w:val="1A1A2E"/>
+          <w:sz w:val="22"/>
+          <w:szCs w:val="22"/>
+        </w:rPr>
+        <w:t xml:space="preserve"> sa nájde pozícia tej istej premennej v abecednom poradí a skopíruje sa zodpovedajúca hodnota. </w:t>
+      </w:r>
+      <w:proofErr w:type="spellStart"/>
+      <w:r>
+        <w:rPr>
+          <w:rFonts w:ascii="Arial" w:eastAsia="Arial" w:hAnsi="Arial" w:cs="Arial"/>
+          <w:color w:val="1A1A2E"/>
+          <w:sz w:val="22"/>
+          <w:szCs w:val="22"/>
+        </w:rPr>
+        <w:t>P</w:t>
+      </w:r>
+      <w:r>
+        <w:rPr>
+          <w:rFonts w:ascii="Arial" w:eastAsia="Arial" w:hAnsi="Arial" w:cs="Arial"/>
+          <w:color w:val="1A1A2E"/>
+          <w:sz w:val="22"/>
+          <w:szCs w:val="22"/>
+        </w:rPr>
+        <w:t>remapovanie</w:t>
+      </w:r>
+      <w:proofErr w:type="spellEnd"/>
+      <w:r>
+        <w:rPr>
+          <w:rFonts w:ascii="Arial" w:eastAsia="Arial" w:hAnsi="Arial" w:cs="Arial"/>
+          <w:color w:val="1A1A2E"/>
+          <w:sz w:val="22"/>
+          <w:szCs w:val="22"/>
+        </w:rPr>
+        <w:t xml:space="preserve"> je </w:t>
+      </w:r>
+      <w:r>
+        <w:rPr>
+          <w:rFonts w:ascii="Arial" w:eastAsia="Arial" w:hAnsi="Arial" w:cs="Arial"/>
+          <w:color w:val="1A1A2E"/>
+          <w:sz w:val="22"/>
+          <w:szCs w:val="22"/>
+        </w:rPr>
+        <w:t xml:space="preserve">súčasťou </w:t>
+      </w:r>
+      <w:proofErr w:type="spellStart"/>
+      <w:r>
+        <w:rPr>
+          <w:rFonts w:ascii="Courier New" w:eastAsia="Courier New" w:hAnsi="Courier New" w:cs="Courier New"/>
+          <w:color w:val="1F2D3D"/>
+          <w:sz w:val="20"/>
+          <w:szCs w:val="20"/>
+          <w:shd w:val="clear" w:color="auto" w:fill="F4F4F4"/>
+        </w:rPr>
+        <w:t>verify_bdd</w:t>
+      </w:r>
+      <w:proofErr w:type="spellEnd"/>
+      <w:r>
+        <w:rPr>
+          <w:rFonts w:ascii="Courier New" w:eastAsia="Courier New" w:hAnsi="Courier New" w:cs="Courier New"/>
+          <w:color w:val="1F2D3D"/>
+          <w:sz w:val="20"/>
+          <w:szCs w:val="20"/>
+          <w:shd w:val="clear" w:color="auto" w:fill="F4F4F4"/>
+        </w:rPr>
+        <w:t>()</w:t>
+      </w:r>
+      <w:r>
+        <w:rPr>
+          <w:rFonts w:ascii="Arial" w:eastAsia="Arial" w:hAnsi="Arial" w:cs="Arial"/>
+          <w:color w:val="1A1A2E"/>
+          <w:sz w:val="22"/>
+          <w:szCs w:val="22"/>
+        </w:rPr>
+        <w:t xml:space="preserve"> </w:t>
+      </w:r>
+      <w:r>
+        <w:rPr>
+          <w:rFonts w:ascii="Arial" w:eastAsia="Arial" w:hAnsi="Arial" w:cs="Arial"/>
+          <w:color w:val="1A1A2E"/>
+          <w:sz w:val="22"/>
+          <w:szCs w:val="22"/>
+        </w:rPr>
+        <w:t xml:space="preserve"> </w:t>
+      </w:r>
+      <w:r>
+        <w:rPr>
+          <w:rFonts w:ascii="Arial" w:eastAsia="Arial" w:hAnsi="Arial" w:cs="Arial"/>
+          <w:color w:val="1A1A2E"/>
+          <w:sz w:val="22"/>
+          <w:szCs w:val="22"/>
+        </w:rPr>
+        <w:t>vždy, bez ohľadu na to, či bol BDD vytvoren</w:t>
+      </w:r>
+      <w:r>
+        <w:rPr>
+          <w:rFonts w:ascii="Arial" w:eastAsia="Arial" w:hAnsi="Arial" w:cs="Arial"/>
+          <w:color w:val="1A1A2E"/>
+          <w:sz w:val="22"/>
+          <w:szCs w:val="22"/>
+        </w:rPr>
+        <w:t>ý</w:t>
+      </w:r>
+      <w:r>
+        <w:rPr>
+          <w:rFonts w:ascii="Arial" w:eastAsia="Arial" w:hAnsi="Arial" w:cs="Arial"/>
+          <w:color w:val="1A1A2E"/>
+          <w:sz w:val="22"/>
+          <w:szCs w:val="22"/>
+        </w:rPr>
+        <w:t xml:space="preserve"> cez</w:t>
+      </w:r>
+      <w:r>
+        <w:rPr>
+          <w:rFonts w:ascii="Arial" w:eastAsia="Arial" w:hAnsi="Arial" w:cs="Arial"/>
+          <w:color w:val="1A1A2E"/>
+          <w:sz w:val="22"/>
+          <w:szCs w:val="22"/>
+        </w:rPr>
+        <w:t xml:space="preserve"> </w:t>
+      </w:r>
+      <w:proofErr w:type="spellStart"/>
+      <w:r>
+        <w:rPr>
+          <w:rFonts w:ascii="Courier New" w:eastAsia="Courier New" w:hAnsi="Courier New" w:cs="Courier New"/>
+          <w:color w:val="1F2D3D"/>
+          <w:sz w:val="20"/>
+          <w:szCs w:val="20"/>
+          <w:shd w:val="clear" w:color="auto" w:fill="F4F4F4"/>
+        </w:rPr>
+        <w:t>BDD_create</w:t>
+      </w:r>
+      <w:proofErr w:type="spellEnd"/>
+      <w:r>
+        <w:rPr>
+          <w:rFonts w:ascii="Arial" w:eastAsia="Arial" w:hAnsi="Arial" w:cs="Arial"/>
+          <w:color w:val="1A1A2E"/>
+          <w:sz w:val="22"/>
+          <w:szCs w:val="22"/>
+        </w:rPr>
+        <w:t xml:space="preserve"> a</w:t>
+      </w:r>
+      <w:r>
+        <w:rPr>
+          <w:rFonts w:ascii="Arial" w:eastAsia="Arial" w:hAnsi="Arial" w:cs="Arial"/>
+          <w:color w:val="1A1A2E"/>
+          <w:sz w:val="22"/>
+          <w:szCs w:val="22"/>
+        </w:rPr>
+        <w:t>lebo</w:t>
+      </w:r>
+      <w:r>
+        <w:rPr>
+          <w:rFonts w:ascii="Arial" w:eastAsia="Arial" w:hAnsi="Arial" w:cs="Arial"/>
+          <w:color w:val="1A1A2E"/>
+          <w:sz w:val="22"/>
+          <w:szCs w:val="22"/>
+        </w:rPr>
+        <w:t xml:space="preserve"> </w:t>
+      </w:r>
+      <w:r>
+        <w:rPr>
+          <w:rFonts w:ascii="Courier New" w:eastAsia="Courier New" w:hAnsi="Courier New" w:cs="Courier New"/>
+          <w:color w:val="1F2D3D"/>
+          <w:sz w:val="20"/>
+          <w:szCs w:val="20"/>
+          <w:shd w:val="clear" w:color="auto" w:fill="F4F4F4"/>
+        </w:rPr>
+        <w:t xml:space="preserve"> </w:t>
+      </w:r>
+      <w:proofErr w:type="spellStart"/>
+      <w:r>
+        <w:rPr>
+          <w:rFonts w:ascii="Courier New" w:eastAsia="Courier New" w:hAnsi="Courier New" w:cs="Courier New"/>
+          <w:color w:val="1F2D3D"/>
+          <w:sz w:val="20"/>
+          <w:szCs w:val="20"/>
+          <w:shd w:val="clear" w:color="auto" w:fill="F4F4F4"/>
+        </w:rPr>
         <w:t>BDD_create_with_best_order</w:t>
       </w:r>
       <w:proofErr w:type="spellEnd"/>
       <w:r>
         <w:rPr>
-          <w:rFonts w:ascii="Courier New" w:eastAsia="Courier New" w:hAnsi="Courier New" w:cs="Courier New"/>
-          <w:color w:val="1F2D3D"/>
-          <w:sz w:val="20"/>
-          <w:szCs w:val="20"/>
-          <w:shd w:val="clear" w:color="auto" w:fill="F4F4F4"/>
-        </w:rPr>
-        <w:t xml:space="preserve"> </w:t>
-      </w:r>
-      <w:r>
-        <w:rPr>
           <w:rFonts w:ascii="Arial" w:eastAsia="Arial" w:hAnsi="Arial" w:cs="Arial"/>
           <w:color w:val="1A1A2E"/>
           <w:sz w:val="22"/>
           <w:szCs w:val="22"/>
         </w:rPr>
-        <w:t xml:space="preserve"> je overenie o niečo zložitejšie, pretože BDD môže mať odlišné poradie premenných ako lexikografické. Funkcia </w:t>
-      </w:r>
-      <w:r>
-        <w:rPr>
-          <w:rFonts w:ascii="Courier New" w:eastAsia="Courier New" w:hAnsi="Courier New" w:cs="Courier New"/>
-          <w:color w:val="1F2D3D"/>
-          <w:sz w:val="20"/>
-          <w:szCs w:val="20"/>
-          <w:shd w:val="clear" w:color="auto" w:fill="F4F4F4"/>
-        </w:rPr>
-        <w:t xml:space="preserve"> </w:t>
-      </w:r>
-      <w:proofErr w:type="spellStart"/>
-      <w:r>
-        <w:rPr>
-          <w:rFonts w:ascii="Courier New" w:eastAsia="Courier New" w:hAnsi="Courier New" w:cs="Courier New"/>
-          <w:color w:val="1F2D3D"/>
-          <w:sz w:val="20"/>
-          <w:szCs w:val="20"/>
-          <w:shd w:val="clear" w:color="auto" w:fill="F4F4F4"/>
-        </w:rPr>
-        <w:t>verify_bdd</w:t>
-      </w:r>
-      <w:proofErr w:type="spellEnd"/>
-      <w:r>
-        <w:rPr>
-          <w:rFonts w:ascii="Courier New" w:eastAsia="Courier New" w:hAnsi="Courier New" w:cs="Courier New"/>
-          <w:color w:val="1F2D3D"/>
-          <w:sz w:val="20"/>
-          <w:szCs w:val="20"/>
-          <w:shd w:val="clear" w:color="auto" w:fill="F4F4F4"/>
-        </w:rPr>
-        <w:t xml:space="preserve">() </w:t>
+        <w:t>. P</w:t>
       </w:r>
       <w:r>
         <w:rPr>
@@ -10536,9 +11142,8 @@
           <w:sz w:val="22"/>
           <w:szCs w:val="22"/>
         </w:rPr>
-        <w:t xml:space="preserve"> toto rieši explicitným </w:t>
-      </w:r>
-      <w:proofErr w:type="spellStart"/>
+        <w:t xml:space="preserve">ri lexikografickom poradí </w:t>
+      </w:r>
       <w:r>
         <w:rPr>
           <w:rFonts w:ascii="Arial" w:eastAsia="Arial" w:hAnsi="Arial" w:cs="Arial"/>
@@ -10546,9 +11151,9 @@
           <w:sz w:val="22"/>
           <w:szCs w:val="22"/>
         </w:rPr>
-        <w:t>premapovaním</w:t>
-      </w:r>
-      <w:proofErr w:type="spellEnd"/>
+        <w:t xml:space="preserve">je výsledok </w:t>
+      </w:r>
+      <w:proofErr w:type="spellStart"/>
       <w:r>
         <w:rPr>
           <w:rFonts w:ascii="Arial" w:eastAsia="Arial" w:hAnsi="Arial" w:cs="Arial"/>
@@ -10556,8 +11161,9 @@
           <w:sz w:val="22"/>
           <w:szCs w:val="22"/>
         </w:rPr>
-        <w:t xml:space="preserve"> vstupov</w:t>
-      </w:r>
+        <w:t>premapovanie</w:t>
+      </w:r>
+      <w:proofErr w:type="spellEnd"/>
       <w:r>
         <w:rPr>
           <w:rFonts w:ascii="Arial" w:eastAsia="Arial" w:hAnsi="Arial" w:cs="Arial"/>
@@ -10565,62 +11171,13 @@
           <w:sz w:val="22"/>
           <w:szCs w:val="22"/>
         </w:rPr>
-        <w:t>.</w:t>
-      </w:r>
-      <w:r>
-        <w:rPr>
-          <w:rFonts w:ascii="Arial" w:eastAsia="Arial" w:hAnsi="Arial" w:cs="Arial"/>
-          <w:color w:val="1A1A2E"/>
-          <w:sz w:val="22"/>
-          <w:szCs w:val="22"/>
-        </w:rPr>
-        <w:t xml:space="preserve"> pre každú premennú, ktorú BDD pozná, vyhľadá jej pozíciu v pôvodnom poradí a podľa toho zostaví správny vstupný reťazec pre </w:t>
-      </w:r>
-      <w:r>
-        <w:rPr>
-          <w:rFonts w:ascii="Courier New" w:eastAsia="Courier New" w:hAnsi="Courier New" w:cs="Courier New"/>
-          <w:color w:val="1F2D3D"/>
-          <w:sz w:val="20"/>
-          <w:szCs w:val="20"/>
-          <w:shd w:val="clear" w:color="auto" w:fill="F4F4F4"/>
-        </w:rPr>
-        <w:t xml:space="preserve"> </w:t>
-      </w:r>
-      <w:proofErr w:type="spellStart"/>
-      <w:r>
-        <w:rPr>
-          <w:rFonts w:ascii="Courier New" w:eastAsia="Courier New" w:hAnsi="Courier New" w:cs="Courier New"/>
-          <w:color w:val="1F2D3D"/>
-          <w:sz w:val="20"/>
-          <w:szCs w:val="20"/>
-          <w:shd w:val="clear" w:color="auto" w:fill="F4F4F4"/>
-        </w:rPr>
-        <w:t>BDD_use</w:t>
-      </w:r>
-      <w:proofErr w:type="spellEnd"/>
-      <w:r>
-        <w:rPr>
-          <w:rFonts w:ascii="Courier New" w:eastAsia="Courier New" w:hAnsi="Courier New" w:cs="Courier New"/>
-          <w:color w:val="1F2D3D"/>
-          <w:sz w:val="20"/>
-          <w:szCs w:val="20"/>
-          <w:shd w:val="clear" w:color="auto" w:fill="F4F4F4"/>
-        </w:rPr>
-        <w:t xml:space="preserve">() </w:t>
-      </w:r>
-      <w:r>
-        <w:rPr>
-          <w:rFonts w:ascii="Arial" w:eastAsia="Arial" w:hAnsi="Arial" w:cs="Arial"/>
-          <w:color w:val="1A1A2E"/>
-          <w:sz w:val="22"/>
-          <w:szCs w:val="22"/>
-        </w:rPr>
-        <w:t>.</w:t>
+        <w:t xml:space="preserve"> totožný so vstupom, no kód sa nijak nerozlišuje.</w:t>
       </w:r>
     </w:p>
     <w:p>
       <w:pPr>
-        <w:spacing w:after="100"/>
+        <w:spacing w:before="80" w:after="140"/>
+        <w:jc w:val="both"/>
       </w:pPr>
     </w:p>
     <w:p>
@@ -10636,7 +11193,6 @@
           <w:sz w:val="28"/>
           <w:szCs w:val="28"/>
         </w:rPr>
-        <w:lastRenderedPageBreak/>
         <w:t>4.5  Skupiny premenných a rozsah testovania</w:t>
       </w:r>
     </w:p>
@@ -10669,12 +11225,12 @@
       <w:tblPr>
         <w:tblW w:w="9360" w:type="dxa"/>
         <w:tblBorders>
-          <w:top w:val="single" w:sz="4" w:space="0" w:color="auto"/>
-          <w:left w:val="single" w:sz="4" w:space="0" w:color="auto"/>
-          <w:bottom w:val="single" w:sz="4" w:space="0" w:color="auto"/>
-          <w:right w:val="single" w:sz="4" w:space="0" w:color="auto"/>
-          <w:insideH w:val="single" w:sz="4" w:space="0" w:color="auto"/>
-          <w:insideV w:val="single" w:sz="4" w:space="0" w:color="auto"/>
+          <w:top w:val="single" w:sz="6" w:space="0" w:color="BFBFBF" w:themeColor="background1" w:themeShade="BF"/>
+          <w:left w:val="single" w:sz="6" w:space="0" w:color="BFBFBF" w:themeColor="background1" w:themeShade="BF"/>
+          <w:bottom w:val="single" w:sz="6" w:space="0" w:color="BFBFBF" w:themeColor="background1" w:themeShade="BF"/>
+          <w:right w:val="single" w:sz="6" w:space="0" w:color="BFBFBF" w:themeColor="background1" w:themeShade="BF"/>
+          <w:insideH w:val="single" w:sz="12" w:space="0" w:color="BFBFBF" w:themeColor="background1" w:themeShade="BF"/>
+          <w:insideV w:val="single" w:sz="12" w:space="0" w:color="BFBFBF" w:themeColor="background1" w:themeShade="BF"/>
         </w:tblBorders>
         <w:tblCellMar>
           <w:left w:w="10" w:type="dxa"/>
@@ -10691,12 +11247,6 @@
         <w:tc>
           <w:tcPr>
             <w:tcW w:w="3120" w:type="dxa"/>
-            <w:tcBorders>
-              <w:top w:val="single" w:sz="1" w:space="0" w:color="ADB9CA"/>
-              <w:left w:val="single" w:sz="1" w:space="0" w:color="ADB9CA"/>
-              <w:bottom w:val="single" w:sz="1" w:space="0" w:color="ADB9CA"/>
-              <w:right w:val="single" w:sz="1" w:space="0" w:color="ADB9CA"/>
-            </w:tcBorders>
             <w:shd w:val="clear" w:color="auto" w:fill="DEEAF1"/>
             <w:tcMar>
               <w:top w:w="80" w:type="dxa"/>
@@ -10725,12 +11275,6 @@
         <w:tc>
           <w:tcPr>
             <w:tcW w:w="3120" w:type="dxa"/>
-            <w:tcBorders>
-              <w:top w:val="single" w:sz="1" w:space="0" w:color="ADB9CA"/>
-              <w:left w:val="single" w:sz="1" w:space="0" w:color="ADB9CA"/>
-              <w:bottom w:val="single" w:sz="1" w:space="0" w:color="ADB9CA"/>
-              <w:right w:val="single" w:sz="1" w:space="0" w:color="ADB9CA"/>
-            </w:tcBorders>
             <w:shd w:val="clear" w:color="auto" w:fill="DEEAF1"/>
             <w:tcMar>
               <w:top w:w="80" w:type="dxa"/>
@@ -10759,12 +11303,6 @@
         <w:tc>
           <w:tcPr>
             <w:tcW w:w="3120" w:type="dxa"/>
-            <w:tcBorders>
-              <w:top w:val="single" w:sz="1" w:space="0" w:color="ADB9CA"/>
-              <w:left w:val="single" w:sz="1" w:space="0" w:color="ADB9CA"/>
-              <w:bottom w:val="single" w:sz="1" w:space="0" w:color="ADB9CA"/>
-              <w:right w:val="single" w:sz="1" w:space="0" w:color="ADB9CA"/>
-            </w:tcBorders>
             <w:shd w:val="clear" w:color="auto" w:fill="DEEAF1"/>
             <w:tcMar>
               <w:top w:w="80" w:type="dxa"/>
@@ -10795,12 +11333,6 @@
         <w:tc>
           <w:tcPr>
             <w:tcW w:w="3120" w:type="dxa"/>
-            <w:tcBorders>
-              <w:top w:val="single" w:sz="1" w:space="0" w:color="ADB9CA"/>
-              <w:left w:val="single" w:sz="1" w:space="0" w:color="ADB9CA"/>
-              <w:bottom w:val="single" w:sz="1" w:space="0" w:color="ADB9CA"/>
-              <w:right w:val="single" w:sz="1" w:space="0" w:color="ADB9CA"/>
-            </w:tcBorders>
             <w:shd w:val="clear" w:color="auto" w:fill="FFFFFF"/>
             <w:tcMar>
               <w:top w:w="80" w:type="dxa"/>
@@ -10827,12 +11359,6 @@
         <w:tc>
           <w:tcPr>
             <w:tcW w:w="3120" w:type="dxa"/>
-            <w:tcBorders>
-              <w:top w:val="single" w:sz="1" w:space="0" w:color="ADB9CA"/>
-              <w:left w:val="single" w:sz="1" w:space="0" w:color="ADB9CA"/>
-              <w:bottom w:val="single" w:sz="1" w:space="0" w:color="ADB9CA"/>
-              <w:right w:val="single" w:sz="1" w:space="0" w:color="ADB9CA"/>
-            </w:tcBorders>
             <w:shd w:val="clear" w:color="auto" w:fill="FFFFFF"/>
             <w:tcMar>
               <w:top w:w="80" w:type="dxa"/>
@@ -10859,12 +11385,6 @@
         <w:tc>
           <w:tcPr>
             <w:tcW w:w="3120" w:type="dxa"/>
-            <w:tcBorders>
-              <w:top w:val="single" w:sz="1" w:space="0" w:color="ADB9CA"/>
-              <w:left w:val="single" w:sz="1" w:space="0" w:color="ADB9CA"/>
-              <w:bottom w:val="single" w:sz="1" w:space="0" w:color="ADB9CA"/>
-              <w:right w:val="single" w:sz="1" w:space="0" w:color="ADB9CA"/>
-            </w:tcBorders>
             <w:shd w:val="clear" w:color="auto" w:fill="FFFFFF"/>
             <w:tcMar>
               <w:top w:w="80" w:type="dxa"/>
@@ -10893,12 +11413,6 @@
         <w:tc>
           <w:tcPr>
             <w:tcW w:w="3120" w:type="dxa"/>
-            <w:tcBorders>
-              <w:top w:val="single" w:sz="1" w:space="0" w:color="ADB9CA"/>
-              <w:left w:val="single" w:sz="1" w:space="0" w:color="ADB9CA"/>
-              <w:bottom w:val="single" w:sz="1" w:space="0" w:color="ADB9CA"/>
-              <w:right w:val="single" w:sz="1" w:space="0" w:color="ADB9CA"/>
-            </w:tcBorders>
             <w:shd w:val="clear" w:color="auto" w:fill="F2F7FB"/>
             <w:tcMar>
               <w:top w:w="80" w:type="dxa"/>
@@ -10925,12 +11439,6 @@
         <w:tc>
           <w:tcPr>
             <w:tcW w:w="3120" w:type="dxa"/>
-            <w:tcBorders>
-              <w:top w:val="single" w:sz="1" w:space="0" w:color="ADB9CA"/>
-              <w:left w:val="single" w:sz="1" w:space="0" w:color="ADB9CA"/>
-              <w:bottom w:val="single" w:sz="1" w:space="0" w:color="ADB9CA"/>
-              <w:right w:val="single" w:sz="1" w:space="0" w:color="ADB9CA"/>
-            </w:tcBorders>
             <w:shd w:val="clear" w:color="auto" w:fill="F2F7FB"/>
             <w:tcMar>
               <w:top w:w="80" w:type="dxa"/>
@@ -10957,12 +11465,6 @@
         <w:tc>
           <w:tcPr>
             <w:tcW w:w="3120" w:type="dxa"/>
-            <w:tcBorders>
-              <w:top w:val="single" w:sz="1" w:space="0" w:color="ADB9CA"/>
-              <w:left w:val="single" w:sz="1" w:space="0" w:color="ADB9CA"/>
-              <w:bottom w:val="single" w:sz="1" w:space="0" w:color="ADB9CA"/>
-              <w:right w:val="single" w:sz="1" w:space="0" w:color="ADB9CA"/>
-            </w:tcBorders>
             <w:shd w:val="clear" w:color="auto" w:fill="F2F7FB"/>
             <w:tcMar>
               <w:top w:w="80" w:type="dxa"/>
@@ -10991,12 +11493,6 @@
         <w:tc>
           <w:tcPr>
             <w:tcW w:w="3120" w:type="dxa"/>
-            <w:tcBorders>
-              <w:top w:val="single" w:sz="1" w:space="0" w:color="ADB9CA"/>
-              <w:left w:val="single" w:sz="1" w:space="0" w:color="ADB9CA"/>
-              <w:bottom w:val="single" w:sz="1" w:space="0" w:color="ADB9CA"/>
-              <w:right w:val="single" w:sz="1" w:space="0" w:color="ADB9CA"/>
-            </w:tcBorders>
             <w:shd w:val="clear" w:color="auto" w:fill="FFFFFF"/>
             <w:tcMar>
               <w:top w:w="80" w:type="dxa"/>
@@ -11023,12 +11519,6 @@
         <w:tc>
           <w:tcPr>
             <w:tcW w:w="3120" w:type="dxa"/>
-            <w:tcBorders>
-              <w:top w:val="single" w:sz="1" w:space="0" w:color="ADB9CA"/>
-              <w:left w:val="single" w:sz="1" w:space="0" w:color="ADB9CA"/>
-              <w:bottom w:val="single" w:sz="1" w:space="0" w:color="ADB9CA"/>
-              <w:right w:val="single" w:sz="1" w:space="0" w:color="ADB9CA"/>
-            </w:tcBorders>
             <w:shd w:val="clear" w:color="auto" w:fill="FFFFFF"/>
             <w:tcMar>
               <w:top w:w="80" w:type="dxa"/>
@@ -11055,12 +11545,6 @@
         <w:tc>
           <w:tcPr>
             <w:tcW w:w="3120" w:type="dxa"/>
-            <w:tcBorders>
-              <w:top w:val="single" w:sz="1" w:space="0" w:color="ADB9CA"/>
-              <w:left w:val="single" w:sz="1" w:space="0" w:color="ADB9CA"/>
-              <w:bottom w:val="single" w:sz="1" w:space="0" w:color="ADB9CA"/>
-              <w:right w:val="single" w:sz="1" w:space="0" w:color="ADB9CA"/>
-            </w:tcBorders>
             <w:shd w:val="clear" w:color="auto" w:fill="FFFFFF"/>
             <w:tcMar>
               <w:top w:w="80" w:type="dxa"/>
@@ -11089,12 +11573,6 @@
         <w:tc>
           <w:tcPr>
             <w:tcW w:w="3120" w:type="dxa"/>
-            <w:tcBorders>
-              <w:top w:val="single" w:sz="1" w:space="0" w:color="ADB9CA"/>
-              <w:left w:val="single" w:sz="1" w:space="0" w:color="ADB9CA"/>
-              <w:bottom w:val="single" w:sz="1" w:space="0" w:color="ADB9CA"/>
-              <w:right w:val="single" w:sz="1" w:space="0" w:color="ADB9CA"/>
-            </w:tcBorders>
             <w:shd w:val="clear" w:color="auto" w:fill="F2F7FB"/>
             <w:tcMar>
               <w:top w:w="80" w:type="dxa"/>
@@ -11121,12 +11599,6 @@
         <w:tc>
           <w:tcPr>
             <w:tcW w:w="3120" w:type="dxa"/>
-            <w:tcBorders>
-              <w:top w:val="single" w:sz="1" w:space="0" w:color="ADB9CA"/>
-              <w:left w:val="single" w:sz="1" w:space="0" w:color="ADB9CA"/>
-              <w:bottom w:val="single" w:sz="1" w:space="0" w:color="ADB9CA"/>
-              <w:right w:val="single" w:sz="1" w:space="0" w:color="ADB9CA"/>
-            </w:tcBorders>
             <w:shd w:val="clear" w:color="auto" w:fill="F2F7FB"/>
             <w:tcMar>
               <w:top w:w="80" w:type="dxa"/>
@@ -11153,12 +11625,6 @@
         <w:tc>
           <w:tcPr>
             <w:tcW w:w="3120" w:type="dxa"/>
-            <w:tcBorders>
-              <w:top w:val="single" w:sz="1" w:space="0" w:color="ADB9CA"/>
-              <w:left w:val="single" w:sz="1" w:space="0" w:color="ADB9CA"/>
-              <w:bottom w:val="single" w:sz="1" w:space="0" w:color="ADB9CA"/>
-              <w:right w:val="single" w:sz="1" w:space="0" w:color="ADB9CA"/>
-            </w:tcBorders>
             <w:shd w:val="clear" w:color="auto" w:fill="F2F7FB"/>
             <w:tcMar>
               <w:top w:w="80" w:type="dxa"/>
@@ -11187,12 +11653,6 @@
         <w:tc>
           <w:tcPr>
             <w:tcW w:w="3120" w:type="dxa"/>
-            <w:tcBorders>
-              <w:top w:val="single" w:sz="1" w:space="0" w:color="ADB9CA"/>
-              <w:left w:val="single" w:sz="1" w:space="0" w:color="ADB9CA"/>
-              <w:bottom w:val="single" w:sz="1" w:space="0" w:color="ADB9CA"/>
-              <w:right w:val="single" w:sz="1" w:space="0" w:color="ADB9CA"/>
-            </w:tcBorders>
             <w:shd w:val="clear" w:color="auto" w:fill="FFFFFF"/>
             <w:tcMar>
               <w:top w:w="80" w:type="dxa"/>
@@ -11219,12 +11679,6 @@
         <w:tc>
           <w:tcPr>
             <w:tcW w:w="3120" w:type="dxa"/>
-            <w:tcBorders>
-              <w:top w:val="single" w:sz="1" w:space="0" w:color="ADB9CA"/>
-              <w:left w:val="single" w:sz="1" w:space="0" w:color="ADB9CA"/>
-              <w:bottom w:val="single" w:sz="1" w:space="0" w:color="ADB9CA"/>
-              <w:right w:val="single" w:sz="1" w:space="0" w:color="ADB9CA"/>
-            </w:tcBorders>
             <w:shd w:val="clear" w:color="auto" w:fill="FFFFFF"/>
             <w:tcMar>
               <w:top w:w="80" w:type="dxa"/>
@@ -11251,12 +11705,6 @@
         <w:tc>
           <w:tcPr>
             <w:tcW w:w="3120" w:type="dxa"/>
-            <w:tcBorders>
-              <w:top w:val="single" w:sz="1" w:space="0" w:color="ADB9CA"/>
-              <w:left w:val="single" w:sz="1" w:space="0" w:color="ADB9CA"/>
-              <w:bottom w:val="single" w:sz="1" w:space="0" w:color="ADB9CA"/>
-              <w:right w:val="single" w:sz="1" w:space="0" w:color="ADB9CA"/>
-            </w:tcBorders>
             <w:shd w:val="clear" w:color="auto" w:fill="FFFFFF"/>
             <w:tcMar>
               <w:top w:w="80" w:type="dxa"/>
@@ -11285,12 +11733,6 @@
         <w:tc>
           <w:tcPr>
             <w:tcW w:w="3120" w:type="dxa"/>
-            <w:tcBorders>
-              <w:top w:val="single" w:sz="1" w:space="0" w:color="ADB9CA"/>
-              <w:left w:val="single" w:sz="1" w:space="0" w:color="ADB9CA"/>
-              <w:bottom w:val="single" w:sz="1" w:space="0" w:color="ADB9CA"/>
-              <w:right w:val="single" w:sz="1" w:space="0" w:color="ADB9CA"/>
-            </w:tcBorders>
             <w:shd w:val="clear" w:color="auto" w:fill="F2F7FB"/>
             <w:tcMar>
               <w:top w:w="80" w:type="dxa"/>
@@ -11317,12 +11759,6 @@
         <w:tc>
           <w:tcPr>
             <w:tcW w:w="3120" w:type="dxa"/>
-            <w:tcBorders>
-              <w:top w:val="single" w:sz="1" w:space="0" w:color="ADB9CA"/>
-              <w:left w:val="single" w:sz="1" w:space="0" w:color="ADB9CA"/>
-              <w:bottom w:val="single" w:sz="1" w:space="0" w:color="ADB9CA"/>
-              <w:right w:val="single" w:sz="1" w:space="0" w:color="ADB9CA"/>
-            </w:tcBorders>
             <w:shd w:val="clear" w:color="auto" w:fill="F2F7FB"/>
             <w:tcMar>
               <w:top w:w="80" w:type="dxa"/>
@@ -11349,12 +11785,6 @@
         <w:tc>
           <w:tcPr>
             <w:tcW w:w="3120" w:type="dxa"/>
-            <w:tcBorders>
-              <w:top w:val="single" w:sz="1" w:space="0" w:color="ADB9CA"/>
-              <w:left w:val="single" w:sz="1" w:space="0" w:color="ADB9CA"/>
-              <w:bottom w:val="single" w:sz="1" w:space="0" w:color="ADB9CA"/>
-              <w:right w:val="single" w:sz="1" w:space="0" w:color="ADB9CA"/>
-            </w:tcBorders>
             <w:shd w:val="clear" w:color="auto" w:fill="F2F7FB"/>
             <w:tcMar>
               <w:top w:w="80" w:type="dxa"/>
@@ -11383,12 +11813,6 @@
         <w:tc>
           <w:tcPr>
             <w:tcW w:w="3120" w:type="dxa"/>
-            <w:tcBorders>
-              <w:top w:val="single" w:sz="1" w:space="0" w:color="ADB9CA"/>
-              <w:left w:val="single" w:sz="1" w:space="0" w:color="ADB9CA"/>
-              <w:bottom w:val="single" w:sz="1" w:space="0" w:color="ADB9CA"/>
-              <w:right w:val="single" w:sz="1" w:space="0" w:color="ADB9CA"/>
-            </w:tcBorders>
             <w:shd w:val="clear" w:color="auto" w:fill="FFFFFF"/>
             <w:tcMar>
               <w:top w:w="80" w:type="dxa"/>
@@ -11415,12 +11839,6 @@
         <w:tc>
           <w:tcPr>
             <w:tcW w:w="3120" w:type="dxa"/>
-            <w:tcBorders>
-              <w:top w:val="single" w:sz="1" w:space="0" w:color="ADB9CA"/>
-              <w:left w:val="single" w:sz="1" w:space="0" w:color="ADB9CA"/>
-              <w:bottom w:val="single" w:sz="1" w:space="0" w:color="ADB9CA"/>
-              <w:right w:val="single" w:sz="1" w:space="0" w:color="ADB9CA"/>
-            </w:tcBorders>
             <w:shd w:val="clear" w:color="auto" w:fill="FFFFFF"/>
             <w:tcMar>
               <w:top w:w="80" w:type="dxa"/>
@@ -11447,12 +11865,6 @@
         <w:tc>
           <w:tcPr>
             <w:tcW w:w="3120" w:type="dxa"/>
-            <w:tcBorders>
-              <w:top w:val="single" w:sz="1" w:space="0" w:color="ADB9CA"/>
-              <w:left w:val="single" w:sz="1" w:space="0" w:color="ADB9CA"/>
-              <w:bottom w:val="single" w:sz="1" w:space="0" w:color="ADB9CA"/>
-              <w:right w:val="single" w:sz="1" w:space="0" w:color="ADB9CA"/>
-            </w:tcBorders>
             <w:shd w:val="clear" w:color="auto" w:fill="FFFFFF"/>
             <w:tcMar>
               <w:top w:w="80" w:type="dxa"/>
@@ -11495,7 +11907,98 @@
           <w:sz w:val="22"/>
           <w:szCs w:val="22"/>
         </w:rPr>
-        <w:t>Voľba tohto rozsahu nie je náhodná. Pre malé n (3 – 7) je možné výsledky jednoducho overovať aj manuálne a slúžia na overenie základnej správnosti. Pre stredné n (9 – 11) sa naplno prejavuje efekt redukcie – diagram je výrazne menší ako plný strom. Pre veľké n (13 – 15) sa testuje škálovateľnosť implementácie a meria sa čas vykonania, ktorý je pri naivných implementáciách exponenciálny.</w:t>
+        <w:t xml:space="preserve">Voľba tohto rozsahu nie je náhodná. Pre malé n (3 </w:t>
+      </w:r>
+      <w:r>
+        <w:rPr>
+          <w:rFonts w:ascii="Arial" w:eastAsia="Arial" w:hAnsi="Arial" w:cs="Arial"/>
+          <w:color w:val="1A1A2E"/>
+          <w:sz w:val="22"/>
+          <w:szCs w:val="22"/>
+          <w:lang w:val="en-GB"/>
+        </w:rPr>
+        <w:t>-</w:t>
+      </w:r>
+      <w:r>
+        <w:rPr>
+          <w:rFonts w:ascii="Arial" w:eastAsia="Arial" w:hAnsi="Arial" w:cs="Arial"/>
+          <w:color w:val="1A1A2E"/>
+          <w:sz w:val="22"/>
+          <w:szCs w:val="22"/>
+        </w:rPr>
+        <w:t xml:space="preserve"> 7) je možné výsledky jednoducho overovať aj manuálne a slúžia na overenie základnej správnosti. Pre stredné n (9 </w:t>
+      </w:r>
+      <w:r>
+        <w:rPr>
+          <w:rFonts w:ascii="Arial" w:eastAsia="Arial" w:hAnsi="Arial" w:cs="Arial"/>
+          <w:color w:val="1A1A2E"/>
+          <w:sz w:val="22"/>
+          <w:szCs w:val="22"/>
+        </w:rPr>
+        <w:t>-</w:t>
+      </w:r>
+      <w:r>
+        <w:rPr>
+          <w:rFonts w:ascii="Arial" w:eastAsia="Arial" w:hAnsi="Arial" w:cs="Arial"/>
+          <w:color w:val="1A1A2E"/>
+          <w:sz w:val="22"/>
+          <w:szCs w:val="22"/>
+        </w:rPr>
+        <w:t xml:space="preserve"> 11) sa naplno prejavuje efekt redukcie</w:t>
+      </w:r>
+      <w:r>
+        <w:rPr>
+          <w:rFonts w:ascii="Arial" w:eastAsia="Arial" w:hAnsi="Arial" w:cs="Arial"/>
+          <w:color w:val="1A1A2E"/>
+          <w:sz w:val="22"/>
+          <w:szCs w:val="22"/>
+        </w:rPr>
+        <w:t>.</w:t>
+      </w:r>
+      <w:r>
+        <w:rPr>
+          <w:rFonts w:ascii="Arial" w:eastAsia="Arial" w:hAnsi="Arial" w:cs="Arial"/>
+          <w:color w:val="1A1A2E"/>
+          <w:sz w:val="22"/>
+          <w:szCs w:val="22"/>
+        </w:rPr>
+        <w:t xml:space="preserve"> </w:t>
+      </w:r>
+      <w:r>
+        <w:rPr>
+          <w:rFonts w:ascii="Arial" w:eastAsia="Arial" w:hAnsi="Arial" w:cs="Arial"/>
+          <w:color w:val="1A1A2E"/>
+          <w:sz w:val="22"/>
+          <w:szCs w:val="22"/>
+        </w:rPr>
+        <w:t>D</w:t>
+      </w:r>
+      <w:r>
+        <w:rPr>
+          <w:rFonts w:ascii="Arial" w:eastAsia="Arial" w:hAnsi="Arial" w:cs="Arial"/>
+          <w:color w:val="1A1A2E"/>
+          <w:sz w:val="22"/>
+          <w:szCs w:val="22"/>
+        </w:rPr>
+        <w:t xml:space="preserve">iagram je výrazne menší ako plný strom. Pre veľké n (13 </w:t>
+      </w:r>
+      <w:r>
+        <w:rPr>
+          <w:rFonts w:ascii="Arial" w:eastAsia="Arial" w:hAnsi="Arial" w:cs="Arial"/>
+          <w:color w:val="1A1A2E"/>
+          <w:sz w:val="22"/>
+          <w:szCs w:val="22"/>
+        </w:rPr>
+        <w:t>-</w:t>
+      </w:r>
+      <w:r>
+        <w:rPr>
+          <w:rFonts w:ascii="Arial" w:eastAsia="Arial" w:hAnsi="Arial" w:cs="Arial"/>
+          <w:color w:val="1A1A2E"/>
+          <w:sz w:val="22"/>
+          <w:szCs w:val="22"/>
+        </w:rPr>
+        <w:t xml:space="preserve"> 15) sa testuje škálovateľnosť implementácie a meria sa čas vykonania, ktorý je pri naivných implementáciách exponenciálny.</w:t>
       </w:r>
     </w:p>
     <w:p>
@@ -11541,19 +12044,19 @@
     </w:p>
     <w:p>
       <w:pPr>
-        <w:spacing w:after="40"/>
+        <w:spacing w:after="0"/>
       </w:pPr>
     </w:p>
     <w:tbl>
       <w:tblPr>
         <w:tblW w:w="9360" w:type="dxa"/>
         <w:tblBorders>
-          <w:top w:val="single" w:sz="4" w:space="0" w:color="auto"/>
-          <w:left w:val="single" w:sz="4" w:space="0" w:color="auto"/>
-          <w:bottom w:val="single" w:sz="4" w:space="0" w:color="auto"/>
-          <w:right w:val="single" w:sz="4" w:space="0" w:color="auto"/>
-          <w:insideH w:val="single" w:sz="4" w:space="0" w:color="auto"/>
-          <w:insideV w:val="single" w:sz="4" w:space="0" w:color="auto"/>
+          <w:top w:val="single" w:sz="6" w:space="0" w:color="BFBFBF" w:themeColor="background1" w:themeShade="BF"/>
+          <w:left w:val="single" w:sz="6" w:space="0" w:color="BFBFBF" w:themeColor="background1" w:themeShade="BF"/>
+          <w:bottom w:val="single" w:sz="6" w:space="0" w:color="BFBFBF" w:themeColor="background1" w:themeShade="BF"/>
+          <w:right w:val="single" w:sz="6" w:space="0" w:color="BFBFBF" w:themeColor="background1" w:themeShade="BF"/>
+          <w:insideH w:val="single" w:sz="12" w:space="0" w:color="BFBFBF" w:themeColor="background1" w:themeShade="BF"/>
+          <w:insideV w:val="single" w:sz="12" w:space="0" w:color="BFBFBF" w:themeColor="background1" w:themeShade="BF"/>
         </w:tblBorders>
         <w:tblCellMar>
           <w:left w:w="10" w:type="dxa"/>
@@ -11569,12 +12072,6 @@
         <w:tc>
           <w:tcPr>
             <w:tcW w:w="3400" w:type="dxa"/>
-            <w:tcBorders>
-              <w:top w:val="single" w:sz="1" w:space="0" w:color="ADB9CA"/>
-              <w:left w:val="single" w:sz="1" w:space="0" w:color="ADB9CA"/>
-              <w:bottom w:val="single" w:sz="1" w:space="0" w:color="ADB9CA"/>
-              <w:right w:val="single" w:sz="1" w:space="0" w:color="ADB9CA"/>
-            </w:tcBorders>
             <w:shd w:val="clear" w:color="auto" w:fill="DEEAF1"/>
             <w:tcMar>
               <w:top w:w="80" w:type="dxa"/>
@@ -11603,12 +12100,6 @@
         <w:tc>
           <w:tcPr>
             <w:tcW w:w="5960" w:type="dxa"/>
-            <w:tcBorders>
-              <w:top w:val="single" w:sz="1" w:space="0" w:color="ADB9CA"/>
-              <w:left w:val="single" w:sz="1" w:space="0" w:color="ADB9CA"/>
-              <w:bottom w:val="single" w:sz="1" w:space="0" w:color="ADB9CA"/>
-              <w:right w:val="single" w:sz="1" w:space="0" w:color="ADB9CA"/>
-            </w:tcBorders>
             <w:shd w:val="clear" w:color="auto" w:fill="DEEAF1"/>
             <w:tcMar>
               <w:top w:w="80" w:type="dxa"/>
@@ -11639,12 +12130,6 @@
         <w:tc>
           <w:tcPr>
             <w:tcW w:w="3400" w:type="dxa"/>
-            <w:tcBorders>
-              <w:top w:val="single" w:sz="1" w:space="0" w:color="ADB9CA"/>
-              <w:left w:val="single" w:sz="1" w:space="0" w:color="ADB9CA"/>
-              <w:bottom w:val="single" w:sz="1" w:space="0" w:color="ADB9CA"/>
-              <w:right w:val="single" w:sz="1" w:space="0" w:color="ADB9CA"/>
-            </w:tcBorders>
             <w:shd w:val="clear" w:color="auto" w:fill="FFFFFF"/>
             <w:tcMar>
               <w:top w:w="80" w:type="dxa"/>
@@ -11711,12 +12196,6 @@
         <w:tc>
           <w:tcPr>
             <w:tcW w:w="5960" w:type="dxa"/>
-            <w:tcBorders>
-              <w:top w:val="single" w:sz="1" w:space="0" w:color="ADB9CA"/>
-              <w:left w:val="single" w:sz="1" w:space="0" w:color="ADB9CA"/>
-              <w:bottom w:val="single" w:sz="1" w:space="0" w:color="ADB9CA"/>
-              <w:right w:val="single" w:sz="1" w:space="0" w:color="ADB9CA"/>
-            </w:tcBorders>
             <w:shd w:val="clear" w:color="auto" w:fill="FFFFFF"/>
             <w:tcMar>
               <w:top w:w="80" w:type="dxa"/>
@@ -11765,12 +12244,6 @@
         <w:tc>
           <w:tcPr>
             <w:tcW w:w="3400" w:type="dxa"/>
-            <w:tcBorders>
-              <w:top w:val="single" w:sz="1" w:space="0" w:color="ADB9CA"/>
-              <w:left w:val="single" w:sz="1" w:space="0" w:color="ADB9CA"/>
-              <w:bottom w:val="single" w:sz="1" w:space="0" w:color="ADB9CA"/>
-              <w:right w:val="single" w:sz="1" w:space="0" w:color="ADB9CA"/>
-            </w:tcBorders>
             <w:shd w:val="clear" w:color="auto" w:fill="FFFFFF"/>
             <w:tcMar>
               <w:top w:w="80" w:type="dxa"/>
@@ -11790,6 +12263,7 @@
                 <w:sz w:val="20"/>
                 <w:szCs w:val="20"/>
               </w:rPr>
+              <w:lastRenderedPageBreak/>
               <w:t xml:space="preserve">Uzly </w:t>
             </w:r>
             <w:proofErr w:type="spellStart"/>
@@ -11837,12 +12311,6 @@
         <w:tc>
           <w:tcPr>
             <w:tcW w:w="5960" w:type="dxa"/>
-            <w:tcBorders>
-              <w:top w:val="single" w:sz="1" w:space="0" w:color="ADB9CA"/>
-              <w:left w:val="single" w:sz="1" w:space="0" w:color="ADB9CA"/>
-              <w:bottom w:val="single" w:sz="1" w:space="0" w:color="ADB9CA"/>
-              <w:right w:val="single" w:sz="1" w:space="0" w:color="ADB9CA"/>
-            </w:tcBorders>
             <w:shd w:val="clear" w:color="auto" w:fill="FFFFFF"/>
             <w:tcMar>
               <w:top w:w="80" w:type="dxa"/>
@@ -11871,12 +12339,6 @@
         <w:tc>
           <w:tcPr>
             <w:tcW w:w="3400" w:type="dxa"/>
-            <w:tcBorders>
-              <w:top w:val="single" w:sz="1" w:space="0" w:color="ADB9CA"/>
-              <w:left w:val="single" w:sz="1" w:space="0" w:color="ADB9CA"/>
-              <w:bottom w:val="single" w:sz="1" w:space="0" w:color="ADB9CA"/>
-              <w:right w:val="single" w:sz="1" w:space="0" w:color="ADB9CA"/>
-            </w:tcBorders>
             <w:shd w:val="clear" w:color="auto" w:fill="FFFFFF"/>
             <w:tcMar>
               <w:top w:w="80" w:type="dxa"/>
@@ -11903,12 +12365,6 @@
         <w:tc>
           <w:tcPr>
             <w:tcW w:w="5960" w:type="dxa"/>
-            <w:tcBorders>
-              <w:top w:val="single" w:sz="1" w:space="0" w:color="ADB9CA"/>
-              <w:left w:val="single" w:sz="1" w:space="0" w:color="ADB9CA"/>
-              <w:bottom w:val="single" w:sz="1" w:space="0" w:color="ADB9CA"/>
-              <w:right w:val="single" w:sz="1" w:space="0" w:color="ADB9CA"/>
-            </w:tcBorders>
             <w:shd w:val="clear" w:color="auto" w:fill="FFFFFF"/>
             <w:tcMar>
               <w:top w:w="80" w:type="dxa"/>
@@ -11928,7 +12384,43 @@
                 <w:sz w:val="20"/>
                 <w:szCs w:val="20"/>
               </w:rPr>
-              <w:t>Percentuálna miera redukcie oproti plnému rozhodovaciemu stromu: (plný − BDD) / plný × 100. Plný strom pre n premenných má 2ⁿ − 1 uzlov.</w:t>
+              <w:t xml:space="preserve">Percentuálna miera redukcie oproti plnému rozhodovaciemu stromu: (plný </w:t>
+            </w:r>
+            <w:r>
+              <w:rPr>
+                <w:rFonts w:ascii="Arial" w:eastAsia="Arial" w:hAnsi="Arial" w:cs="Arial"/>
+                <w:color w:val="1A1A2E"/>
+                <w:sz w:val="20"/>
+                <w:szCs w:val="20"/>
+              </w:rPr>
+              <w:t>-</w:t>
+            </w:r>
+            <w:r>
+              <w:rPr>
+                <w:rFonts w:ascii="Arial" w:eastAsia="Arial" w:hAnsi="Arial" w:cs="Arial"/>
+                <w:color w:val="1A1A2E"/>
+                <w:sz w:val="20"/>
+                <w:szCs w:val="20"/>
+              </w:rPr>
+              <w:t xml:space="preserve"> BDD) / plný </w:t>
+            </w:r>
+            <w:r>
+              <w:rPr>
+                <w:rFonts w:ascii="Arial" w:eastAsia="Arial" w:hAnsi="Arial" w:cs="Arial"/>
+                <w:color w:val="1A1A2E"/>
+                <w:sz w:val="20"/>
+                <w:szCs w:val="20"/>
+              </w:rPr>
+              <w:t>*</w:t>
+            </w:r>
+            <w:r>
+              <w:rPr>
+                <w:rFonts w:ascii="Arial" w:eastAsia="Arial" w:hAnsi="Arial" w:cs="Arial"/>
+                <w:color w:val="1A1A2E"/>
+                <w:sz w:val="20"/>
+                <w:szCs w:val="20"/>
+              </w:rPr>
+              <w:t xml:space="preserve"> 100. Plný strom pre n premenných má 2ⁿ − 1 uzlov.</w:t>
             </w:r>
           </w:p>
         </w:tc>
@@ -11937,12 +12429,6 @@
         <w:tc>
           <w:tcPr>
             <w:tcW w:w="3400" w:type="dxa"/>
-            <w:tcBorders>
-              <w:top w:val="single" w:sz="1" w:space="0" w:color="ADB9CA"/>
-              <w:left w:val="single" w:sz="1" w:space="0" w:color="ADB9CA"/>
-              <w:bottom w:val="single" w:sz="1" w:space="0" w:color="ADB9CA"/>
-              <w:right w:val="single" w:sz="1" w:space="0" w:color="ADB9CA"/>
-            </w:tcBorders>
             <w:shd w:val="clear" w:color="auto" w:fill="FFFFFF"/>
             <w:tcMar>
               <w:top w:w="80" w:type="dxa"/>
@@ -11969,12 +12455,6 @@
         <w:tc>
           <w:tcPr>
             <w:tcW w:w="5960" w:type="dxa"/>
-            <w:tcBorders>
-              <w:top w:val="single" w:sz="1" w:space="0" w:color="ADB9CA"/>
-              <w:left w:val="single" w:sz="1" w:space="0" w:color="ADB9CA"/>
-              <w:bottom w:val="single" w:sz="1" w:space="0" w:color="ADB9CA"/>
-              <w:right w:val="single" w:sz="1" w:space="0" w:color="ADB9CA"/>
-            </w:tcBorders>
             <w:shd w:val="clear" w:color="auto" w:fill="FFFFFF"/>
             <w:tcMar>
               <w:top w:w="80" w:type="dxa"/>
@@ -12083,12 +12563,6 @@
         <w:tc>
           <w:tcPr>
             <w:tcW w:w="3400" w:type="dxa"/>
-            <w:tcBorders>
-              <w:top w:val="single" w:sz="1" w:space="0" w:color="ADB9CA"/>
-              <w:left w:val="single" w:sz="1" w:space="0" w:color="ADB9CA"/>
-              <w:bottom w:val="single" w:sz="1" w:space="0" w:color="ADB9CA"/>
-              <w:right w:val="single" w:sz="1" w:space="0" w:color="ADB9CA"/>
-            </w:tcBorders>
             <w:shd w:val="clear" w:color="auto" w:fill="FFFFFF"/>
             <w:tcMar>
               <w:top w:w="80" w:type="dxa"/>
@@ -12108,7 +12582,6 @@
                 <w:sz w:val="20"/>
                 <w:szCs w:val="20"/>
               </w:rPr>
-              <w:lastRenderedPageBreak/>
               <w:t xml:space="preserve">Best &lt; </w:t>
             </w:r>
             <w:proofErr w:type="spellStart"/>
@@ -12127,12 +12600,6 @@
         <w:tc>
           <w:tcPr>
             <w:tcW w:w="5960" w:type="dxa"/>
-            <w:tcBorders>
-              <w:top w:val="single" w:sz="1" w:space="0" w:color="ADB9CA"/>
-              <w:left w:val="single" w:sz="1" w:space="0" w:color="ADB9CA"/>
-              <w:bottom w:val="single" w:sz="1" w:space="0" w:color="ADB9CA"/>
-              <w:right w:val="single" w:sz="1" w:space="0" w:color="ADB9CA"/>
-            </w:tcBorders>
             <w:shd w:val="clear" w:color="auto" w:fill="FFFFFF"/>
             <w:tcMar>
               <w:top w:w="80" w:type="dxa"/>
@@ -12201,12 +12668,6 @@
         <w:tc>
           <w:tcPr>
             <w:tcW w:w="3400" w:type="dxa"/>
-            <w:tcBorders>
-              <w:top w:val="single" w:sz="1" w:space="0" w:color="ADB9CA"/>
-              <w:left w:val="single" w:sz="1" w:space="0" w:color="ADB9CA"/>
-              <w:bottom w:val="single" w:sz="1" w:space="0" w:color="ADB9CA"/>
-              <w:right w:val="single" w:sz="1" w:space="0" w:color="ADB9CA"/>
-            </w:tcBorders>
             <w:shd w:val="clear" w:color="auto" w:fill="FFFFFF"/>
             <w:tcMar>
               <w:top w:w="80" w:type="dxa"/>
@@ -12253,12 +12714,6 @@
         <w:tc>
           <w:tcPr>
             <w:tcW w:w="5960" w:type="dxa"/>
-            <w:tcBorders>
-              <w:top w:val="single" w:sz="1" w:space="0" w:color="ADB9CA"/>
-              <w:left w:val="single" w:sz="1" w:space="0" w:color="ADB9CA"/>
-              <w:bottom w:val="single" w:sz="1" w:space="0" w:color="ADB9CA"/>
-              <w:right w:val="single" w:sz="1" w:space="0" w:color="ADB9CA"/>
-            </w:tcBorders>
             <w:shd w:val="clear" w:color="auto" w:fill="FFFFFF"/>
             <w:tcMar>
               <w:top w:w="80" w:type="dxa"/>
@@ -12327,12 +12782,6 @@
         <w:tc>
           <w:tcPr>
             <w:tcW w:w="3400" w:type="dxa"/>
-            <w:tcBorders>
-              <w:top w:val="single" w:sz="1" w:space="0" w:color="ADB9CA"/>
-              <w:left w:val="single" w:sz="1" w:space="0" w:color="ADB9CA"/>
-              <w:bottom w:val="single" w:sz="1" w:space="0" w:color="ADB9CA"/>
-              <w:right w:val="single" w:sz="1" w:space="0" w:color="ADB9CA"/>
-            </w:tcBorders>
             <w:shd w:val="clear" w:color="auto" w:fill="FFFFFF"/>
             <w:tcMar>
               <w:top w:w="80" w:type="dxa"/>
@@ -12379,12 +12828,6 @@
         <w:tc>
           <w:tcPr>
             <w:tcW w:w="5960" w:type="dxa"/>
-            <w:tcBorders>
-              <w:top w:val="single" w:sz="1" w:space="0" w:color="ADB9CA"/>
-              <w:left w:val="single" w:sz="1" w:space="0" w:color="ADB9CA"/>
-              <w:bottom w:val="single" w:sz="1" w:space="0" w:color="ADB9CA"/>
-              <w:right w:val="single" w:sz="1" w:space="0" w:color="ADB9CA"/>
-            </w:tcBorders>
             <w:shd w:val="clear" w:color="auto" w:fill="FFFFFF"/>
             <w:tcMar>
               <w:top w:w="80" w:type="dxa"/>
@@ -12468,7 +12911,61 @@
           <w:sz w:val="22"/>
           <w:szCs w:val="22"/>
         </w:rPr>
-        <w:t>Čas vykonania je meraný na úrovni celej skupiny (100 funkcií), nie pre každý test zvlášť. Dôvodom je presnosť – pre malé n (3 – 5) je konštrukcia jedného BDD rýchlejšia ako rozlišovacia schopnosť systémových hodín, a individuálne meranie by prinieslo len šum. Súčet cez celú skupinu dáva stabilné a porovnateľné čísla.</w:t>
+        <w:t>Čas vykonania je meraný na úrovni celej skupiny (100 funkcií), nie pre každý test zvlášť. Dôvodom je presnosť</w:t>
+      </w:r>
+      <w:r>
+        <w:rPr>
+          <w:rFonts w:ascii="Arial" w:eastAsia="Arial" w:hAnsi="Arial" w:cs="Arial"/>
+          <w:color w:val="1A1A2E"/>
+          <w:sz w:val="22"/>
+          <w:szCs w:val="22"/>
+        </w:rPr>
+        <w:t>.</w:t>
+      </w:r>
+      <w:r>
+        <w:rPr>
+          <w:rFonts w:ascii="Arial" w:eastAsia="Arial" w:hAnsi="Arial" w:cs="Arial"/>
+          <w:color w:val="1A1A2E"/>
+          <w:sz w:val="22"/>
+          <w:szCs w:val="22"/>
+        </w:rPr>
+        <w:t xml:space="preserve"> </w:t>
+      </w:r>
+      <w:r>
+        <w:rPr>
+          <w:rFonts w:ascii="Arial" w:eastAsia="Arial" w:hAnsi="Arial" w:cs="Arial"/>
+          <w:color w:val="1A1A2E"/>
+          <w:sz w:val="22"/>
+          <w:szCs w:val="22"/>
+        </w:rPr>
+        <w:t>P</w:t>
+      </w:r>
+      <w:r>
+        <w:rPr>
+          <w:rFonts w:ascii="Arial" w:eastAsia="Arial" w:hAnsi="Arial" w:cs="Arial"/>
+          <w:color w:val="1A1A2E"/>
+          <w:sz w:val="22"/>
+          <w:szCs w:val="22"/>
+        </w:rPr>
+        <w:t xml:space="preserve">re malé n (3 </w:t>
+      </w:r>
+      <w:r>
+        <w:rPr>
+          <w:rFonts w:ascii="Arial" w:eastAsia="Arial" w:hAnsi="Arial" w:cs="Arial"/>
+          <w:color w:val="1A1A2E"/>
+          <w:sz w:val="22"/>
+          <w:szCs w:val="22"/>
+        </w:rPr>
+        <w:t>-</w:t>
+      </w:r>
+      <w:r>
+        <w:rPr>
+          <w:rFonts w:ascii="Arial" w:eastAsia="Arial" w:hAnsi="Arial" w:cs="Arial"/>
+          <w:color w:val="1A1A2E"/>
+          <w:sz w:val="22"/>
+          <w:szCs w:val="22"/>
+        </w:rPr>
+        <w:t xml:space="preserve"> 5) je konštrukcia jedného BDD rýchlejšia ako rozlišovacia schopnosť systémových hodín, a individuálne meranie by prinieslo len šum. Súčet cez celú skupinu dáva stabilné a porovnateľné čísla.</w:t>
       </w:r>
     </w:p>
     <w:p>
@@ -12498,8 +12995,14 @@
     </w:p>
     <w:p>
       <w:pPr>
+        <w:pBdr>
+          <w:top w:val="single" w:sz="6" w:space="1" w:color="BFBFBF" w:themeColor="background1" w:themeShade="BF" w:shadow="1"/>
+          <w:left w:val="single" w:sz="6" w:space="4" w:color="BFBFBF" w:themeColor="background1" w:themeShade="BF" w:shadow="1"/>
+          <w:bottom w:val="single" w:sz="6" w:space="1" w:color="BFBFBF" w:themeColor="background1" w:themeShade="BF" w:shadow="1"/>
+          <w:right w:val="single" w:sz="6" w:space="4" w:color="BFBFBF" w:themeColor="background1" w:themeShade="BF" w:shadow="1"/>
+        </w:pBdr>
         <w:shd w:val="clear" w:color="auto" w:fill="F4F4F4"/>
-        <w:spacing w:before="100"/>
+        <w:spacing w:before="100" w:after="0"/>
         <w:ind w:left="360" w:right="360"/>
       </w:pPr>
       <w:r>
@@ -12514,7 +13017,14 @@
     </w:p>
     <w:p>
       <w:pPr>
+        <w:pBdr>
+          <w:top w:val="single" w:sz="6" w:space="1" w:color="BFBFBF" w:themeColor="background1" w:themeShade="BF" w:shadow="1"/>
+          <w:left w:val="single" w:sz="6" w:space="4" w:color="BFBFBF" w:themeColor="background1" w:themeShade="BF" w:shadow="1"/>
+          <w:bottom w:val="single" w:sz="6" w:space="1" w:color="BFBFBF" w:themeColor="background1" w:themeShade="BF" w:shadow="1"/>
+          <w:right w:val="single" w:sz="6" w:space="4" w:color="BFBFBF" w:themeColor="background1" w:themeShade="BF" w:shadow="1"/>
+        </w:pBdr>
         <w:shd w:val="clear" w:color="auto" w:fill="F4F4F4"/>
+        <w:spacing w:after="0"/>
         <w:ind w:left="360" w:right="360"/>
       </w:pPr>
       <w:r>
@@ -12549,7 +13059,14 @@
     </w:p>
     <w:p>
       <w:pPr>
+        <w:pBdr>
+          <w:top w:val="single" w:sz="6" w:space="1" w:color="BFBFBF" w:themeColor="background1" w:themeShade="BF" w:shadow="1"/>
+          <w:left w:val="single" w:sz="6" w:space="4" w:color="BFBFBF" w:themeColor="background1" w:themeShade="BF" w:shadow="1"/>
+          <w:bottom w:val="single" w:sz="6" w:space="1" w:color="BFBFBF" w:themeColor="background1" w:themeShade="BF" w:shadow="1"/>
+          <w:right w:val="single" w:sz="6" w:space="4" w:color="BFBFBF" w:themeColor="background1" w:themeShade="BF" w:shadow="1"/>
+        </w:pBdr>
         <w:shd w:val="clear" w:color="auto" w:fill="F4F4F4"/>
+        <w:spacing w:after="0"/>
         <w:ind w:left="360" w:right="360"/>
       </w:pPr>
       <w:r>
@@ -12644,7 +13161,14 @@
     </w:p>
     <w:p>
       <w:pPr>
+        <w:pBdr>
+          <w:top w:val="single" w:sz="6" w:space="1" w:color="BFBFBF" w:themeColor="background1" w:themeShade="BF" w:shadow="1"/>
+          <w:left w:val="single" w:sz="6" w:space="4" w:color="BFBFBF" w:themeColor="background1" w:themeShade="BF" w:shadow="1"/>
+          <w:bottom w:val="single" w:sz="6" w:space="1" w:color="BFBFBF" w:themeColor="background1" w:themeShade="BF" w:shadow="1"/>
+          <w:right w:val="single" w:sz="6" w:space="4" w:color="BFBFBF" w:themeColor="background1" w:themeShade="BF" w:shadow="1"/>
+        </w:pBdr>
         <w:shd w:val="clear" w:color="auto" w:fill="F4F4F4"/>
+        <w:spacing w:after="0"/>
         <w:ind w:left="360" w:right="360"/>
       </w:pPr>
       <w:r>
@@ -12699,7 +13223,14 @@
     </w:p>
     <w:p>
       <w:pPr>
+        <w:pBdr>
+          <w:top w:val="single" w:sz="6" w:space="1" w:color="BFBFBF" w:themeColor="background1" w:themeShade="BF" w:shadow="1"/>
+          <w:left w:val="single" w:sz="6" w:space="4" w:color="BFBFBF" w:themeColor="background1" w:themeShade="BF" w:shadow="1"/>
+          <w:bottom w:val="single" w:sz="6" w:space="1" w:color="BFBFBF" w:themeColor="background1" w:themeShade="BF" w:shadow="1"/>
+          <w:right w:val="single" w:sz="6" w:space="4" w:color="BFBFBF" w:themeColor="background1" w:themeShade="BF" w:shadow="1"/>
+        </w:pBdr>
         <w:shd w:val="clear" w:color="auto" w:fill="F4F4F4"/>
+        <w:spacing w:after="0"/>
         <w:ind w:left="360" w:right="360"/>
       </w:pPr>
       <w:r>
@@ -12754,7 +13285,14 @@
     </w:p>
     <w:p>
       <w:pPr>
+        <w:pBdr>
+          <w:top w:val="single" w:sz="6" w:space="1" w:color="BFBFBF" w:themeColor="background1" w:themeShade="BF" w:shadow="1"/>
+          <w:left w:val="single" w:sz="6" w:space="4" w:color="BFBFBF" w:themeColor="background1" w:themeShade="BF" w:shadow="1"/>
+          <w:bottom w:val="single" w:sz="6" w:space="1" w:color="BFBFBF" w:themeColor="background1" w:themeShade="BF" w:shadow="1"/>
+          <w:right w:val="single" w:sz="6" w:space="4" w:color="BFBFBF" w:themeColor="background1" w:themeShade="BF" w:shadow="1"/>
+        </w:pBdr>
         <w:shd w:val="clear" w:color="auto" w:fill="F4F4F4"/>
+        <w:spacing w:after="0"/>
         <w:ind w:left="360" w:right="360"/>
       </w:pPr>
       <w:r>
@@ -12809,7 +13347,14 @@
     </w:p>
     <w:p>
       <w:pPr>
+        <w:pBdr>
+          <w:top w:val="single" w:sz="6" w:space="1" w:color="BFBFBF" w:themeColor="background1" w:themeShade="BF" w:shadow="1"/>
+          <w:left w:val="single" w:sz="6" w:space="4" w:color="BFBFBF" w:themeColor="background1" w:themeShade="BF" w:shadow="1"/>
+          <w:bottom w:val="single" w:sz="6" w:space="1" w:color="BFBFBF" w:themeColor="background1" w:themeShade="BF" w:shadow="1"/>
+          <w:right w:val="single" w:sz="6" w:space="4" w:color="BFBFBF" w:themeColor="background1" w:themeShade="BF" w:shadow="1"/>
+        </w:pBdr>
         <w:shd w:val="clear" w:color="auto" w:fill="F4F4F4"/>
+        <w:spacing w:after="0"/>
         <w:ind w:left="360" w:right="360"/>
       </w:pPr>
       <w:r>
@@ -12904,7 +13449,14 @@
     </w:p>
     <w:p>
       <w:pPr>
+        <w:pBdr>
+          <w:top w:val="single" w:sz="6" w:space="1" w:color="BFBFBF" w:themeColor="background1" w:themeShade="BF" w:shadow="1"/>
+          <w:left w:val="single" w:sz="6" w:space="4" w:color="BFBFBF" w:themeColor="background1" w:themeShade="BF" w:shadow="1"/>
+          <w:bottom w:val="single" w:sz="6" w:space="1" w:color="BFBFBF" w:themeColor="background1" w:themeShade="BF" w:shadow="1"/>
+          <w:right w:val="single" w:sz="6" w:space="4" w:color="BFBFBF" w:themeColor="background1" w:themeShade="BF" w:shadow="1"/>
+        </w:pBdr>
         <w:shd w:val="clear" w:color="auto" w:fill="F4F4F4"/>
+        <w:spacing w:after="0"/>
         <w:ind w:left="360" w:right="360"/>
       </w:pPr>
       <w:r>
@@ -12919,7 +13471,14 @@
     </w:p>
     <w:p>
       <w:pPr>
+        <w:pBdr>
+          <w:top w:val="single" w:sz="6" w:space="1" w:color="BFBFBF" w:themeColor="background1" w:themeShade="BF" w:shadow="1"/>
+          <w:left w:val="single" w:sz="6" w:space="4" w:color="BFBFBF" w:themeColor="background1" w:themeShade="BF" w:shadow="1"/>
+          <w:bottom w:val="single" w:sz="6" w:space="1" w:color="BFBFBF" w:themeColor="background1" w:themeShade="BF" w:shadow="1"/>
+          <w:right w:val="single" w:sz="6" w:space="4" w:color="BFBFBF" w:themeColor="background1" w:themeShade="BF" w:shadow="1"/>
+        </w:pBdr>
         <w:shd w:val="clear" w:color="auto" w:fill="F4F4F4"/>
+        <w:spacing w:after="0"/>
         <w:ind w:left="360" w:right="360"/>
       </w:pPr>
       <w:r>
@@ -12934,7 +13493,14 @@
     </w:p>
     <w:p>
       <w:pPr>
+        <w:pBdr>
+          <w:top w:val="single" w:sz="6" w:space="1" w:color="BFBFBF" w:themeColor="background1" w:themeShade="BF" w:shadow="1"/>
+          <w:left w:val="single" w:sz="6" w:space="4" w:color="BFBFBF" w:themeColor="background1" w:themeShade="BF" w:shadow="1"/>
+          <w:bottom w:val="single" w:sz="6" w:space="1" w:color="BFBFBF" w:themeColor="background1" w:themeShade="BF" w:shadow="1"/>
+          <w:right w:val="single" w:sz="6" w:space="4" w:color="BFBFBF" w:themeColor="background1" w:themeShade="BF" w:shadow="1"/>
+        </w:pBdr>
         <w:shd w:val="clear" w:color="auto" w:fill="F4F4F4"/>
+        <w:spacing w:after="0"/>
         <w:ind w:left="360" w:right="360"/>
       </w:pPr>
       <w:r>
@@ -12989,7 +13555,14 @@
     </w:p>
     <w:p>
       <w:pPr>
+        <w:pBdr>
+          <w:top w:val="single" w:sz="6" w:space="1" w:color="BFBFBF" w:themeColor="background1" w:themeShade="BF" w:shadow="1"/>
+          <w:left w:val="single" w:sz="6" w:space="4" w:color="BFBFBF" w:themeColor="background1" w:themeShade="BF" w:shadow="1"/>
+          <w:bottom w:val="single" w:sz="6" w:space="1" w:color="BFBFBF" w:themeColor="background1" w:themeShade="BF" w:shadow="1"/>
+          <w:right w:val="single" w:sz="6" w:space="4" w:color="BFBFBF" w:themeColor="background1" w:themeShade="BF" w:shadow="1"/>
+        </w:pBdr>
         <w:shd w:val="clear" w:color="auto" w:fill="F4F4F4"/>
+        <w:spacing w:after="0"/>
         <w:ind w:left="360" w:right="360"/>
       </w:pPr>
       <w:r>
@@ -13084,7 +13657,14 @@
     </w:p>
     <w:p>
       <w:pPr>
+        <w:pBdr>
+          <w:top w:val="single" w:sz="6" w:space="1" w:color="BFBFBF" w:themeColor="background1" w:themeShade="BF" w:shadow="1"/>
+          <w:left w:val="single" w:sz="6" w:space="4" w:color="BFBFBF" w:themeColor="background1" w:themeShade="BF" w:shadow="1"/>
+          <w:bottom w:val="single" w:sz="6" w:space="1" w:color="BFBFBF" w:themeColor="background1" w:themeShade="BF" w:shadow="1"/>
+          <w:right w:val="single" w:sz="6" w:space="4" w:color="BFBFBF" w:themeColor="background1" w:themeShade="BF" w:shadow="1"/>
+        </w:pBdr>
         <w:shd w:val="clear" w:color="auto" w:fill="F4F4F4"/>
+        <w:spacing w:after="0"/>
         <w:ind w:left="360" w:right="360"/>
       </w:pPr>
       <w:r>
@@ -13159,7 +13739,14 @@
     </w:p>
     <w:p>
       <w:pPr>
+        <w:pBdr>
+          <w:top w:val="single" w:sz="6" w:space="1" w:color="BFBFBF" w:themeColor="background1" w:themeShade="BF" w:shadow="1"/>
+          <w:left w:val="single" w:sz="6" w:space="4" w:color="BFBFBF" w:themeColor="background1" w:themeShade="BF" w:shadow="1"/>
+          <w:bottom w:val="single" w:sz="6" w:space="1" w:color="BFBFBF" w:themeColor="background1" w:themeShade="BF" w:shadow="1"/>
+          <w:right w:val="single" w:sz="6" w:space="4" w:color="BFBFBF" w:themeColor="background1" w:themeShade="BF" w:shadow="1"/>
+        </w:pBdr>
         <w:shd w:val="clear" w:color="auto" w:fill="F4F4F4"/>
+        <w:spacing w:after="0"/>
         <w:ind w:left="360" w:right="360"/>
       </w:pPr>
       <w:r>
@@ -13214,7 +13801,14 @@
     </w:p>
     <w:p>
       <w:pPr>
+        <w:pBdr>
+          <w:top w:val="single" w:sz="6" w:space="1" w:color="BFBFBF" w:themeColor="background1" w:themeShade="BF" w:shadow="1"/>
+          <w:left w:val="single" w:sz="6" w:space="4" w:color="BFBFBF" w:themeColor="background1" w:themeShade="BF" w:shadow="1"/>
+          <w:bottom w:val="single" w:sz="6" w:space="1" w:color="BFBFBF" w:themeColor="background1" w:themeShade="BF" w:shadow="1"/>
+          <w:right w:val="single" w:sz="6" w:space="4" w:color="BFBFBF" w:themeColor="background1" w:themeShade="BF" w:shadow="1"/>
+        </w:pBdr>
         <w:shd w:val="clear" w:color="auto" w:fill="F4F4F4"/>
+        <w:spacing w:after="0"/>
         <w:ind w:left="360" w:right="360"/>
       </w:pPr>
       <w:r>
@@ -13289,7 +13883,14 @@
     </w:p>
     <w:p>
       <w:pPr>
+        <w:pBdr>
+          <w:top w:val="single" w:sz="6" w:space="1" w:color="BFBFBF" w:themeColor="background1" w:themeShade="BF" w:shadow="1"/>
+          <w:left w:val="single" w:sz="6" w:space="4" w:color="BFBFBF" w:themeColor="background1" w:themeShade="BF" w:shadow="1"/>
+          <w:bottom w:val="single" w:sz="6" w:space="1" w:color="BFBFBF" w:themeColor="background1" w:themeShade="BF" w:shadow="1"/>
+          <w:right w:val="single" w:sz="6" w:space="4" w:color="BFBFBF" w:themeColor="background1" w:themeShade="BF" w:shadow="1"/>
+        </w:pBdr>
         <w:shd w:val="clear" w:color="auto" w:fill="F4F4F4"/>
+        <w:spacing w:after="0"/>
         <w:ind w:left="360" w:right="360"/>
       </w:pPr>
       <w:r>
@@ -13304,8 +13905,14 @@
     </w:p>
     <w:p>
       <w:pPr>
+        <w:pBdr>
+          <w:top w:val="single" w:sz="6" w:space="1" w:color="BFBFBF" w:themeColor="background1" w:themeShade="BF" w:shadow="1"/>
+          <w:left w:val="single" w:sz="6" w:space="4" w:color="BFBFBF" w:themeColor="background1" w:themeShade="BF" w:shadow="1"/>
+          <w:bottom w:val="single" w:sz="6" w:space="1" w:color="BFBFBF" w:themeColor="background1" w:themeShade="BF" w:shadow="1"/>
+          <w:right w:val="single" w:sz="6" w:space="4" w:color="BFBFBF" w:themeColor="background1" w:themeShade="BF" w:shadow="1"/>
+        </w:pBdr>
         <w:shd w:val="clear" w:color="auto" w:fill="F4F4F4"/>
-        <w:spacing w:after="100"/>
+        <w:spacing w:after="0"/>
         <w:ind w:left="360" w:right="360"/>
       </w:pPr>
       <w:r>
@@ -13396,7 +14003,25 @@
           <w:sz w:val="22"/>
           <w:szCs w:val="22"/>
         </w:rPr>
-        <w:t xml:space="preserve"> je dôležité – </w:t>
+        <w:t xml:space="preserve"> je dôležité</w:t>
+      </w:r>
+      <w:r>
+        <w:rPr>
+          <w:rFonts w:ascii="Arial" w:eastAsia="Arial" w:hAnsi="Arial" w:cs="Arial"/>
+          <w:color w:val="1A1A2E"/>
+          <w:sz w:val="22"/>
+          <w:szCs w:val="22"/>
+        </w:rPr>
+        <w:t>;</w:t>
+      </w:r>
+      <w:r>
+        <w:rPr>
+          <w:rFonts w:ascii="Arial" w:eastAsia="Arial" w:hAnsi="Arial" w:cs="Arial"/>
+          <w:color w:val="1A1A2E"/>
+          <w:sz w:val="22"/>
+          <w:szCs w:val="22"/>
+        </w:rPr>
+        <w:t xml:space="preserve"> </w:t>
       </w:r>
       <w:r>
         <w:rPr>
@@ -13437,7 +14062,43 @@
           <w:sz w:val="22"/>
           <w:szCs w:val="22"/>
         </w:rPr>
-        <w:t xml:space="preserve"> meria procesorový čas a nie je vhodné pre benchmarky, pretože môže byť ovplyvnené plánovaním procesov. Monotónne hodiny merajú skutočne uplynulý čas od štartu systému a nie sú náchylné na záporné skoky ani ovplyvnenie systémovým časom.</w:t>
+        <w:t xml:space="preserve"> meria procesorový čas a nie je vhodn</w:t>
+      </w:r>
+      <w:r>
+        <w:rPr>
+          <w:rFonts w:ascii="Arial" w:eastAsia="Arial" w:hAnsi="Arial" w:cs="Arial"/>
+          <w:color w:val="1A1A2E"/>
+          <w:sz w:val="22"/>
+          <w:szCs w:val="22"/>
+        </w:rPr>
+        <w:t>ý</w:t>
+      </w:r>
+      <w:r>
+        <w:rPr>
+          <w:rFonts w:ascii="Arial" w:eastAsia="Arial" w:hAnsi="Arial" w:cs="Arial"/>
+          <w:color w:val="1A1A2E"/>
+          <w:sz w:val="22"/>
+          <w:szCs w:val="22"/>
+        </w:rPr>
+        <w:t xml:space="preserve"> pre benchmarky, pretože môže byť ovplyvnen</w:t>
+      </w:r>
+      <w:r>
+        <w:rPr>
+          <w:rFonts w:ascii="Arial" w:eastAsia="Arial" w:hAnsi="Arial" w:cs="Arial"/>
+          <w:color w:val="1A1A2E"/>
+          <w:sz w:val="22"/>
+          <w:szCs w:val="22"/>
+        </w:rPr>
+        <w:t>ý</w:t>
+      </w:r>
+      <w:r>
+        <w:rPr>
+          <w:rFonts w:ascii="Arial" w:eastAsia="Arial" w:hAnsi="Arial" w:cs="Arial"/>
+          <w:color w:val="1A1A2E"/>
+          <w:sz w:val="22"/>
+          <w:szCs w:val="22"/>
+        </w:rPr>
+        <w:t xml:space="preserve"> plánovaním procesov. Monotónne hodiny merajú skutočne uplynulý čas od štartu systému a nie sú náchylné na záporné skoky ani ovplyvnenie systémovým časom.</w:t>
       </w:r>
     </w:p>
     <w:p>
@@ -13458,7 +14119,41 @@
           <w:sz w:val="28"/>
           <w:szCs w:val="28"/>
         </w:rPr>
-        <w:t>4.8  Záver – prečo je takéto testovanie dostatočné</w:t>
+        <w:t>4.8  Záver</w:t>
+      </w:r>
+      <w:r>
+        <w:rPr>
+          <w:rFonts w:ascii="Arial" w:eastAsia="Arial" w:hAnsi="Arial" w:cs="Arial"/>
+          <w:b/>
+          <w:bCs/>
+          <w:color w:val="2E75B6"/>
+          <w:sz w:val="28"/>
+          <w:szCs w:val="28"/>
+        </w:rPr>
+        <w:t xml:space="preserve"> </w:t>
+      </w:r>
+      <w:r>
+        <w:rPr>
+          <w:rFonts w:ascii="Arial" w:eastAsia="Arial" w:hAnsi="Arial" w:cs="Arial"/>
+          <w:b/>
+          <w:bCs/>
+          <w:color w:val="2E75B6"/>
+          <w:sz w:val="28"/>
+          <w:szCs w:val="28"/>
+          <w:lang w:val="en-GB"/>
+        </w:rPr>
+        <w:t>-</w:t>
+      </w:r>
+      <w:r>
+        <w:rPr>
+          <w:rFonts w:ascii="Arial" w:eastAsia="Arial" w:hAnsi="Arial" w:cs="Arial"/>
+          <w:b/>
+          <w:bCs/>
+          <w:color w:val="2E75B6"/>
+          <w:sz w:val="28"/>
+          <w:szCs w:val="28"/>
+        </w:rPr>
+        <w:t xml:space="preserve"> prečo je takéto testovanie dostatočné</w:t>
       </w:r>
     </w:p>
     <w:p>
@@ -13478,18 +14173,16 @@
           <w:sz w:val="22"/>
           <w:szCs w:val="22"/>
         </w:rPr>
-        <w:t xml:space="preserve">Kombinácia </w:t>
-      </w:r>
-      <w:r>
-        <w:rPr>
-          <w:rFonts w:ascii="Arial" w:eastAsia="Arial" w:hAnsi="Arial" w:cs="Arial"/>
-          <w:b/>
-          <w:bCs/>
+        <w:t>Kombinácia úplného prehľadu vstupov s nezávislou overovacou referenčnou implementáciou a deterministickým generátorom poskytuje dostatočné pokrytie na odhalenie väčšiny implementačných chýb</w:t>
+      </w:r>
+      <w:r>
+        <w:rPr>
+          <w:rFonts w:ascii="Arial" w:eastAsia="Arial" w:hAnsi="Arial" w:cs="Arial"/>
           <w:color w:val="1A1A2E"/>
           <w:sz w:val="22"/>
           <w:szCs w:val="22"/>
         </w:rPr>
-        <w:t>úplného prehľadu vstupov</w:t>
+        <w:t xml:space="preserve">. </w:t>
       </w:r>
       <w:r>
         <w:rPr>
@@ -13498,53 +14191,11 @@
           <w:sz w:val="22"/>
           <w:szCs w:val="22"/>
         </w:rPr>
-        <w:t xml:space="preserve"> s </w:t>
-      </w:r>
-      <w:r>
-        <w:rPr>
-          <w:rFonts w:ascii="Arial" w:eastAsia="Arial" w:hAnsi="Arial" w:cs="Arial"/>
-          <w:b/>
-          <w:bCs/>
-          <w:color w:val="1A1A2E"/>
-          <w:sz w:val="22"/>
-          <w:szCs w:val="22"/>
-        </w:rPr>
-        <w:t>nezávislým orákulom</w:t>
-      </w:r>
-      <w:r>
-        <w:rPr>
-          <w:rFonts w:ascii="Arial" w:eastAsia="Arial" w:hAnsi="Arial" w:cs="Arial"/>
-          <w:color w:val="1A1A2E"/>
-          <w:sz w:val="22"/>
-          <w:szCs w:val="22"/>
-        </w:rPr>
-        <w:t xml:space="preserve"> a </w:t>
-      </w:r>
-      <w:r>
-        <w:rPr>
-          <w:rFonts w:ascii="Arial" w:eastAsia="Arial" w:hAnsi="Arial" w:cs="Arial"/>
-          <w:b/>
-          <w:bCs/>
-          <w:color w:val="1A1A2E"/>
-          <w:sz w:val="22"/>
-          <w:szCs w:val="22"/>
-        </w:rPr>
-        <w:t>deterministickým generátorom</w:t>
-      </w:r>
-      <w:r>
-        <w:rPr>
-          <w:rFonts w:ascii="Arial" w:eastAsia="Arial" w:hAnsi="Arial" w:cs="Arial"/>
-          <w:color w:val="1A1A2E"/>
-          <w:sz w:val="22"/>
-          <w:szCs w:val="22"/>
-        </w:rPr>
-        <w:t xml:space="preserve"> dáva vysokú istotu o správnosti implementácie. Pre každú z 700 testovaných funkcií je garantované, že BDD vyhodnocuje správne </w:t>
-      </w:r>
-      <w:r>
-        <w:rPr>
-          <w:rFonts w:ascii="Arial" w:eastAsia="Arial" w:hAnsi="Arial" w:cs="Arial"/>
-          <w:b/>
-          <w:bCs/>
+        <w:t xml:space="preserve">Pre každú z 700 testovaných funkcií je garantované, že BDD vyhodnocuje správne </w:t>
+      </w:r>
+      <w:r>
+        <w:rPr>
+          <w:rFonts w:ascii="Arial" w:eastAsia="Arial" w:hAnsi="Arial" w:cs="Arial"/>
           <w:i/>
           <w:iCs/>
           <w:color w:val="1A1A2E"/>
@@ -13560,7 +14211,25 @@
           <w:sz w:val="22"/>
           <w:szCs w:val="22"/>
         </w:rPr>
-        <w:t xml:space="preserve"> vstupnú kombináciu – nie len tie "typické". Ak testy prejdú s 0 chybami, môžeme s vysokou mierou dôvery tvrdiť, že implementácia </w:t>
+        <w:t xml:space="preserve"> vstupnú kombináciu</w:t>
+      </w:r>
+      <w:r>
+        <w:rPr>
+          <w:rFonts w:ascii="Arial" w:eastAsia="Arial" w:hAnsi="Arial" w:cs="Arial"/>
+          <w:color w:val="1A1A2E"/>
+          <w:sz w:val="22"/>
+          <w:szCs w:val="22"/>
+        </w:rPr>
+        <w:t xml:space="preserve">. </w:t>
+      </w:r>
+      <w:r>
+        <w:rPr>
+          <w:rFonts w:ascii="Arial" w:eastAsia="Arial" w:hAnsi="Arial" w:cs="Arial"/>
+          <w:color w:val="1A1A2E"/>
+          <w:sz w:val="22"/>
+          <w:szCs w:val="22"/>
+        </w:rPr>
+        <w:t xml:space="preserve">Ak testy prejdú s 0 chybami, môžeme s vysokou mierou dôvery tvrdiť, že implementácia </w:t>
       </w:r>
       <w:proofErr w:type="spellStart"/>
       <w:r>
@@ -13761,17 +14430,43 @@
           <w:sz w:val="22"/>
           <w:szCs w:val="22"/>
         </w:rPr>
-        <w:t xml:space="preserve"> len syntaktickým overením – funkcia </w:t>
-      </w:r>
-      <w:r>
-        <w:rPr>
-          <w:rFonts w:ascii="Courier New" w:eastAsia="Courier New" w:hAnsi="Courier New" w:cs="Courier New"/>
-          <w:color w:val="1F2D3D"/>
-          <w:sz w:val="20"/>
-          <w:szCs w:val="20"/>
-          <w:shd w:val="clear" w:color="auto" w:fill="F4F4F4"/>
+        <w:t xml:space="preserve"> len syntaktickým overením</w:t>
+      </w:r>
+      <w:r>
+        <w:rPr>
+          <w:rFonts w:ascii="Arial" w:eastAsia="Arial" w:hAnsi="Arial" w:cs="Arial"/>
+          <w:color w:val="1A1A2E"/>
+          <w:sz w:val="22"/>
+          <w:szCs w:val="22"/>
+        </w:rPr>
+        <w:t>.</w:t>
+      </w:r>
+      <w:r>
+        <w:rPr>
+          <w:rFonts w:ascii="Arial" w:eastAsia="Arial" w:hAnsi="Arial" w:cs="Arial"/>
+          <w:color w:val="1A1A2E"/>
+          <w:sz w:val="22"/>
+          <w:szCs w:val="22"/>
         </w:rPr>
         <w:t xml:space="preserve"> </w:t>
+      </w:r>
+      <w:r>
+        <w:rPr>
+          <w:rFonts w:ascii="Arial" w:eastAsia="Arial" w:hAnsi="Arial" w:cs="Arial"/>
+          <w:color w:val="1A1A2E"/>
+          <w:sz w:val="22"/>
+          <w:szCs w:val="22"/>
+        </w:rPr>
+        <w:t>F</w:t>
+      </w:r>
+      <w:r>
+        <w:rPr>
+          <w:rFonts w:ascii="Arial" w:eastAsia="Arial" w:hAnsi="Arial" w:cs="Arial"/>
+          <w:color w:val="1A1A2E"/>
+          <w:sz w:val="22"/>
+          <w:szCs w:val="22"/>
+        </w:rPr>
+        <w:t xml:space="preserve">unkcia </w:t>
       </w:r>
       <w:proofErr w:type="spellStart"/>
       <w:r>
@@ -13834,13 +14529,12 @@
       <w:tblPr>
         <w:tblW w:w="9360" w:type="dxa"/>
         <w:tblBorders>
-          <w:top w:val="single" w:sz="4" w:space="0" w:color="auto"/>
-          <w:left w:val="single" w:sz="4" w:space="0" w:color="auto"/>
-          <w:bottom w:val="single" w:sz="4" w:space="0" w:color="auto"/>
-          <w:right w:val="single" w:sz="4" w:space="0" w:color="auto"/>
-          <w:insideH w:val="single" w:sz="4" w:space="0" w:color="auto"/>
-          <w:insideV w:val="single" w:sz="4" w:space="0" w:color="auto"/>
+          <w:top w:val="single" w:sz="6" w:space="0" w:color="BFBFBF" w:themeColor="background1" w:themeShade="BF"/>
+          <w:left w:val="single" w:sz="6" w:space="0" w:color="BFBFBF" w:themeColor="background1" w:themeShade="BF"/>
+          <w:bottom w:val="single" w:sz="6" w:space="0" w:color="BFBFBF" w:themeColor="background1" w:themeShade="BF"/>
+          <w:right w:val="single" w:sz="6" w:space="0" w:color="BFBFBF" w:themeColor="background1" w:themeShade="BF"/>
         </w:tblBorders>
+        <w:shd w:val="clear" w:color="auto" w:fill="F2F7FB"/>
         <w:tblCellMar>
           <w:left w:w="10" w:type="dxa"/>
           <w:right w:w="10" w:type="dxa"/>
@@ -13854,12 +14548,6 @@
         <w:tc>
           <w:tcPr>
             <w:tcW w:w="9360" w:type="dxa"/>
-            <w:tcBorders>
-              <w:top w:val="single" w:sz="1" w:space="0" w:color="ADB9CA"/>
-              <w:left w:val="single" w:sz="1" w:space="0" w:color="ADB9CA"/>
-              <w:bottom w:val="single" w:sz="1" w:space="0" w:color="ADB9CA"/>
-              <w:right w:val="single" w:sz="1" w:space="0" w:color="ADB9CA"/>
-            </w:tcBorders>
             <w:shd w:val="clear" w:color="auto" w:fill="F2F7FB"/>
             <w:tcMar>
               <w:top w:w="160" w:type="dxa"/>
@@ -13870,7 +14558,7 @@
           </w:tcPr>
           <w:p>
             <w:pPr>
-              <w:spacing w:before="60" w:after="80"/>
+              <w:spacing w:after="0"/>
             </w:pPr>
             <w:r>
               <w:rPr>
@@ -13886,7 +14574,7 @@
           </w:p>
           <w:p>
             <w:pPr>
-              <w:spacing w:after="60"/>
+              <w:spacing w:after="0"/>
             </w:pPr>
             <w:r>
               <w:rPr>
@@ -13931,7 +14619,7 @@
           </w:p>
           <w:p>
             <w:pPr>
-              <w:spacing w:after="60"/>
+              <w:spacing w:after="0"/>
             </w:pPr>
             <w:r>
               <w:rPr>
@@ -13989,7 +14677,7 @@
           </w:p>
           <w:p>
             <w:pPr>
-              <w:spacing w:after="60"/>
+              <w:spacing w:after="0"/>
             </w:pPr>
             <w:r>
               <w:rPr>

</xml_diff>

<commit_message>
maybe find a bug
</commit_message>
<xml_diff>
--- a/dsa 6 dokumentacia.docx
+++ b/dsa 6 dokumentacia.docx
@@ -19,12 +19,67 @@
     </w:p>
     <w:p>
       <w:pPr>
-        <w:pStyle w:val="Nzov"/>
         <w:jc w:val="center"/>
         <w:rPr>
+          <w:lang w:val="en-GB"/>
+        </w:rPr>
+      </w:pPr>
+      <w:proofErr w:type="spellStart"/>
+      <w:r>
+        <w:rPr>
           <w:lang w:val="en-US"/>
         </w:rPr>
-      </w:pPr>
+        <w:t>Dátové</w:t>
+      </w:r>
+      <w:proofErr w:type="spellEnd"/>
+      <w:r>
+        <w:rPr>
+          <w:lang w:val="en-US"/>
+        </w:rPr>
+        <w:t xml:space="preserve"> </w:t>
+      </w:r>
+      <w:proofErr w:type="spellStart"/>
+      <w:r>
+        <w:rPr>
+          <w:lang w:val="en-US"/>
+        </w:rPr>
+        <w:t>štruktúry</w:t>
+      </w:r>
+      <w:proofErr w:type="spellEnd"/>
+      <w:r>
+        <w:rPr>
+          <w:lang w:val="en-US"/>
+        </w:rPr>
+        <w:t xml:space="preserve"> </w:t>
+      </w:r>
+      <w:proofErr w:type="gramStart"/>
+      <w:r>
+        <w:rPr>
+          <w:lang w:val="en-US"/>
+        </w:rPr>
+        <w:t>a</w:t>
+      </w:r>
+      <w:proofErr w:type="gramEnd"/>
+      <w:r>
+        <w:rPr>
+          <w:lang w:val="en-US"/>
+        </w:rPr>
+        <w:t xml:space="preserve"> </w:t>
+      </w:r>
+      <w:proofErr w:type="spellStart"/>
+      <w:r>
+        <w:rPr>
+          <w:lang w:val="en-US"/>
+        </w:rPr>
+        <w:t>algoritmy</w:t>
+      </w:r>
+      <w:proofErr w:type="spellEnd"/>
+      <w:r>
+        <w:rPr>
+          <w:lang w:val="en-US"/>
+        </w:rPr>
+        <w:t>.</w:t>
+      </w:r>
     </w:p>
     <w:p>
       <w:pPr>

</xml_diff>

<commit_message>
added frequency sort and sifting in create with best order
</commit_message>
<xml_diff>
--- a/dsa 6 dokumentacia.docx
+++ b/dsa 6 dokumentacia.docx
@@ -50,21 +50,7 @@
         <w:rPr>
           <w:lang w:val="en-US"/>
         </w:rPr>
-        <w:t xml:space="preserve"> </w:t>
-      </w:r>
-      <w:proofErr w:type="gramStart"/>
-      <w:r>
-        <w:rPr>
-          <w:lang w:val="en-US"/>
-        </w:rPr>
-        <w:t>a</w:t>
-      </w:r>
-      <w:proofErr w:type="gramEnd"/>
-      <w:r>
-        <w:rPr>
-          <w:lang w:val="en-US"/>
-        </w:rPr>
-        <w:t xml:space="preserve"> </w:t>
+        <w:t xml:space="preserve"> a </w:t>
       </w:r>
       <w:proofErr w:type="spellStart"/>
       <w:r>
@@ -7275,7 +7261,43 @@
           <w:sz w:val="22"/>
           <w:szCs w:val="22"/>
         </w:rPr>
-        <w:t>Funkcia najprv extrahuje množinu premenných vyskytujúcich sa vo výraze (veľké písmená A–Z). Následne vyskúša N cyklických rotácií poradia premenných, kde N je ich počet. Napríklad pre premenné A, B, C sa vyskúšajú poradia ABC, BCA a CAB. Pre každú rotáciu sa vytvorí plnohodnotný BDD a porovná sa počet uzlov. BDD s najmenším počtom uzlov je ponechaný a ostatné sú uvoľnené.</w:t>
+        <w:t xml:space="preserve">Funkcia hľadá kompaktné poradie premenných pomocou dvojfázovej heuristiky: </w:t>
+      </w:r>
+      <w:proofErr w:type="spellStart"/>
+      <w:r>
+        <w:rPr>
+          <w:rFonts w:ascii="Arial" w:hAnsi="Arial" w:cs="Arial"/>
+          <w:sz w:val="22"/>
+          <w:szCs w:val="22"/>
+        </w:rPr>
+        <w:t>frequency</w:t>
+      </w:r>
+      <w:proofErr w:type="spellEnd"/>
+      <w:r>
+        <w:rPr>
+          <w:rFonts w:ascii="Arial" w:hAnsi="Arial" w:cs="Arial"/>
+          <w:sz w:val="22"/>
+          <w:szCs w:val="22"/>
+        </w:rPr>
+        <w:t xml:space="preserve"> sort a </w:t>
+      </w:r>
+      <w:proofErr w:type="spellStart"/>
+      <w:r>
+        <w:rPr>
+          <w:rFonts w:ascii="Arial" w:hAnsi="Arial" w:cs="Arial"/>
+          <w:sz w:val="22"/>
+          <w:szCs w:val="22"/>
+        </w:rPr>
+        <w:t>sifting</w:t>
+      </w:r>
+      <w:proofErr w:type="spellEnd"/>
+      <w:r>
+        <w:rPr>
+          <w:rFonts w:ascii="Arial" w:hAnsi="Arial" w:cs="Arial"/>
+          <w:sz w:val="22"/>
+          <w:szCs w:val="22"/>
+        </w:rPr>
+        <w:t>.</w:t>
       </w:r>
     </w:p>
     <w:p>
@@ -7287,24 +7309,158 @@
           <w:szCs w:val="22"/>
         </w:rPr>
       </w:pPr>
+      <w:proofErr w:type="spellStart"/>
       <w:r>
         <w:rPr>
           <w:rFonts w:ascii="Arial" w:hAnsi="Arial" w:cs="Arial"/>
           <w:sz w:val="22"/>
           <w:szCs w:val="22"/>
         </w:rPr>
-        <w:t xml:space="preserve">Táto stratégia nezaručuje globálne optimálne poradie, ale v praxi nachádza výrazne kompaktnejšie BDD oproti pevnému lexikografickému poradiu, najmä pri výrazoch s opakujúcimi sa premennými v susedných </w:t>
-      </w:r>
-      <w:proofErr w:type="spellStart"/>
+        <w:t>F</w:t>
+      </w:r>
       <w:r>
         <w:rPr>
           <w:rFonts w:ascii="Arial" w:hAnsi="Arial" w:cs="Arial"/>
           <w:sz w:val="22"/>
           <w:szCs w:val="22"/>
         </w:rPr>
-        <w:t>termoch</w:t>
-      </w:r>
-      <w:proofErr w:type="spellEnd"/>
+        <w:t>requency</w:t>
+      </w:r>
+      <w:proofErr w:type="spellEnd"/>
+      <w:r>
+        <w:rPr>
+          <w:rFonts w:ascii="Arial" w:hAnsi="Arial" w:cs="Arial"/>
+          <w:sz w:val="22"/>
+          <w:szCs w:val="22"/>
+        </w:rPr>
+        <w:t xml:space="preserve"> sort: Funkcia najprv spočíta, koľkokrát sa každá premenná vyskytuje vo výraze (počet výskytov znakov). Premenné sa zoradia zostupne podľa tejto frekvencie. Myšlienkou je, že premenné rozhodujúce o väčšom počte </w:t>
+      </w:r>
+      <w:proofErr w:type="spellStart"/>
+      <w:r>
+        <w:rPr>
+          <w:rFonts w:ascii="Arial" w:hAnsi="Arial" w:cs="Arial"/>
+          <w:sz w:val="22"/>
+          <w:szCs w:val="22"/>
+        </w:rPr>
+        <w:t>termov</w:t>
+      </w:r>
+      <w:proofErr w:type="spellEnd"/>
+      <w:r>
+        <w:rPr>
+          <w:rFonts w:ascii="Arial" w:hAnsi="Arial" w:cs="Arial"/>
+          <w:sz w:val="22"/>
+          <w:szCs w:val="22"/>
+        </w:rPr>
+        <w:t xml:space="preserve"> by mali byť bližšie ku koreňu BDD, kde ich rozvetvenie eliminuje čo najviac </w:t>
+      </w:r>
+      <w:proofErr w:type="spellStart"/>
+      <w:r>
+        <w:rPr>
+          <w:rFonts w:ascii="Arial" w:hAnsi="Arial" w:cs="Arial"/>
+          <w:sz w:val="22"/>
+          <w:szCs w:val="22"/>
+        </w:rPr>
+        <w:t>podstromov</w:t>
+      </w:r>
+      <w:proofErr w:type="spellEnd"/>
+      <w:r>
+        <w:rPr>
+          <w:rFonts w:ascii="Arial" w:hAnsi="Arial" w:cs="Arial"/>
+          <w:sz w:val="22"/>
+          <w:szCs w:val="22"/>
+        </w:rPr>
+        <w:t>.</w:t>
+      </w:r>
+    </w:p>
+    <w:p>
+      <w:pPr>
+        <w:spacing w:after="0"/>
+        <w:rPr>
+          <w:rFonts w:ascii="Arial" w:hAnsi="Arial" w:cs="Arial"/>
+          <w:sz w:val="22"/>
+          <w:szCs w:val="22"/>
+        </w:rPr>
+      </w:pPr>
+      <w:proofErr w:type="spellStart"/>
+      <w:r>
+        <w:rPr>
+          <w:rFonts w:ascii="Arial" w:hAnsi="Arial" w:cs="Arial"/>
+          <w:sz w:val="22"/>
+          <w:szCs w:val="22"/>
+        </w:rPr>
+        <w:t>S</w:t>
+      </w:r>
+      <w:r>
+        <w:rPr>
+          <w:rFonts w:ascii="Arial" w:hAnsi="Arial" w:cs="Arial"/>
+          <w:sz w:val="22"/>
+          <w:szCs w:val="22"/>
+        </w:rPr>
+        <w:t>ifting</w:t>
+      </w:r>
+      <w:proofErr w:type="spellEnd"/>
+      <w:r>
+        <w:rPr>
+          <w:rFonts w:ascii="Arial" w:hAnsi="Arial" w:cs="Arial"/>
+          <w:sz w:val="22"/>
+          <w:szCs w:val="22"/>
+        </w:rPr>
+        <w:t xml:space="preserve">: Zo zoradeného poradia sa skonštruuje počiatočný BDD. Následne sa pre každú premennú (iterácia cez index i) skúsi posunúť ju na všetky pozície doľava susedným swapom, potom sa </w:t>
+      </w:r>
+      <w:proofErr w:type="spellStart"/>
+      <w:r>
+        <w:rPr>
+          <w:rFonts w:ascii="Arial" w:hAnsi="Arial" w:cs="Arial"/>
+          <w:sz w:val="22"/>
+          <w:szCs w:val="22"/>
+        </w:rPr>
+        <w:t>order</w:t>
+      </w:r>
+      <w:proofErr w:type="spellEnd"/>
+      <w:r>
+        <w:rPr>
+          <w:rFonts w:ascii="Arial" w:hAnsi="Arial" w:cs="Arial"/>
+          <w:sz w:val="22"/>
+          <w:szCs w:val="22"/>
+        </w:rPr>
+        <w:t xml:space="preserve"> resetuje na doposiaľ najlepšie poradie a premenná sa skúsi posunúť na všetky pozície doprava. Po každom swape sa skonštruuje nový BDD a porovná sa počet uzlov s doterajším minimom. Ak swap zlepšil výsledok, nové poradie sa uloží ako aktuálne najlepšie. Po prehľadaní oboch smerov sa </w:t>
+      </w:r>
+      <w:proofErr w:type="spellStart"/>
+      <w:r>
+        <w:rPr>
+          <w:rFonts w:ascii="Arial" w:hAnsi="Arial" w:cs="Arial"/>
+          <w:sz w:val="22"/>
+          <w:szCs w:val="22"/>
+        </w:rPr>
+        <w:t>order</w:t>
+      </w:r>
+      <w:proofErr w:type="spellEnd"/>
+      <w:r>
+        <w:rPr>
+          <w:rFonts w:ascii="Arial" w:hAnsi="Arial" w:cs="Arial"/>
+          <w:sz w:val="22"/>
+          <w:szCs w:val="22"/>
+        </w:rPr>
+        <w:t xml:space="preserve"> znova resetuje na najlepšie nájdené poradie a pokračuje sa ďalšou premennou. Celý prechod cez všetky premenné sa opakuje, kým dochádza k zlepšeniu; počet volaní </w:t>
+      </w:r>
+      <w:proofErr w:type="spellStart"/>
+      <w:r>
+        <w:rPr>
+          <w:rFonts w:ascii="Courier New" w:hAnsi="Courier New" w:cs="Courier New"/>
+          <w:sz w:val="22"/>
+          <w:szCs w:val="22"/>
+        </w:rPr>
+        <w:t>BDD_create</w:t>
+      </w:r>
+      <w:proofErr w:type="spellEnd"/>
+      <w:r>
+        <w:rPr>
+          <w:rFonts w:ascii="Arial" w:hAnsi="Arial" w:cs="Arial"/>
+          <w:sz w:val="22"/>
+          <w:szCs w:val="22"/>
+        </w:rPr>
+        <w:t xml:space="preserve"> je navyše obmedzený hodnotou 2·n, kde n je počet premenných, čím sa zaručuje rozumný čas aj pre väčšie n</w:t>
+      </w:r>
       <w:r>
         <w:rPr>
           <w:rFonts w:ascii="Arial" w:hAnsi="Arial" w:cs="Arial"/>
@@ -7517,7 +7673,16 @@
           <w:sz w:val="22"/>
           <w:szCs w:val="22"/>
         </w:rPr>
-        <w:t xml:space="preserve"> a podľa zodpovedajúceho bitu vstupu sa pohne na vetvu </w:t>
+        <w:t xml:space="preserve"> a podľa zodpovedajúceho bitu vstupu sa pohne na </w:t>
+      </w:r>
+      <w:r>
+        <w:rPr>
+          <w:rFonts w:ascii="Arial" w:eastAsia="Arial" w:hAnsi="Arial" w:cs="Arial"/>
+          <w:sz w:val="22"/>
+          <w:szCs w:val="22"/>
+        </w:rPr>
+        <w:lastRenderedPageBreak/>
+        <w:t xml:space="preserve">vetvu </w:t>
       </w:r>
       <w:proofErr w:type="spellStart"/>
       <w:r>
@@ -7696,16 +7861,7 @@
           <w:sz w:val="22"/>
           <w:szCs w:val="22"/>
         </w:rPr>
-        <w:t xml:space="preserve">. Terminálne </w:t>
-      </w:r>
-      <w:r>
-        <w:rPr>
-          <w:rFonts w:ascii="Arial" w:eastAsia="Arial" w:hAnsi="Arial" w:cs="Arial"/>
-          <w:sz w:val="22"/>
-          <w:szCs w:val="22"/>
-        </w:rPr>
-        <w:lastRenderedPageBreak/>
-        <w:t xml:space="preserve">uzly musia byť uvoľnené až po </w:t>
+        <w:t xml:space="preserve">. Terminálne uzly musia byť uvoľnené až po </w:t>
       </w:r>
       <w:proofErr w:type="spellStart"/>
       <w:r>
@@ -8513,17 +8669,7 @@
                 <w:sz w:val="22"/>
                 <w:szCs w:val="22"/>
               </w:rPr>
-              <w:t xml:space="preserve"> zaradí s </w:t>
-            </w:r>
-            <w:r>
-              <w:rPr>
-                <w:rFonts w:ascii="Arial" w:eastAsia="Arial" w:hAnsi="Arial" w:cs="Arial"/>
-                <w:color w:val="1A1A2E"/>
-                <w:sz w:val="22"/>
-                <w:szCs w:val="22"/>
-              </w:rPr>
-              <w:lastRenderedPageBreak/>
-              <w:t xml:space="preserve">pravdepodobnosťou 50 % (s náhodnou negáciou). Ak by term zostal prázdny, doplní sa aspoň jeden náhodný </w:t>
+              <w:t xml:space="preserve"> zaradí s pravdepodobnosťou 50 % (s náhodnou negáciou). Ak by term zostal prázdny, doplní sa aspoň jeden náhodný </w:t>
             </w:r>
             <w:proofErr w:type="spellStart"/>
             <w:r>
@@ -9069,6 +9215,7 @@
           <w:sz w:val="20"/>
           <w:szCs w:val="20"/>
         </w:rPr>
+        <w:lastRenderedPageBreak/>
         <w:t>int</w:t>
       </w:r>
       <w:proofErr w:type="spellEnd"/>
@@ -9482,7 +9629,6 @@
           <w:sz w:val="20"/>
           <w:szCs w:val="20"/>
         </w:rPr>
-        <w:lastRenderedPageBreak/>
         <w:t xml:space="preserve">        </w:t>
       </w:r>
       <w:proofErr w:type="spellStart"/>
@@ -10751,7 +10897,17 @@
           <w:sz w:val="22"/>
           <w:szCs w:val="22"/>
         </w:rPr>
-        <w:t xml:space="preserve"> ani iných optimalizácií prítomných v BDD. Tým pádom sú obe implementácie navzájom nezávislé, a ak obe vrátia rovnaký výsledok, dáva nám to vysokú istotu o správnosti BDD.</w:t>
+        <w:t xml:space="preserve"> ani iných optimalizácií prítomných v BDD. Tým pádom </w:t>
+      </w:r>
+      <w:r>
+        <w:rPr>
+          <w:rFonts w:ascii="Arial" w:eastAsia="Arial" w:hAnsi="Arial" w:cs="Arial"/>
+          <w:color w:val="1A1A2E"/>
+          <w:sz w:val="22"/>
+          <w:szCs w:val="22"/>
+        </w:rPr>
+        <w:lastRenderedPageBreak/>
+        <w:t>sú obe implementácie navzájom nezávislé, a ak obe vrátia rovnaký výsledok, dáva nám to vysokú istotu o správnosti BDD.</w:t>
       </w:r>
     </w:p>
     <w:p>
@@ -10777,8 +10933,20 @@
           <w:sz w:val="22"/>
           <w:szCs w:val="22"/>
         </w:rPr>
-        <w:t>Funkcia</w:t>
-      </w:r>
+        <w:t xml:space="preserve">Funkcia </w:t>
+      </w:r>
+      <w:proofErr w:type="spellStart"/>
+      <w:r>
+        <w:rPr>
+          <w:rFonts w:ascii="Courier New" w:eastAsia="Courier New" w:hAnsi="Courier New" w:cs="Courier New"/>
+          <w:color w:val="1F2D3D"/>
+          <w:sz w:val="20"/>
+          <w:szCs w:val="20"/>
+          <w:shd w:val="clear" w:color="auto" w:fill="F4F4F4"/>
+        </w:rPr>
+        <w:t>BDD_create_with_best_order</w:t>
+      </w:r>
+      <w:proofErr w:type="spellEnd"/>
       <w:r>
         <w:rPr>
           <w:rFonts w:ascii="Arial" w:eastAsia="Arial" w:hAnsi="Arial" w:cs="Arial"/>
@@ -10786,6 +10954,280 @@
           <w:sz w:val="22"/>
           <w:szCs w:val="22"/>
         </w:rPr>
+        <w:t xml:space="preserve"> sa overuje rovnakým spôsobom ako </w:t>
+      </w:r>
+      <w:proofErr w:type="spellStart"/>
+      <w:r>
+        <w:rPr>
+          <w:rFonts w:ascii="Courier New" w:eastAsia="Courier New" w:hAnsi="Courier New" w:cs="Courier New"/>
+          <w:color w:val="1F2D3D"/>
+          <w:sz w:val="20"/>
+          <w:szCs w:val="20"/>
+          <w:shd w:val="clear" w:color="auto" w:fill="F4F4F4"/>
+        </w:rPr>
+        <w:t>BDD_create</w:t>
+      </w:r>
+      <w:proofErr w:type="spellEnd"/>
+      <w:r>
+        <w:rPr>
+          <w:rFonts w:ascii="Arial" w:eastAsia="Arial" w:hAnsi="Arial" w:cs="Arial"/>
+          <w:color w:val="1A1A2E"/>
+          <w:sz w:val="22"/>
+          <w:szCs w:val="22"/>
+        </w:rPr>
+        <w:t xml:space="preserve">. Funkcia </w:t>
+      </w:r>
+      <w:proofErr w:type="spellStart"/>
+      <w:r>
+        <w:rPr>
+          <w:rFonts w:ascii="Courier New" w:eastAsia="Courier New" w:hAnsi="Courier New" w:cs="Courier New"/>
+          <w:color w:val="1F2D3D"/>
+          <w:sz w:val="20"/>
+          <w:szCs w:val="20"/>
+          <w:shd w:val="clear" w:color="auto" w:fill="F4F4F4"/>
+        </w:rPr>
+        <w:t>verify_bdd</w:t>
+      </w:r>
+      <w:proofErr w:type="spellEnd"/>
+      <w:r>
+        <w:rPr>
+          <w:rFonts w:ascii="Courier New" w:eastAsia="Courier New" w:hAnsi="Courier New" w:cs="Courier New"/>
+          <w:color w:val="1F2D3D"/>
+          <w:sz w:val="20"/>
+          <w:szCs w:val="20"/>
+          <w:shd w:val="clear" w:color="auto" w:fill="F4F4F4"/>
+        </w:rPr>
+        <w:t>()</w:t>
+      </w:r>
+      <w:r>
+        <w:rPr>
+          <w:rFonts w:ascii="Arial" w:eastAsia="Arial" w:hAnsi="Arial" w:cs="Arial"/>
+          <w:color w:val="1A1A2E"/>
+          <w:sz w:val="22"/>
+          <w:szCs w:val="22"/>
+        </w:rPr>
+        <w:t xml:space="preserve"> vždy </w:t>
+      </w:r>
+      <w:proofErr w:type="spellStart"/>
+      <w:r>
+        <w:rPr>
+          <w:rFonts w:ascii="Arial" w:eastAsia="Arial" w:hAnsi="Arial" w:cs="Arial"/>
+          <w:color w:val="1A1A2E"/>
+          <w:sz w:val="22"/>
+          <w:szCs w:val="22"/>
+        </w:rPr>
+        <w:t>premapuje</w:t>
+      </w:r>
+      <w:proofErr w:type="spellEnd"/>
+      <w:r>
+        <w:rPr>
+          <w:rFonts w:ascii="Arial" w:eastAsia="Arial" w:hAnsi="Arial" w:cs="Arial"/>
+          <w:color w:val="1A1A2E"/>
+          <w:sz w:val="22"/>
+          <w:szCs w:val="22"/>
+        </w:rPr>
+        <w:t xml:space="preserve"> vstupný vektor z abecedného poradia do poradia </w:t>
+      </w:r>
+      <w:proofErr w:type="spellStart"/>
+      <w:r>
+        <w:rPr>
+          <w:rFonts w:ascii="Courier New" w:eastAsia="Courier New" w:hAnsi="Courier New" w:cs="Courier New"/>
+          <w:color w:val="1F2D3D"/>
+          <w:sz w:val="20"/>
+          <w:szCs w:val="20"/>
+          <w:shd w:val="clear" w:color="auto" w:fill="F4F4F4"/>
+        </w:rPr>
+        <w:t>bdd</w:t>
+      </w:r>
+      <w:proofErr w:type="spellEnd"/>
+      <w:r>
+        <w:rPr>
+          <w:rFonts w:ascii="Courier New" w:eastAsia="Courier New" w:hAnsi="Courier New" w:cs="Courier New"/>
+          <w:color w:val="1F2D3D"/>
+          <w:sz w:val="20"/>
+          <w:szCs w:val="20"/>
+          <w:shd w:val="clear" w:color="auto" w:fill="F4F4F4"/>
+        </w:rPr>
+        <w:t>-&gt;</w:t>
+      </w:r>
+      <w:proofErr w:type="spellStart"/>
+      <w:r>
+        <w:rPr>
+          <w:rFonts w:ascii="Courier New" w:eastAsia="Courier New" w:hAnsi="Courier New" w:cs="Courier New"/>
+          <w:color w:val="1F2D3D"/>
+          <w:sz w:val="20"/>
+          <w:szCs w:val="20"/>
+          <w:shd w:val="clear" w:color="auto" w:fill="F4F4F4"/>
+        </w:rPr>
+        <w:t>varOrder</w:t>
+      </w:r>
+      <w:proofErr w:type="spellEnd"/>
+      <w:r>
+        <w:rPr>
+          <w:rFonts w:ascii="Arial" w:eastAsia="Arial" w:hAnsi="Arial" w:cs="Arial"/>
+          <w:color w:val="1A1A2E"/>
+          <w:sz w:val="22"/>
+          <w:szCs w:val="22"/>
+        </w:rPr>
+        <w:t xml:space="preserve">, pretože </w:t>
+      </w:r>
+      <w:proofErr w:type="spellStart"/>
+      <w:r>
+        <w:rPr>
+          <w:rFonts w:ascii="Courier New" w:eastAsia="Courier New" w:hAnsi="Courier New" w:cs="Courier New"/>
+          <w:color w:val="1F2D3D"/>
+          <w:sz w:val="20"/>
+          <w:szCs w:val="20"/>
+          <w:shd w:val="clear" w:color="auto" w:fill="F4F4F4"/>
+        </w:rPr>
+        <w:t>BDD_use</w:t>
+      </w:r>
+      <w:proofErr w:type="spellEnd"/>
+      <w:r>
+        <w:rPr>
+          <w:rFonts w:ascii="Courier New" w:eastAsia="Courier New" w:hAnsi="Courier New" w:cs="Courier New"/>
+          <w:color w:val="1F2D3D"/>
+          <w:sz w:val="20"/>
+          <w:szCs w:val="20"/>
+          <w:shd w:val="clear" w:color="auto" w:fill="F4F4F4"/>
+        </w:rPr>
+        <w:t>()</w:t>
+      </w:r>
+      <w:r>
+        <w:rPr>
+          <w:rFonts w:ascii="Arial" w:eastAsia="Arial" w:hAnsi="Arial" w:cs="Arial"/>
+          <w:color w:val="1A1A2E"/>
+          <w:sz w:val="22"/>
+          <w:szCs w:val="22"/>
+        </w:rPr>
+        <w:t xml:space="preserve"> očakáva vstupy práve v tomto poradí. </w:t>
+      </w:r>
+      <w:proofErr w:type="spellStart"/>
+      <w:r>
+        <w:rPr>
+          <w:rFonts w:ascii="Arial" w:eastAsia="Arial" w:hAnsi="Arial" w:cs="Arial"/>
+          <w:color w:val="1A1A2E"/>
+          <w:sz w:val="22"/>
+          <w:szCs w:val="22"/>
+        </w:rPr>
+        <w:t>Premapovanie</w:t>
+      </w:r>
+      <w:proofErr w:type="spellEnd"/>
+      <w:r>
+        <w:rPr>
+          <w:rFonts w:ascii="Arial" w:eastAsia="Arial" w:hAnsi="Arial" w:cs="Arial"/>
+          <w:color w:val="1A1A2E"/>
+          <w:sz w:val="22"/>
+          <w:szCs w:val="22"/>
+        </w:rPr>
+        <w:t xml:space="preserve"> funguje tak, že pre každú pozíciu v </w:t>
+      </w:r>
+      <w:proofErr w:type="spellStart"/>
+      <w:r>
+        <w:rPr>
+          <w:rFonts w:ascii="Courier New" w:eastAsia="Courier New" w:hAnsi="Courier New" w:cs="Courier New"/>
+          <w:color w:val="1F2D3D"/>
+          <w:sz w:val="20"/>
+          <w:szCs w:val="20"/>
+          <w:shd w:val="clear" w:color="auto" w:fill="F4F4F4"/>
+        </w:rPr>
+        <w:t>varOrder</w:t>
+      </w:r>
+      <w:proofErr w:type="spellEnd"/>
+      <w:r>
+        <w:rPr>
+          <w:rFonts w:ascii="Arial" w:eastAsia="Arial" w:hAnsi="Arial" w:cs="Arial"/>
+          <w:color w:val="1A1A2E"/>
+          <w:sz w:val="22"/>
+          <w:szCs w:val="22"/>
+        </w:rPr>
+        <w:t xml:space="preserve"> sa nájde pozícia tej istej premennej v abecednom poradí a skopíruje sa zodpovedajúca hodnota. </w:t>
+      </w:r>
+      <w:proofErr w:type="spellStart"/>
+      <w:r>
+        <w:rPr>
+          <w:rFonts w:ascii="Arial" w:eastAsia="Arial" w:hAnsi="Arial" w:cs="Arial"/>
+          <w:color w:val="1A1A2E"/>
+          <w:sz w:val="22"/>
+          <w:szCs w:val="22"/>
+        </w:rPr>
+        <w:t>Premapovanie</w:t>
+      </w:r>
+      <w:proofErr w:type="spellEnd"/>
+      <w:r>
+        <w:rPr>
+          <w:rFonts w:ascii="Arial" w:eastAsia="Arial" w:hAnsi="Arial" w:cs="Arial"/>
+          <w:color w:val="1A1A2E"/>
+          <w:sz w:val="22"/>
+          <w:szCs w:val="22"/>
+        </w:rPr>
+        <w:t xml:space="preserve"> je súčasťou </w:t>
+      </w:r>
+      <w:proofErr w:type="spellStart"/>
+      <w:r>
+        <w:rPr>
+          <w:rFonts w:ascii="Courier New" w:eastAsia="Courier New" w:hAnsi="Courier New" w:cs="Courier New"/>
+          <w:color w:val="1F2D3D"/>
+          <w:sz w:val="20"/>
+          <w:szCs w:val="20"/>
+          <w:shd w:val="clear" w:color="auto" w:fill="F4F4F4"/>
+        </w:rPr>
+        <w:t>verify_bdd</w:t>
+      </w:r>
+      <w:proofErr w:type="spellEnd"/>
+      <w:r>
+        <w:rPr>
+          <w:rFonts w:ascii="Courier New" w:eastAsia="Courier New" w:hAnsi="Courier New" w:cs="Courier New"/>
+          <w:color w:val="1F2D3D"/>
+          <w:sz w:val="20"/>
+          <w:szCs w:val="20"/>
+          <w:shd w:val="clear" w:color="auto" w:fill="F4F4F4"/>
+        </w:rPr>
+        <w:t>()</w:t>
+      </w:r>
+      <w:r>
+        <w:rPr>
+          <w:rFonts w:ascii="Arial" w:eastAsia="Arial" w:hAnsi="Arial" w:cs="Arial"/>
+          <w:color w:val="1A1A2E"/>
+          <w:sz w:val="22"/>
+          <w:szCs w:val="22"/>
+        </w:rPr>
+        <w:t xml:space="preserve">  </w:t>
+      </w:r>
+      <w:r>
+        <w:rPr>
+          <w:rFonts w:ascii="Arial" w:eastAsia="Arial" w:hAnsi="Arial" w:cs="Arial"/>
+          <w:color w:val="1A1A2E"/>
+          <w:sz w:val="22"/>
+          <w:szCs w:val="22"/>
+        </w:rPr>
+        <w:t>vždy, bez ohľadu na to, či bol BDD vytvoren</w:t>
+      </w:r>
+      <w:r>
+        <w:rPr>
+          <w:rFonts w:ascii="Arial" w:eastAsia="Arial" w:hAnsi="Arial" w:cs="Arial"/>
+          <w:color w:val="1A1A2E"/>
+          <w:sz w:val="22"/>
+          <w:szCs w:val="22"/>
+        </w:rPr>
+        <w:t>ý</w:t>
+      </w:r>
+      <w:r>
+        <w:rPr>
+          <w:rFonts w:ascii="Arial" w:eastAsia="Arial" w:hAnsi="Arial" w:cs="Arial"/>
+          <w:color w:val="1A1A2E"/>
+          <w:sz w:val="22"/>
+          <w:szCs w:val="22"/>
+        </w:rPr>
+        <w:t xml:space="preserve"> cez</w:t>
+      </w:r>
+      <w:r>
+        <w:rPr>
+          <w:rFonts w:ascii="Arial" w:eastAsia="Arial" w:hAnsi="Arial" w:cs="Arial"/>
+          <w:color w:val="1A1A2E"/>
+          <w:sz w:val="22"/>
+          <w:szCs w:val="22"/>
+        </w:rPr>
         <w:t xml:space="preserve"> </w:t>
       </w:r>
       <w:proofErr w:type="spellStart"/>
@@ -10797,6 +11239,37 @@
           <w:szCs w:val="20"/>
           <w:shd w:val="clear" w:color="auto" w:fill="F4F4F4"/>
         </w:rPr>
+        <w:t>BDD_create</w:t>
+      </w:r>
+      <w:proofErr w:type="spellEnd"/>
+      <w:r>
+        <w:rPr>
+          <w:rFonts w:ascii="Arial" w:eastAsia="Arial" w:hAnsi="Arial" w:cs="Arial"/>
+          <w:color w:val="1A1A2E"/>
+          <w:sz w:val="22"/>
+          <w:szCs w:val="22"/>
+        </w:rPr>
+        <w:t xml:space="preserve"> alebo </w:t>
+      </w:r>
+      <w:r>
+        <w:rPr>
+          <w:rFonts w:ascii="Courier New" w:eastAsia="Courier New" w:hAnsi="Courier New" w:cs="Courier New"/>
+          <w:color w:val="1F2D3D"/>
+          <w:sz w:val="20"/>
+          <w:szCs w:val="20"/>
+          <w:shd w:val="clear" w:color="auto" w:fill="F4F4F4"/>
+        </w:rPr>
+        <w:t xml:space="preserve"> </w:t>
+      </w:r>
+      <w:proofErr w:type="spellStart"/>
+      <w:r>
+        <w:rPr>
+          <w:rFonts w:ascii="Courier New" w:eastAsia="Courier New" w:hAnsi="Courier New" w:cs="Courier New"/>
+          <w:color w:val="1F2D3D"/>
+          <w:sz w:val="20"/>
+          <w:szCs w:val="20"/>
+          <w:shd w:val="clear" w:color="auto" w:fill="F4F4F4"/>
+        </w:rPr>
         <w:t>BDD_create_with_best_order</w:t>
       </w:r>
       <w:proofErr w:type="spellEnd"/>
@@ -10807,397 +11280,7 @@
           <w:sz w:val="22"/>
           <w:szCs w:val="22"/>
         </w:rPr>
-        <w:t xml:space="preserve"> sa overuje rovnakým spôsobom ako </w:t>
-      </w:r>
-      <w:proofErr w:type="spellStart"/>
-      <w:r>
-        <w:rPr>
-          <w:rFonts w:ascii="Courier New" w:eastAsia="Courier New" w:hAnsi="Courier New" w:cs="Courier New"/>
-          <w:color w:val="1F2D3D"/>
-          <w:sz w:val="20"/>
-          <w:szCs w:val="20"/>
-          <w:shd w:val="clear" w:color="auto" w:fill="F4F4F4"/>
-        </w:rPr>
-        <w:t>BDD_create</w:t>
-      </w:r>
-      <w:proofErr w:type="spellEnd"/>
-      <w:r>
-        <w:rPr>
-          <w:rFonts w:ascii="Arial" w:eastAsia="Arial" w:hAnsi="Arial" w:cs="Arial"/>
-          <w:color w:val="1A1A2E"/>
-          <w:sz w:val="22"/>
-          <w:szCs w:val="22"/>
-        </w:rPr>
-        <w:t xml:space="preserve">. Funkcia </w:t>
-      </w:r>
-      <w:proofErr w:type="spellStart"/>
-      <w:r>
-        <w:rPr>
-          <w:rFonts w:ascii="Courier New" w:eastAsia="Courier New" w:hAnsi="Courier New" w:cs="Courier New"/>
-          <w:color w:val="1F2D3D"/>
-          <w:sz w:val="20"/>
-          <w:szCs w:val="20"/>
-          <w:shd w:val="clear" w:color="auto" w:fill="F4F4F4"/>
-        </w:rPr>
-        <w:t>verify_bdd</w:t>
-      </w:r>
-      <w:proofErr w:type="spellEnd"/>
-      <w:r>
-        <w:rPr>
-          <w:rFonts w:ascii="Courier New" w:eastAsia="Courier New" w:hAnsi="Courier New" w:cs="Courier New"/>
-          <w:color w:val="1F2D3D"/>
-          <w:sz w:val="20"/>
-          <w:szCs w:val="20"/>
-          <w:shd w:val="clear" w:color="auto" w:fill="F4F4F4"/>
-        </w:rPr>
-        <w:t>()</w:t>
-      </w:r>
-      <w:r>
-        <w:rPr>
-          <w:rFonts w:ascii="Arial" w:eastAsia="Arial" w:hAnsi="Arial" w:cs="Arial"/>
-          <w:color w:val="1A1A2E"/>
-          <w:sz w:val="22"/>
-          <w:szCs w:val="22"/>
-        </w:rPr>
-        <w:t xml:space="preserve"> vždy </w:t>
-      </w:r>
-      <w:proofErr w:type="spellStart"/>
-      <w:r>
-        <w:rPr>
-          <w:rFonts w:ascii="Arial" w:eastAsia="Arial" w:hAnsi="Arial" w:cs="Arial"/>
-          <w:color w:val="1A1A2E"/>
-          <w:sz w:val="22"/>
-          <w:szCs w:val="22"/>
-        </w:rPr>
-        <w:t>premapuje</w:t>
-      </w:r>
-      <w:proofErr w:type="spellEnd"/>
-      <w:r>
-        <w:rPr>
-          <w:rFonts w:ascii="Arial" w:eastAsia="Arial" w:hAnsi="Arial" w:cs="Arial"/>
-          <w:color w:val="1A1A2E"/>
-          <w:sz w:val="22"/>
-          <w:szCs w:val="22"/>
-        </w:rPr>
-        <w:t xml:space="preserve"> vstupný vektor z abecedného poradia do poradia </w:t>
-      </w:r>
-      <w:proofErr w:type="spellStart"/>
-      <w:r>
-        <w:rPr>
-          <w:rFonts w:ascii="Courier New" w:eastAsia="Courier New" w:hAnsi="Courier New" w:cs="Courier New"/>
-          <w:color w:val="1F2D3D"/>
-          <w:sz w:val="20"/>
-          <w:szCs w:val="20"/>
-          <w:shd w:val="clear" w:color="auto" w:fill="F4F4F4"/>
-        </w:rPr>
-        <w:t>bdd</w:t>
-      </w:r>
-      <w:proofErr w:type="spellEnd"/>
-      <w:r>
-        <w:rPr>
-          <w:rFonts w:ascii="Courier New" w:eastAsia="Courier New" w:hAnsi="Courier New" w:cs="Courier New"/>
-          <w:color w:val="1F2D3D"/>
-          <w:sz w:val="20"/>
-          <w:szCs w:val="20"/>
-          <w:shd w:val="clear" w:color="auto" w:fill="F4F4F4"/>
-        </w:rPr>
-        <w:t>-&gt;</w:t>
-      </w:r>
-      <w:proofErr w:type="spellStart"/>
-      <w:r>
-        <w:rPr>
-          <w:rFonts w:ascii="Courier New" w:eastAsia="Courier New" w:hAnsi="Courier New" w:cs="Courier New"/>
-          <w:color w:val="1F2D3D"/>
-          <w:sz w:val="20"/>
-          <w:szCs w:val="20"/>
-          <w:shd w:val="clear" w:color="auto" w:fill="F4F4F4"/>
-        </w:rPr>
-        <w:t>varOrder</w:t>
-      </w:r>
-      <w:proofErr w:type="spellEnd"/>
-      <w:r>
-        <w:rPr>
-          <w:rFonts w:ascii="Arial" w:eastAsia="Arial" w:hAnsi="Arial" w:cs="Arial"/>
-          <w:color w:val="1A1A2E"/>
-          <w:sz w:val="22"/>
-          <w:szCs w:val="22"/>
-        </w:rPr>
-        <w:t xml:space="preserve">, pretože </w:t>
-      </w:r>
-      <w:proofErr w:type="spellStart"/>
-      <w:r>
-        <w:rPr>
-          <w:rFonts w:ascii="Courier New" w:eastAsia="Courier New" w:hAnsi="Courier New" w:cs="Courier New"/>
-          <w:color w:val="1F2D3D"/>
-          <w:sz w:val="20"/>
-          <w:szCs w:val="20"/>
-          <w:shd w:val="clear" w:color="auto" w:fill="F4F4F4"/>
-        </w:rPr>
-        <w:t>BDD_use</w:t>
-      </w:r>
-      <w:proofErr w:type="spellEnd"/>
-      <w:r>
-        <w:rPr>
-          <w:rFonts w:ascii="Courier New" w:eastAsia="Courier New" w:hAnsi="Courier New" w:cs="Courier New"/>
-          <w:color w:val="1F2D3D"/>
-          <w:sz w:val="20"/>
-          <w:szCs w:val="20"/>
-          <w:shd w:val="clear" w:color="auto" w:fill="F4F4F4"/>
-        </w:rPr>
-        <w:t>()</w:t>
-      </w:r>
-      <w:r>
-        <w:rPr>
-          <w:rFonts w:ascii="Arial" w:eastAsia="Arial" w:hAnsi="Arial" w:cs="Arial"/>
-          <w:color w:val="1A1A2E"/>
-          <w:sz w:val="22"/>
-          <w:szCs w:val="22"/>
-        </w:rPr>
-        <w:t xml:space="preserve"> očakáva vstupy práve v tomto poradí. </w:t>
-      </w:r>
-      <w:proofErr w:type="spellStart"/>
-      <w:r>
-        <w:rPr>
-          <w:rFonts w:ascii="Arial" w:eastAsia="Arial" w:hAnsi="Arial" w:cs="Arial"/>
-          <w:color w:val="1A1A2E"/>
-          <w:sz w:val="22"/>
-          <w:szCs w:val="22"/>
-        </w:rPr>
-        <w:t>Premapovanie</w:t>
-      </w:r>
-      <w:proofErr w:type="spellEnd"/>
-      <w:r>
-        <w:rPr>
-          <w:rFonts w:ascii="Arial" w:eastAsia="Arial" w:hAnsi="Arial" w:cs="Arial"/>
-          <w:color w:val="1A1A2E"/>
-          <w:sz w:val="22"/>
-          <w:szCs w:val="22"/>
-        </w:rPr>
-        <w:t xml:space="preserve"> </w:t>
-      </w:r>
-      <w:r>
-        <w:rPr>
-          <w:rFonts w:ascii="Arial" w:eastAsia="Arial" w:hAnsi="Arial" w:cs="Arial"/>
-          <w:color w:val="1A1A2E"/>
-          <w:sz w:val="22"/>
-          <w:szCs w:val="22"/>
-        </w:rPr>
-        <w:lastRenderedPageBreak/>
-        <w:t xml:space="preserve">funguje tak, že pre každú pozíciu v </w:t>
-      </w:r>
-      <w:proofErr w:type="spellStart"/>
-      <w:r>
-        <w:rPr>
-          <w:rFonts w:ascii="Courier New" w:eastAsia="Courier New" w:hAnsi="Courier New" w:cs="Courier New"/>
-          <w:color w:val="1F2D3D"/>
-          <w:sz w:val="20"/>
-          <w:szCs w:val="20"/>
-          <w:shd w:val="clear" w:color="auto" w:fill="F4F4F4"/>
-        </w:rPr>
-        <w:t>varOrder</w:t>
-      </w:r>
-      <w:proofErr w:type="spellEnd"/>
-      <w:r>
-        <w:rPr>
-          <w:rFonts w:ascii="Arial" w:eastAsia="Arial" w:hAnsi="Arial" w:cs="Arial"/>
-          <w:color w:val="1A1A2E"/>
-          <w:sz w:val="22"/>
-          <w:szCs w:val="22"/>
-        </w:rPr>
-        <w:t xml:space="preserve"> sa nájde pozícia tej istej premennej v abecednom poradí a skopíruje sa zodpovedajúca hodnota. </w:t>
-      </w:r>
-      <w:proofErr w:type="spellStart"/>
-      <w:r>
-        <w:rPr>
-          <w:rFonts w:ascii="Arial" w:eastAsia="Arial" w:hAnsi="Arial" w:cs="Arial"/>
-          <w:color w:val="1A1A2E"/>
-          <w:sz w:val="22"/>
-          <w:szCs w:val="22"/>
-        </w:rPr>
-        <w:t>P</w:t>
-      </w:r>
-      <w:r>
-        <w:rPr>
-          <w:rFonts w:ascii="Arial" w:eastAsia="Arial" w:hAnsi="Arial" w:cs="Arial"/>
-          <w:color w:val="1A1A2E"/>
-          <w:sz w:val="22"/>
-          <w:szCs w:val="22"/>
-        </w:rPr>
-        <w:t>remapovanie</w:t>
-      </w:r>
-      <w:proofErr w:type="spellEnd"/>
-      <w:r>
-        <w:rPr>
-          <w:rFonts w:ascii="Arial" w:eastAsia="Arial" w:hAnsi="Arial" w:cs="Arial"/>
-          <w:color w:val="1A1A2E"/>
-          <w:sz w:val="22"/>
-          <w:szCs w:val="22"/>
-        </w:rPr>
-        <w:t xml:space="preserve"> je </w:t>
-      </w:r>
-      <w:r>
-        <w:rPr>
-          <w:rFonts w:ascii="Arial" w:eastAsia="Arial" w:hAnsi="Arial" w:cs="Arial"/>
-          <w:color w:val="1A1A2E"/>
-          <w:sz w:val="22"/>
-          <w:szCs w:val="22"/>
-        </w:rPr>
-        <w:t xml:space="preserve">súčasťou </w:t>
-      </w:r>
-      <w:proofErr w:type="spellStart"/>
-      <w:r>
-        <w:rPr>
-          <w:rFonts w:ascii="Courier New" w:eastAsia="Courier New" w:hAnsi="Courier New" w:cs="Courier New"/>
-          <w:color w:val="1F2D3D"/>
-          <w:sz w:val="20"/>
-          <w:szCs w:val="20"/>
-          <w:shd w:val="clear" w:color="auto" w:fill="F4F4F4"/>
-        </w:rPr>
-        <w:t>verify_bdd</w:t>
-      </w:r>
-      <w:proofErr w:type="spellEnd"/>
-      <w:r>
-        <w:rPr>
-          <w:rFonts w:ascii="Courier New" w:eastAsia="Courier New" w:hAnsi="Courier New" w:cs="Courier New"/>
-          <w:color w:val="1F2D3D"/>
-          <w:sz w:val="20"/>
-          <w:szCs w:val="20"/>
-          <w:shd w:val="clear" w:color="auto" w:fill="F4F4F4"/>
-        </w:rPr>
-        <w:t>()</w:t>
-      </w:r>
-      <w:r>
-        <w:rPr>
-          <w:rFonts w:ascii="Arial" w:eastAsia="Arial" w:hAnsi="Arial" w:cs="Arial"/>
-          <w:color w:val="1A1A2E"/>
-          <w:sz w:val="22"/>
-          <w:szCs w:val="22"/>
-        </w:rPr>
-        <w:t xml:space="preserve"> </w:t>
-      </w:r>
-      <w:r>
-        <w:rPr>
-          <w:rFonts w:ascii="Arial" w:eastAsia="Arial" w:hAnsi="Arial" w:cs="Arial"/>
-          <w:color w:val="1A1A2E"/>
-          <w:sz w:val="22"/>
-          <w:szCs w:val="22"/>
-        </w:rPr>
-        <w:t xml:space="preserve"> </w:t>
-      </w:r>
-      <w:r>
-        <w:rPr>
-          <w:rFonts w:ascii="Arial" w:eastAsia="Arial" w:hAnsi="Arial" w:cs="Arial"/>
-          <w:color w:val="1A1A2E"/>
-          <w:sz w:val="22"/>
-          <w:szCs w:val="22"/>
-        </w:rPr>
-        <w:t>vždy, bez ohľadu na to, či bol BDD vytvoren</w:t>
-      </w:r>
-      <w:r>
-        <w:rPr>
-          <w:rFonts w:ascii="Arial" w:eastAsia="Arial" w:hAnsi="Arial" w:cs="Arial"/>
-          <w:color w:val="1A1A2E"/>
-          <w:sz w:val="22"/>
-          <w:szCs w:val="22"/>
-        </w:rPr>
-        <w:t>ý</w:t>
-      </w:r>
-      <w:r>
-        <w:rPr>
-          <w:rFonts w:ascii="Arial" w:eastAsia="Arial" w:hAnsi="Arial" w:cs="Arial"/>
-          <w:color w:val="1A1A2E"/>
-          <w:sz w:val="22"/>
-          <w:szCs w:val="22"/>
-        </w:rPr>
-        <w:t xml:space="preserve"> cez</w:t>
-      </w:r>
-      <w:r>
-        <w:rPr>
-          <w:rFonts w:ascii="Arial" w:eastAsia="Arial" w:hAnsi="Arial" w:cs="Arial"/>
-          <w:color w:val="1A1A2E"/>
-          <w:sz w:val="22"/>
-          <w:szCs w:val="22"/>
-        </w:rPr>
-        <w:t xml:space="preserve"> </w:t>
-      </w:r>
-      <w:proofErr w:type="spellStart"/>
-      <w:r>
-        <w:rPr>
-          <w:rFonts w:ascii="Courier New" w:eastAsia="Courier New" w:hAnsi="Courier New" w:cs="Courier New"/>
-          <w:color w:val="1F2D3D"/>
-          <w:sz w:val="20"/>
-          <w:szCs w:val="20"/>
-          <w:shd w:val="clear" w:color="auto" w:fill="F4F4F4"/>
-        </w:rPr>
-        <w:t>BDD_create</w:t>
-      </w:r>
-      <w:proofErr w:type="spellEnd"/>
-      <w:r>
-        <w:rPr>
-          <w:rFonts w:ascii="Arial" w:eastAsia="Arial" w:hAnsi="Arial" w:cs="Arial"/>
-          <w:color w:val="1A1A2E"/>
-          <w:sz w:val="22"/>
-          <w:szCs w:val="22"/>
-        </w:rPr>
-        <w:t xml:space="preserve"> a</w:t>
-      </w:r>
-      <w:r>
-        <w:rPr>
-          <w:rFonts w:ascii="Arial" w:eastAsia="Arial" w:hAnsi="Arial" w:cs="Arial"/>
-          <w:color w:val="1A1A2E"/>
-          <w:sz w:val="22"/>
-          <w:szCs w:val="22"/>
-        </w:rPr>
-        <w:t>lebo</w:t>
-      </w:r>
-      <w:r>
-        <w:rPr>
-          <w:rFonts w:ascii="Arial" w:eastAsia="Arial" w:hAnsi="Arial" w:cs="Arial"/>
-          <w:color w:val="1A1A2E"/>
-          <w:sz w:val="22"/>
-          <w:szCs w:val="22"/>
-        </w:rPr>
-        <w:t xml:space="preserve"> </w:t>
-      </w:r>
-      <w:r>
-        <w:rPr>
-          <w:rFonts w:ascii="Courier New" w:eastAsia="Courier New" w:hAnsi="Courier New" w:cs="Courier New"/>
-          <w:color w:val="1F2D3D"/>
-          <w:sz w:val="20"/>
-          <w:szCs w:val="20"/>
-          <w:shd w:val="clear" w:color="auto" w:fill="F4F4F4"/>
-        </w:rPr>
-        <w:t xml:space="preserve"> </w:t>
-      </w:r>
-      <w:proofErr w:type="spellStart"/>
-      <w:r>
-        <w:rPr>
-          <w:rFonts w:ascii="Courier New" w:eastAsia="Courier New" w:hAnsi="Courier New" w:cs="Courier New"/>
-          <w:color w:val="1F2D3D"/>
-          <w:sz w:val="20"/>
-          <w:szCs w:val="20"/>
-          <w:shd w:val="clear" w:color="auto" w:fill="F4F4F4"/>
-        </w:rPr>
-        <w:t>BDD_create_with_best_order</w:t>
-      </w:r>
-      <w:proofErr w:type="spellEnd"/>
-      <w:r>
-        <w:rPr>
-          <w:rFonts w:ascii="Arial" w:eastAsia="Arial" w:hAnsi="Arial" w:cs="Arial"/>
-          <w:color w:val="1A1A2E"/>
-          <w:sz w:val="22"/>
-          <w:szCs w:val="22"/>
-        </w:rPr>
-        <w:t>. P</w:t>
-      </w:r>
-      <w:r>
-        <w:rPr>
-          <w:rFonts w:ascii="Arial" w:eastAsia="Arial" w:hAnsi="Arial" w:cs="Arial"/>
-          <w:color w:val="1A1A2E"/>
-          <w:sz w:val="22"/>
-          <w:szCs w:val="22"/>
-        </w:rPr>
-        <w:t xml:space="preserve">ri lexikografickom poradí </w:t>
+        <w:t xml:space="preserve">. Pri lexikografickom poradí </w:t>
       </w:r>
       <w:r>
         <w:rPr>
@@ -12318,7 +12401,6 @@
                 <w:sz w:val="20"/>
                 <w:szCs w:val="20"/>
               </w:rPr>
-              <w:lastRenderedPageBreak/>
               <w:t xml:space="preserve">Uzly </w:t>
             </w:r>
             <w:proofErr w:type="spellStart"/>
@@ -12385,7 +12467,47 @@
                 <w:sz w:val="20"/>
                 <w:szCs w:val="20"/>
               </w:rPr>
-              <w:t>Rovnaká metrika pre BDD s optimálnym poradím premenných hľadaným cez cyklické rotácie.</w:t>
+              <w:t xml:space="preserve">Rovnaká metrika pre BDD s poradím premenných hľadaným cez </w:t>
+            </w:r>
+            <w:proofErr w:type="spellStart"/>
+            <w:r>
+              <w:rPr>
+                <w:rFonts w:ascii="Arial" w:eastAsia="Arial" w:hAnsi="Arial" w:cs="Arial"/>
+                <w:color w:val="1A1A2E"/>
+                <w:sz w:val="20"/>
+                <w:szCs w:val="20"/>
+              </w:rPr>
+              <w:t>frequency</w:t>
+            </w:r>
+            <w:proofErr w:type="spellEnd"/>
+            <w:r>
+              <w:rPr>
+                <w:rFonts w:ascii="Arial" w:eastAsia="Arial" w:hAnsi="Arial" w:cs="Arial"/>
+                <w:color w:val="1A1A2E"/>
+                <w:sz w:val="20"/>
+                <w:szCs w:val="20"/>
+              </w:rPr>
+              <w:t xml:space="preserve"> sort a </w:t>
+            </w:r>
+            <w:proofErr w:type="spellStart"/>
+            <w:r>
+              <w:rPr>
+                <w:rFonts w:ascii="Arial" w:eastAsia="Arial" w:hAnsi="Arial" w:cs="Arial"/>
+                <w:color w:val="1A1A2E"/>
+                <w:sz w:val="20"/>
+                <w:szCs w:val="20"/>
+              </w:rPr>
+              <w:t>sifting</w:t>
+            </w:r>
+            <w:proofErr w:type="spellEnd"/>
+            <w:r>
+              <w:rPr>
+                <w:rFonts w:ascii="Arial" w:eastAsia="Arial" w:hAnsi="Arial" w:cs="Arial"/>
+                <w:color w:val="1A1A2E"/>
+                <w:sz w:val="20"/>
+                <w:szCs w:val="20"/>
+              </w:rPr>
+              <w:t>.</w:t>
             </w:r>
           </w:p>
         </w:tc>
@@ -12922,7 +13044,47 @@
                 <w:sz w:val="20"/>
                 <w:szCs w:val="20"/>
               </w:rPr>
-              <w:t xml:space="preserve"> vrátane hľadania optimálneho poradia cez n rotácií.</w:t>
+              <w:t xml:space="preserve"> vrátane </w:t>
+            </w:r>
+            <w:proofErr w:type="spellStart"/>
+            <w:r>
+              <w:rPr>
+                <w:rFonts w:ascii="Arial" w:eastAsia="Arial" w:hAnsi="Arial" w:cs="Arial"/>
+                <w:color w:val="1A1A2E"/>
+                <w:sz w:val="20"/>
+                <w:szCs w:val="20"/>
+              </w:rPr>
+              <w:t>frequency</w:t>
+            </w:r>
+            <w:proofErr w:type="spellEnd"/>
+            <w:r>
+              <w:rPr>
+                <w:rFonts w:ascii="Arial" w:eastAsia="Arial" w:hAnsi="Arial" w:cs="Arial"/>
+                <w:color w:val="1A1A2E"/>
+                <w:sz w:val="20"/>
+                <w:szCs w:val="20"/>
+              </w:rPr>
+              <w:t xml:space="preserve"> sortu a </w:t>
+            </w:r>
+            <w:proofErr w:type="spellStart"/>
+            <w:r>
+              <w:rPr>
+                <w:rFonts w:ascii="Arial" w:eastAsia="Arial" w:hAnsi="Arial" w:cs="Arial"/>
+                <w:color w:val="1A1A2E"/>
+                <w:sz w:val="20"/>
+                <w:szCs w:val="20"/>
+              </w:rPr>
+              <w:t>siftingu</w:t>
+            </w:r>
+            <w:proofErr w:type="spellEnd"/>
+            <w:r>
+              <w:rPr>
+                <w:rFonts w:ascii="Arial" w:eastAsia="Arial" w:hAnsi="Arial" w:cs="Arial"/>
+                <w:color w:val="1A1A2E"/>
+                <w:sz w:val="20"/>
+                <w:szCs w:val="20"/>
+              </w:rPr>
+              <w:t>.</w:t>
             </w:r>
           </w:p>
         </w:tc>
@@ -13729,6 +13891,7 @@
           <w:sz w:val="20"/>
           <w:szCs w:val="20"/>
         </w:rPr>
+        <w:lastRenderedPageBreak/>
         <w:t xml:space="preserve">      </w:t>
       </w:r>
       <w:proofErr w:type="spellStart"/>
@@ -13997,7 +14160,6 @@
           <w:sz w:val="22"/>
           <w:szCs w:val="22"/>
         </w:rPr>
-        <w:lastRenderedPageBreak/>
         <w:t xml:space="preserve">Použitie </w:t>
       </w:r>
       <w:r>

</xml_diff>